<commit_message>
Add defense Q&A drill notes for Homework A, Homework B, and project tasks; include detailed question-answer traps and explanations for key concepts.
</commit_message>
<xml_diff>
--- a/Homework A/Homework_A_answers.docx
+++ b/Homework A/Homework_A_answers.docx
@@ -601,7 +601,7 @@
                               <w:alias w:val="Datum"/>
                               <w:tag w:val="Datum"/>
                               <w:id w:val="5634306"/>
-                              <w:date w:fullDate="2026-04-11T00:00:00Z">
+                              <w:date w:fullDate="2026-05-27T00:00:00Z">
                                 <w:dateFormat w:val="MMMM yyyy"/>
                                 <w:lid w:val="nl-BE"/>
                                 <w:storeMappedDataAs w:val="dateTime"/>
@@ -613,13 +613,11 @@
                                 <w:pPr>
                                   <w:pStyle w:val="CoverSubtekst"/>
                                 </w:pPr>
-                                <w:proofErr w:type="spellStart"/>
                                 <w:r>
-                                  <w:t>april</w:t>
-                                </w:r>
-                                <w:proofErr w:type="spellEnd"/>
-                                <w:r>
-                                  <w:t xml:space="preserve"> 2026</w:t>
+                                  <w:rPr>
+                                    <w:lang w:val="nl-BE"/>
+                                  </w:rPr>
+                                  <w:t>mei 2026</w:t>
                                 </w:r>
                               </w:p>
                             </w:sdtContent>
@@ -654,7 +652,7 @@
                         <w:alias w:val="Datum"/>
                         <w:tag w:val="Datum"/>
                         <w:id w:val="5634306"/>
-                        <w:date w:fullDate="2026-04-11T00:00:00Z">
+                        <w:date w:fullDate="2026-05-27T00:00:00Z">
                           <w:dateFormat w:val="MMMM yyyy"/>
                           <w:lid w:val="nl-BE"/>
                           <w:storeMappedDataAs w:val="dateTime"/>
@@ -666,13 +664,11 @@
                           <w:pPr>
                             <w:pStyle w:val="CoverSubtekst"/>
                           </w:pPr>
-                          <w:proofErr w:type="spellStart"/>
                           <w:r>
-                            <w:t>april</w:t>
-                          </w:r>
-                          <w:proofErr w:type="spellEnd"/>
-                          <w:r>
-                            <w:t xml:space="preserve"> 2026</w:t>
+                            <w:rPr>
+                              <w:lang w:val="nl-BE"/>
+                            </w:rPr>
+                            <w:t>mei 2026</w:t>
                           </w:r>
                         </w:p>
                       </w:sdtContent>
@@ -941,7 +937,7 @@
         <w:pStyle w:val="afd"/>
         <w:numPr>
           <w:ilvl w:val="0"/>
-          <w:numId w:val="55"/>
+          <w:numId w:val="11"/>
         </w:numPr>
         <w:spacing w:after="0"/>
         <w:jc w:val="left"/>
@@ -961,7 +957,7 @@
         <w:pStyle w:val="afd"/>
         <w:numPr>
           <w:ilvl w:val="0"/>
-          <w:numId w:val="55"/>
+          <w:numId w:val="11"/>
         </w:numPr>
         <w:spacing w:after="0"/>
         <w:jc w:val="left"/>
@@ -981,7 +977,7 @@
         <w:pStyle w:val="afd"/>
         <w:numPr>
           <w:ilvl w:val="0"/>
-          <w:numId w:val="55"/>
+          <w:numId w:val="11"/>
         </w:numPr>
         <w:spacing w:after="0"/>
         <w:jc w:val="left"/>
@@ -2103,7 +2099,7 @@
       <w:pPr>
         <w:numPr>
           <w:ilvl w:val="0"/>
-          <w:numId w:val="53"/>
+          <w:numId w:val="9"/>
         </w:numPr>
       </w:pPr>
       <w:r>
@@ -2125,7 +2121,7 @@
       <w:pPr>
         <w:numPr>
           <w:ilvl w:val="0"/>
-          <w:numId w:val="53"/>
+          <w:numId w:val="9"/>
         </w:numPr>
       </w:pPr>
       <w:r>
@@ -2147,7 +2143,7 @@
       <w:pPr>
         <w:numPr>
           <w:ilvl w:val="0"/>
-          <w:numId w:val="53"/>
+          <w:numId w:val="9"/>
         </w:numPr>
       </w:pPr>
       <w:r>
@@ -2169,7 +2165,7 @@
       <w:pPr>
         <w:numPr>
           <w:ilvl w:val="0"/>
-          <w:numId w:val="53"/>
+          <w:numId w:val="9"/>
         </w:numPr>
       </w:pPr>
       <w:r>
@@ -4809,7 +4805,7 @@
         <w:pStyle w:val="afd"/>
         <w:numPr>
           <w:ilvl w:val="0"/>
-          <w:numId w:val="54"/>
+          <w:numId w:val="10"/>
         </w:numPr>
       </w:pPr>
       <w:r>
@@ -4824,7 +4820,7 @@
         <w:pStyle w:val="afd"/>
         <w:numPr>
           <w:ilvl w:val="0"/>
-          <w:numId w:val="54"/>
+          <w:numId w:val="10"/>
         </w:numPr>
       </w:pPr>
       <w:r>
@@ -4842,7 +4838,7 @@
         <w:pStyle w:val="afd"/>
         <w:numPr>
           <w:ilvl w:val="0"/>
-          <w:numId w:val="54"/>
+          <w:numId w:val="10"/>
         </w:numPr>
       </w:pPr>
       <w:r>
@@ -4854,7 +4850,7 @@
         <w:pStyle w:val="afd"/>
         <w:numPr>
           <w:ilvl w:val="0"/>
-          <w:numId w:val="54"/>
+          <w:numId w:val="10"/>
         </w:numPr>
       </w:pPr>
       <w:r>
@@ -4866,7 +4862,7 @@
         <w:pStyle w:val="afd"/>
         <w:numPr>
           <w:ilvl w:val="0"/>
-          <w:numId w:val="54"/>
+          <w:numId w:val="10"/>
         </w:numPr>
       </w:pPr>
       <w:proofErr w:type="gramStart"/>
@@ -6592,869 +6588,6 @@
     </w:lvl>
   </w:abstractNum>
   <w:abstractNum w:abstractNumId="3" w15:restartNumberingAfterBreak="0">
-    <w:nsid w:val="018F75D2"/>
-    <w:multiLevelType w:val="hybridMultilevel"/>
-    <w:tmpl w:val="A042A4D8"/>
-    <w:lvl w:ilvl="0" w:tplc="0409000F">
-      <w:start w:val="1"/>
-      <w:numFmt w:val="decimal"/>
-      <w:lvlText w:val="%1."/>
-      <w:lvlJc w:val="left"/>
-      <w:pPr>
-        <w:ind w:left="720" w:hanging="360"/>
-      </w:pPr>
-    </w:lvl>
-    <w:lvl w:ilvl="1" w:tplc="04090019" w:tentative="1">
-      <w:start w:val="1"/>
-      <w:numFmt w:val="lowerLetter"/>
-      <w:lvlText w:val="%2."/>
-      <w:lvlJc w:val="left"/>
-      <w:pPr>
-        <w:ind w:left="1440" w:hanging="360"/>
-      </w:pPr>
-    </w:lvl>
-    <w:lvl w:ilvl="2" w:tplc="0409001B" w:tentative="1">
-      <w:start w:val="1"/>
-      <w:numFmt w:val="lowerRoman"/>
-      <w:lvlText w:val="%3."/>
-      <w:lvlJc w:val="right"/>
-      <w:pPr>
-        <w:ind w:left="2160" w:hanging="180"/>
-      </w:pPr>
-    </w:lvl>
-    <w:lvl w:ilvl="3" w:tplc="0409000F" w:tentative="1">
-      <w:start w:val="1"/>
-      <w:numFmt w:val="decimal"/>
-      <w:lvlText w:val="%4."/>
-      <w:lvlJc w:val="left"/>
-      <w:pPr>
-        <w:ind w:left="2880" w:hanging="360"/>
-      </w:pPr>
-    </w:lvl>
-    <w:lvl w:ilvl="4" w:tplc="04090019" w:tentative="1">
-      <w:start w:val="1"/>
-      <w:numFmt w:val="lowerLetter"/>
-      <w:lvlText w:val="%5."/>
-      <w:lvlJc w:val="left"/>
-      <w:pPr>
-        <w:ind w:left="3600" w:hanging="360"/>
-      </w:pPr>
-    </w:lvl>
-    <w:lvl w:ilvl="5" w:tplc="0409001B" w:tentative="1">
-      <w:start w:val="1"/>
-      <w:numFmt w:val="lowerRoman"/>
-      <w:lvlText w:val="%6."/>
-      <w:lvlJc w:val="right"/>
-      <w:pPr>
-        <w:ind w:left="4320" w:hanging="180"/>
-      </w:pPr>
-    </w:lvl>
-    <w:lvl w:ilvl="6" w:tplc="0409000F" w:tentative="1">
-      <w:start w:val="1"/>
-      <w:numFmt w:val="decimal"/>
-      <w:lvlText w:val="%7."/>
-      <w:lvlJc w:val="left"/>
-      <w:pPr>
-        <w:ind w:left="5040" w:hanging="360"/>
-      </w:pPr>
-    </w:lvl>
-    <w:lvl w:ilvl="7" w:tplc="04090019" w:tentative="1">
-      <w:start w:val="1"/>
-      <w:numFmt w:val="lowerLetter"/>
-      <w:lvlText w:val="%8."/>
-      <w:lvlJc w:val="left"/>
-      <w:pPr>
-        <w:ind w:left="5760" w:hanging="360"/>
-      </w:pPr>
-    </w:lvl>
-    <w:lvl w:ilvl="8" w:tplc="0409001B" w:tentative="1">
-      <w:start w:val="1"/>
-      <w:numFmt w:val="lowerRoman"/>
-      <w:lvlText w:val="%9."/>
-      <w:lvlJc w:val="right"/>
-      <w:pPr>
-        <w:ind w:left="6480" w:hanging="180"/>
-      </w:pPr>
-    </w:lvl>
-  </w:abstractNum>
-  <w:abstractNum w:abstractNumId="4" w15:restartNumberingAfterBreak="0">
-    <w:nsid w:val="07FD1F3C"/>
-    <w:multiLevelType w:val="hybridMultilevel"/>
-    <w:tmpl w:val="EFF8993E"/>
-    <w:lvl w:ilvl="0" w:tplc="AE2A1A42">
-      <w:numFmt w:val="bullet"/>
-      <w:lvlText w:val=""/>
-      <w:lvlJc w:val="left"/>
-      <w:pPr>
-        <w:ind w:left="360" w:hanging="360"/>
-      </w:pPr>
-      <w:rPr>
-        <w:rFonts w:ascii="Wingdings" w:eastAsiaTheme="minorEastAsia" w:hAnsi="Wingdings" w:cstheme="minorBidi" w:hint="default"/>
-      </w:rPr>
-    </w:lvl>
-    <w:lvl w:ilvl="1" w:tplc="04090003" w:tentative="1">
-      <w:start w:val="1"/>
-      <w:numFmt w:val="bullet"/>
-      <w:lvlText w:val=""/>
-      <w:lvlJc w:val="left"/>
-      <w:pPr>
-        <w:ind w:left="880" w:hanging="440"/>
-      </w:pPr>
-      <w:rPr>
-        <w:rFonts w:ascii="Wingdings" w:hAnsi="Wingdings" w:hint="default"/>
-      </w:rPr>
-    </w:lvl>
-    <w:lvl w:ilvl="2" w:tplc="04090005" w:tentative="1">
-      <w:start w:val="1"/>
-      <w:numFmt w:val="bullet"/>
-      <w:lvlText w:val=""/>
-      <w:lvlJc w:val="left"/>
-      <w:pPr>
-        <w:ind w:left="1320" w:hanging="440"/>
-      </w:pPr>
-      <w:rPr>
-        <w:rFonts w:ascii="Wingdings" w:hAnsi="Wingdings" w:hint="default"/>
-      </w:rPr>
-    </w:lvl>
-    <w:lvl w:ilvl="3" w:tplc="04090001" w:tentative="1">
-      <w:start w:val="1"/>
-      <w:numFmt w:val="bullet"/>
-      <w:lvlText w:val=""/>
-      <w:lvlJc w:val="left"/>
-      <w:pPr>
-        <w:ind w:left="1760" w:hanging="440"/>
-      </w:pPr>
-      <w:rPr>
-        <w:rFonts w:ascii="Wingdings" w:hAnsi="Wingdings" w:hint="default"/>
-      </w:rPr>
-    </w:lvl>
-    <w:lvl w:ilvl="4" w:tplc="04090003" w:tentative="1">
-      <w:start w:val="1"/>
-      <w:numFmt w:val="bullet"/>
-      <w:lvlText w:val=""/>
-      <w:lvlJc w:val="left"/>
-      <w:pPr>
-        <w:ind w:left="2200" w:hanging="440"/>
-      </w:pPr>
-      <w:rPr>
-        <w:rFonts w:ascii="Wingdings" w:hAnsi="Wingdings" w:hint="default"/>
-      </w:rPr>
-    </w:lvl>
-    <w:lvl w:ilvl="5" w:tplc="04090005" w:tentative="1">
-      <w:start w:val="1"/>
-      <w:numFmt w:val="bullet"/>
-      <w:lvlText w:val=""/>
-      <w:lvlJc w:val="left"/>
-      <w:pPr>
-        <w:ind w:left="2640" w:hanging="440"/>
-      </w:pPr>
-      <w:rPr>
-        <w:rFonts w:ascii="Wingdings" w:hAnsi="Wingdings" w:hint="default"/>
-      </w:rPr>
-    </w:lvl>
-    <w:lvl w:ilvl="6" w:tplc="04090001" w:tentative="1">
-      <w:start w:val="1"/>
-      <w:numFmt w:val="bullet"/>
-      <w:lvlText w:val=""/>
-      <w:lvlJc w:val="left"/>
-      <w:pPr>
-        <w:ind w:left="3080" w:hanging="440"/>
-      </w:pPr>
-      <w:rPr>
-        <w:rFonts w:ascii="Wingdings" w:hAnsi="Wingdings" w:hint="default"/>
-      </w:rPr>
-    </w:lvl>
-    <w:lvl w:ilvl="7" w:tplc="04090003" w:tentative="1">
-      <w:start w:val="1"/>
-      <w:numFmt w:val="bullet"/>
-      <w:lvlText w:val=""/>
-      <w:lvlJc w:val="left"/>
-      <w:pPr>
-        <w:ind w:left="3520" w:hanging="440"/>
-      </w:pPr>
-      <w:rPr>
-        <w:rFonts w:ascii="Wingdings" w:hAnsi="Wingdings" w:hint="default"/>
-      </w:rPr>
-    </w:lvl>
-    <w:lvl w:ilvl="8" w:tplc="04090005" w:tentative="1">
-      <w:start w:val="1"/>
-      <w:numFmt w:val="bullet"/>
-      <w:lvlText w:val=""/>
-      <w:lvlJc w:val="left"/>
-      <w:pPr>
-        <w:ind w:left="3960" w:hanging="440"/>
-      </w:pPr>
-      <w:rPr>
-        <w:rFonts w:ascii="Wingdings" w:hAnsi="Wingdings" w:hint="default"/>
-      </w:rPr>
-    </w:lvl>
-  </w:abstractNum>
-  <w:abstractNum w:abstractNumId="5" w15:restartNumberingAfterBreak="0">
-    <w:nsid w:val="0B2F3EAC"/>
-    <w:multiLevelType w:val="multilevel"/>
-    <w:tmpl w:val="FEAEDE82"/>
-    <w:lvl w:ilvl="0">
-      <w:start w:val="1"/>
-      <w:numFmt w:val="bullet"/>
-      <w:lvlText w:val=""/>
-      <w:lvlJc w:val="left"/>
-      <w:pPr>
-        <w:tabs>
-          <w:tab w:val="num" w:pos="720"/>
-        </w:tabs>
-        <w:ind w:left="720" w:hanging="360"/>
-      </w:pPr>
-      <w:rPr>
-        <w:rFonts w:ascii="Symbol" w:hAnsi="Symbol" w:hint="default"/>
-        <w:sz w:val="20"/>
-      </w:rPr>
-    </w:lvl>
-    <w:lvl w:ilvl="1" w:tentative="1">
-      <w:start w:val="1"/>
-      <w:numFmt w:val="bullet"/>
-      <w:lvlText w:val=""/>
-      <w:lvlJc w:val="left"/>
-      <w:pPr>
-        <w:tabs>
-          <w:tab w:val="num" w:pos="1440"/>
-        </w:tabs>
-        <w:ind w:left="1440" w:hanging="360"/>
-      </w:pPr>
-      <w:rPr>
-        <w:rFonts w:ascii="Symbol" w:hAnsi="Symbol" w:hint="default"/>
-        <w:sz w:val="20"/>
-      </w:rPr>
-    </w:lvl>
-    <w:lvl w:ilvl="2" w:tentative="1">
-      <w:start w:val="1"/>
-      <w:numFmt w:val="bullet"/>
-      <w:lvlText w:val=""/>
-      <w:lvlJc w:val="left"/>
-      <w:pPr>
-        <w:tabs>
-          <w:tab w:val="num" w:pos="2160"/>
-        </w:tabs>
-        <w:ind w:left="2160" w:hanging="360"/>
-      </w:pPr>
-      <w:rPr>
-        <w:rFonts w:ascii="Symbol" w:hAnsi="Symbol" w:hint="default"/>
-        <w:sz w:val="20"/>
-      </w:rPr>
-    </w:lvl>
-    <w:lvl w:ilvl="3" w:tentative="1">
-      <w:start w:val="1"/>
-      <w:numFmt w:val="bullet"/>
-      <w:lvlText w:val=""/>
-      <w:lvlJc w:val="left"/>
-      <w:pPr>
-        <w:tabs>
-          <w:tab w:val="num" w:pos="2880"/>
-        </w:tabs>
-        <w:ind w:left="2880" w:hanging="360"/>
-      </w:pPr>
-      <w:rPr>
-        <w:rFonts w:ascii="Symbol" w:hAnsi="Symbol" w:hint="default"/>
-        <w:sz w:val="20"/>
-      </w:rPr>
-    </w:lvl>
-    <w:lvl w:ilvl="4" w:tentative="1">
-      <w:start w:val="1"/>
-      <w:numFmt w:val="bullet"/>
-      <w:lvlText w:val=""/>
-      <w:lvlJc w:val="left"/>
-      <w:pPr>
-        <w:tabs>
-          <w:tab w:val="num" w:pos="3600"/>
-        </w:tabs>
-        <w:ind w:left="3600" w:hanging="360"/>
-      </w:pPr>
-      <w:rPr>
-        <w:rFonts w:ascii="Symbol" w:hAnsi="Symbol" w:hint="default"/>
-        <w:sz w:val="20"/>
-      </w:rPr>
-    </w:lvl>
-    <w:lvl w:ilvl="5" w:tentative="1">
-      <w:start w:val="1"/>
-      <w:numFmt w:val="bullet"/>
-      <w:lvlText w:val=""/>
-      <w:lvlJc w:val="left"/>
-      <w:pPr>
-        <w:tabs>
-          <w:tab w:val="num" w:pos="4320"/>
-        </w:tabs>
-        <w:ind w:left="4320" w:hanging="360"/>
-      </w:pPr>
-      <w:rPr>
-        <w:rFonts w:ascii="Symbol" w:hAnsi="Symbol" w:hint="default"/>
-        <w:sz w:val="20"/>
-      </w:rPr>
-    </w:lvl>
-    <w:lvl w:ilvl="6" w:tentative="1">
-      <w:start w:val="1"/>
-      <w:numFmt w:val="bullet"/>
-      <w:lvlText w:val=""/>
-      <w:lvlJc w:val="left"/>
-      <w:pPr>
-        <w:tabs>
-          <w:tab w:val="num" w:pos="5040"/>
-        </w:tabs>
-        <w:ind w:left="5040" w:hanging="360"/>
-      </w:pPr>
-      <w:rPr>
-        <w:rFonts w:ascii="Symbol" w:hAnsi="Symbol" w:hint="default"/>
-        <w:sz w:val="20"/>
-      </w:rPr>
-    </w:lvl>
-    <w:lvl w:ilvl="7" w:tentative="1">
-      <w:start w:val="1"/>
-      <w:numFmt w:val="bullet"/>
-      <w:lvlText w:val=""/>
-      <w:lvlJc w:val="left"/>
-      <w:pPr>
-        <w:tabs>
-          <w:tab w:val="num" w:pos="5760"/>
-        </w:tabs>
-        <w:ind w:left="5760" w:hanging="360"/>
-      </w:pPr>
-      <w:rPr>
-        <w:rFonts w:ascii="Symbol" w:hAnsi="Symbol" w:hint="default"/>
-        <w:sz w:val="20"/>
-      </w:rPr>
-    </w:lvl>
-    <w:lvl w:ilvl="8" w:tentative="1">
-      <w:start w:val="1"/>
-      <w:numFmt w:val="bullet"/>
-      <w:lvlText w:val=""/>
-      <w:lvlJc w:val="left"/>
-      <w:pPr>
-        <w:tabs>
-          <w:tab w:val="num" w:pos="6480"/>
-        </w:tabs>
-        <w:ind w:left="6480" w:hanging="360"/>
-      </w:pPr>
-      <w:rPr>
-        <w:rFonts w:ascii="Symbol" w:hAnsi="Symbol" w:hint="default"/>
-        <w:sz w:val="20"/>
-      </w:rPr>
-    </w:lvl>
-  </w:abstractNum>
-  <w:abstractNum w:abstractNumId="6" w15:restartNumberingAfterBreak="0">
-    <w:nsid w:val="14CA4C4C"/>
-    <w:multiLevelType w:val="hybridMultilevel"/>
-    <w:tmpl w:val="76CC0E5E"/>
-    <w:lvl w:ilvl="0" w:tplc="04090001">
-      <w:start w:val="1"/>
-      <w:numFmt w:val="bullet"/>
-      <w:lvlText w:val=""/>
-      <w:lvlJc w:val="left"/>
-      <w:pPr>
-        <w:ind w:left="800" w:hanging="440"/>
-      </w:pPr>
-      <w:rPr>
-        <w:rFonts w:ascii="Wingdings" w:hAnsi="Wingdings" w:hint="default"/>
-      </w:rPr>
-    </w:lvl>
-    <w:lvl w:ilvl="1" w:tplc="04090003" w:tentative="1">
-      <w:start w:val="1"/>
-      <w:numFmt w:val="bullet"/>
-      <w:lvlText w:val=""/>
-      <w:lvlJc w:val="left"/>
-      <w:pPr>
-        <w:ind w:left="1240" w:hanging="440"/>
-      </w:pPr>
-      <w:rPr>
-        <w:rFonts w:ascii="Wingdings" w:hAnsi="Wingdings" w:hint="default"/>
-      </w:rPr>
-    </w:lvl>
-    <w:lvl w:ilvl="2" w:tplc="04090005" w:tentative="1">
-      <w:start w:val="1"/>
-      <w:numFmt w:val="bullet"/>
-      <w:lvlText w:val=""/>
-      <w:lvlJc w:val="left"/>
-      <w:pPr>
-        <w:ind w:left="1680" w:hanging="440"/>
-      </w:pPr>
-      <w:rPr>
-        <w:rFonts w:ascii="Wingdings" w:hAnsi="Wingdings" w:hint="default"/>
-      </w:rPr>
-    </w:lvl>
-    <w:lvl w:ilvl="3" w:tplc="04090001" w:tentative="1">
-      <w:start w:val="1"/>
-      <w:numFmt w:val="bullet"/>
-      <w:lvlText w:val=""/>
-      <w:lvlJc w:val="left"/>
-      <w:pPr>
-        <w:ind w:left="2120" w:hanging="440"/>
-      </w:pPr>
-      <w:rPr>
-        <w:rFonts w:ascii="Wingdings" w:hAnsi="Wingdings" w:hint="default"/>
-      </w:rPr>
-    </w:lvl>
-    <w:lvl w:ilvl="4" w:tplc="04090003" w:tentative="1">
-      <w:start w:val="1"/>
-      <w:numFmt w:val="bullet"/>
-      <w:lvlText w:val=""/>
-      <w:lvlJc w:val="left"/>
-      <w:pPr>
-        <w:ind w:left="2560" w:hanging="440"/>
-      </w:pPr>
-      <w:rPr>
-        <w:rFonts w:ascii="Wingdings" w:hAnsi="Wingdings" w:hint="default"/>
-      </w:rPr>
-    </w:lvl>
-    <w:lvl w:ilvl="5" w:tplc="04090005" w:tentative="1">
-      <w:start w:val="1"/>
-      <w:numFmt w:val="bullet"/>
-      <w:lvlText w:val=""/>
-      <w:lvlJc w:val="left"/>
-      <w:pPr>
-        <w:ind w:left="3000" w:hanging="440"/>
-      </w:pPr>
-      <w:rPr>
-        <w:rFonts w:ascii="Wingdings" w:hAnsi="Wingdings" w:hint="default"/>
-      </w:rPr>
-    </w:lvl>
-    <w:lvl w:ilvl="6" w:tplc="04090001" w:tentative="1">
-      <w:start w:val="1"/>
-      <w:numFmt w:val="bullet"/>
-      <w:lvlText w:val=""/>
-      <w:lvlJc w:val="left"/>
-      <w:pPr>
-        <w:ind w:left="3440" w:hanging="440"/>
-      </w:pPr>
-      <w:rPr>
-        <w:rFonts w:ascii="Wingdings" w:hAnsi="Wingdings" w:hint="default"/>
-      </w:rPr>
-    </w:lvl>
-    <w:lvl w:ilvl="7" w:tplc="04090003" w:tentative="1">
-      <w:start w:val="1"/>
-      <w:numFmt w:val="bullet"/>
-      <w:lvlText w:val=""/>
-      <w:lvlJc w:val="left"/>
-      <w:pPr>
-        <w:ind w:left="3880" w:hanging="440"/>
-      </w:pPr>
-      <w:rPr>
-        <w:rFonts w:ascii="Wingdings" w:hAnsi="Wingdings" w:hint="default"/>
-      </w:rPr>
-    </w:lvl>
-    <w:lvl w:ilvl="8" w:tplc="04090005" w:tentative="1">
-      <w:start w:val="1"/>
-      <w:numFmt w:val="bullet"/>
-      <w:lvlText w:val=""/>
-      <w:lvlJc w:val="left"/>
-      <w:pPr>
-        <w:ind w:left="4320" w:hanging="440"/>
-      </w:pPr>
-      <w:rPr>
-        <w:rFonts w:ascii="Wingdings" w:hAnsi="Wingdings" w:hint="default"/>
-      </w:rPr>
-    </w:lvl>
-  </w:abstractNum>
-  <w:abstractNum w:abstractNumId="7" w15:restartNumberingAfterBreak="0">
-    <w:nsid w:val="1A0E5184"/>
-    <w:multiLevelType w:val="hybridMultilevel"/>
-    <w:tmpl w:val="A4340EE2"/>
-    <w:lvl w:ilvl="0" w:tplc="0409000F">
-      <w:start w:val="1"/>
-      <w:numFmt w:val="decimal"/>
-      <w:lvlText w:val="%1."/>
-      <w:lvlJc w:val="left"/>
-      <w:pPr>
-        <w:ind w:left="720" w:hanging="360"/>
-      </w:pPr>
-      <w:rPr>
-        <w:rFonts w:hint="default"/>
-      </w:rPr>
-    </w:lvl>
-    <w:lvl w:ilvl="1" w:tplc="04090019" w:tentative="1">
-      <w:start w:val="1"/>
-      <w:numFmt w:val="lowerLetter"/>
-      <w:lvlText w:val="%2."/>
-      <w:lvlJc w:val="left"/>
-      <w:pPr>
-        <w:ind w:left="1440" w:hanging="360"/>
-      </w:pPr>
-    </w:lvl>
-    <w:lvl w:ilvl="2" w:tplc="0409001B" w:tentative="1">
-      <w:start w:val="1"/>
-      <w:numFmt w:val="lowerRoman"/>
-      <w:lvlText w:val="%3."/>
-      <w:lvlJc w:val="right"/>
-      <w:pPr>
-        <w:ind w:left="2160" w:hanging="180"/>
-      </w:pPr>
-    </w:lvl>
-    <w:lvl w:ilvl="3" w:tplc="0409000F" w:tentative="1">
-      <w:start w:val="1"/>
-      <w:numFmt w:val="decimal"/>
-      <w:lvlText w:val="%4."/>
-      <w:lvlJc w:val="left"/>
-      <w:pPr>
-        <w:ind w:left="2880" w:hanging="360"/>
-      </w:pPr>
-    </w:lvl>
-    <w:lvl w:ilvl="4" w:tplc="04090019" w:tentative="1">
-      <w:start w:val="1"/>
-      <w:numFmt w:val="lowerLetter"/>
-      <w:lvlText w:val="%5."/>
-      <w:lvlJc w:val="left"/>
-      <w:pPr>
-        <w:ind w:left="3600" w:hanging="360"/>
-      </w:pPr>
-    </w:lvl>
-    <w:lvl w:ilvl="5" w:tplc="0409001B" w:tentative="1">
-      <w:start w:val="1"/>
-      <w:numFmt w:val="lowerRoman"/>
-      <w:lvlText w:val="%6."/>
-      <w:lvlJc w:val="right"/>
-      <w:pPr>
-        <w:ind w:left="4320" w:hanging="180"/>
-      </w:pPr>
-    </w:lvl>
-    <w:lvl w:ilvl="6" w:tplc="0409000F" w:tentative="1">
-      <w:start w:val="1"/>
-      <w:numFmt w:val="decimal"/>
-      <w:lvlText w:val="%7."/>
-      <w:lvlJc w:val="left"/>
-      <w:pPr>
-        <w:ind w:left="5040" w:hanging="360"/>
-      </w:pPr>
-    </w:lvl>
-    <w:lvl w:ilvl="7" w:tplc="04090019" w:tentative="1">
-      <w:start w:val="1"/>
-      <w:numFmt w:val="lowerLetter"/>
-      <w:lvlText w:val="%8."/>
-      <w:lvlJc w:val="left"/>
-      <w:pPr>
-        <w:ind w:left="5760" w:hanging="360"/>
-      </w:pPr>
-    </w:lvl>
-    <w:lvl w:ilvl="8" w:tplc="0409001B" w:tentative="1">
-      <w:start w:val="1"/>
-      <w:numFmt w:val="lowerRoman"/>
-      <w:lvlText w:val="%9."/>
-      <w:lvlJc w:val="right"/>
-      <w:pPr>
-        <w:ind w:left="6480" w:hanging="180"/>
-      </w:pPr>
-    </w:lvl>
-  </w:abstractNum>
-  <w:abstractNum w:abstractNumId="8" w15:restartNumberingAfterBreak="0">
-    <w:nsid w:val="1BFD7EAB"/>
-    <w:multiLevelType w:val="hybridMultilevel"/>
-    <w:tmpl w:val="E6F254EC"/>
-    <w:lvl w:ilvl="0" w:tplc="12CA1C74">
-      <w:numFmt w:val="bullet"/>
-      <w:lvlText w:val=""/>
-      <w:lvlJc w:val="left"/>
-      <w:pPr>
-        <w:ind w:left="360" w:hanging="360"/>
-      </w:pPr>
-      <w:rPr>
-        <w:rFonts w:ascii="Wingdings" w:eastAsiaTheme="minorEastAsia" w:hAnsi="Wingdings" w:cstheme="minorBidi" w:hint="default"/>
-      </w:rPr>
-    </w:lvl>
-    <w:lvl w:ilvl="1" w:tplc="04090003" w:tentative="1">
-      <w:start w:val="1"/>
-      <w:numFmt w:val="bullet"/>
-      <w:lvlText w:val=""/>
-      <w:lvlJc w:val="left"/>
-      <w:pPr>
-        <w:ind w:left="880" w:hanging="440"/>
-      </w:pPr>
-      <w:rPr>
-        <w:rFonts w:ascii="Wingdings" w:hAnsi="Wingdings" w:hint="default"/>
-      </w:rPr>
-    </w:lvl>
-    <w:lvl w:ilvl="2" w:tplc="04090005" w:tentative="1">
-      <w:start w:val="1"/>
-      <w:numFmt w:val="bullet"/>
-      <w:lvlText w:val=""/>
-      <w:lvlJc w:val="left"/>
-      <w:pPr>
-        <w:ind w:left="1320" w:hanging="440"/>
-      </w:pPr>
-      <w:rPr>
-        <w:rFonts w:ascii="Wingdings" w:hAnsi="Wingdings" w:hint="default"/>
-      </w:rPr>
-    </w:lvl>
-    <w:lvl w:ilvl="3" w:tplc="04090001" w:tentative="1">
-      <w:start w:val="1"/>
-      <w:numFmt w:val="bullet"/>
-      <w:lvlText w:val=""/>
-      <w:lvlJc w:val="left"/>
-      <w:pPr>
-        <w:ind w:left="1760" w:hanging="440"/>
-      </w:pPr>
-      <w:rPr>
-        <w:rFonts w:ascii="Wingdings" w:hAnsi="Wingdings" w:hint="default"/>
-      </w:rPr>
-    </w:lvl>
-    <w:lvl w:ilvl="4" w:tplc="04090003" w:tentative="1">
-      <w:start w:val="1"/>
-      <w:numFmt w:val="bullet"/>
-      <w:lvlText w:val=""/>
-      <w:lvlJc w:val="left"/>
-      <w:pPr>
-        <w:ind w:left="2200" w:hanging="440"/>
-      </w:pPr>
-      <w:rPr>
-        <w:rFonts w:ascii="Wingdings" w:hAnsi="Wingdings" w:hint="default"/>
-      </w:rPr>
-    </w:lvl>
-    <w:lvl w:ilvl="5" w:tplc="04090005" w:tentative="1">
-      <w:start w:val="1"/>
-      <w:numFmt w:val="bullet"/>
-      <w:lvlText w:val=""/>
-      <w:lvlJc w:val="left"/>
-      <w:pPr>
-        <w:ind w:left="2640" w:hanging="440"/>
-      </w:pPr>
-      <w:rPr>
-        <w:rFonts w:ascii="Wingdings" w:hAnsi="Wingdings" w:hint="default"/>
-      </w:rPr>
-    </w:lvl>
-    <w:lvl w:ilvl="6" w:tplc="04090001" w:tentative="1">
-      <w:start w:val="1"/>
-      <w:numFmt w:val="bullet"/>
-      <w:lvlText w:val=""/>
-      <w:lvlJc w:val="left"/>
-      <w:pPr>
-        <w:ind w:left="3080" w:hanging="440"/>
-      </w:pPr>
-      <w:rPr>
-        <w:rFonts w:ascii="Wingdings" w:hAnsi="Wingdings" w:hint="default"/>
-      </w:rPr>
-    </w:lvl>
-    <w:lvl w:ilvl="7" w:tplc="04090003" w:tentative="1">
-      <w:start w:val="1"/>
-      <w:numFmt w:val="bullet"/>
-      <w:lvlText w:val=""/>
-      <w:lvlJc w:val="left"/>
-      <w:pPr>
-        <w:ind w:left="3520" w:hanging="440"/>
-      </w:pPr>
-      <w:rPr>
-        <w:rFonts w:ascii="Wingdings" w:hAnsi="Wingdings" w:hint="default"/>
-      </w:rPr>
-    </w:lvl>
-    <w:lvl w:ilvl="8" w:tplc="04090005" w:tentative="1">
-      <w:start w:val="1"/>
-      <w:numFmt w:val="bullet"/>
-      <w:lvlText w:val=""/>
-      <w:lvlJc w:val="left"/>
-      <w:pPr>
-        <w:ind w:left="3960" w:hanging="440"/>
-      </w:pPr>
-      <w:rPr>
-        <w:rFonts w:ascii="Wingdings" w:hAnsi="Wingdings" w:hint="default"/>
-      </w:rPr>
-    </w:lvl>
-  </w:abstractNum>
-  <w:abstractNum w:abstractNumId="9" w15:restartNumberingAfterBreak="0">
-    <w:nsid w:val="1C8F5B7E"/>
-    <w:multiLevelType w:val="multilevel"/>
-    <w:tmpl w:val="73BC6956"/>
-    <w:lvl w:ilvl="0">
-      <w:start w:val="1"/>
-      <w:numFmt w:val="decimal"/>
-      <w:lvlText w:val="%1."/>
-      <w:lvlJc w:val="left"/>
-      <w:pPr>
-        <w:tabs>
-          <w:tab w:val="num" w:pos="720"/>
-        </w:tabs>
-        <w:ind w:left="720" w:hanging="360"/>
-      </w:pPr>
-    </w:lvl>
-    <w:lvl w:ilvl="1" w:tentative="1">
-      <w:start w:val="1"/>
-      <w:numFmt w:val="decimal"/>
-      <w:lvlText w:val="%2."/>
-      <w:lvlJc w:val="left"/>
-      <w:pPr>
-        <w:tabs>
-          <w:tab w:val="num" w:pos="1440"/>
-        </w:tabs>
-        <w:ind w:left="1440" w:hanging="360"/>
-      </w:pPr>
-    </w:lvl>
-    <w:lvl w:ilvl="2" w:tentative="1">
-      <w:start w:val="1"/>
-      <w:numFmt w:val="decimal"/>
-      <w:lvlText w:val="%3."/>
-      <w:lvlJc w:val="left"/>
-      <w:pPr>
-        <w:tabs>
-          <w:tab w:val="num" w:pos="2160"/>
-        </w:tabs>
-        <w:ind w:left="2160" w:hanging="360"/>
-      </w:pPr>
-    </w:lvl>
-    <w:lvl w:ilvl="3" w:tentative="1">
-      <w:start w:val="1"/>
-      <w:numFmt w:val="decimal"/>
-      <w:lvlText w:val="%4."/>
-      <w:lvlJc w:val="left"/>
-      <w:pPr>
-        <w:tabs>
-          <w:tab w:val="num" w:pos="2880"/>
-        </w:tabs>
-        <w:ind w:left="2880" w:hanging="360"/>
-      </w:pPr>
-    </w:lvl>
-    <w:lvl w:ilvl="4" w:tentative="1">
-      <w:start w:val="1"/>
-      <w:numFmt w:val="decimal"/>
-      <w:lvlText w:val="%5."/>
-      <w:lvlJc w:val="left"/>
-      <w:pPr>
-        <w:tabs>
-          <w:tab w:val="num" w:pos="3600"/>
-        </w:tabs>
-        <w:ind w:left="3600" w:hanging="360"/>
-      </w:pPr>
-    </w:lvl>
-    <w:lvl w:ilvl="5" w:tentative="1">
-      <w:start w:val="1"/>
-      <w:numFmt w:val="decimal"/>
-      <w:lvlText w:val="%6."/>
-      <w:lvlJc w:val="left"/>
-      <w:pPr>
-        <w:tabs>
-          <w:tab w:val="num" w:pos="4320"/>
-        </w:tabs>
-        <w:ind w:left="4320" w:hanging="360"/>
-      </w:pPr>
-    </w:lvl>
-    <w:lvl w:ilvl="6" w:tentative="1">
-      <w:start w:val="1"/>
-      <w:numFmt w:val="decimal"/>
-      <w:lvlText w:val="%7."/>
-      <w:lvlJc w:val="left"/>
-      <w:pPr>
-        <w:tabs>
-          <w:tab w:val="num" w:pos="5040"/>
-        </w:tabs>
-        <w:ind w:left="5040" w:hanging="360"/>
-      </w:pPr>
-    </w:lvl>
-    <w:lvl w:ilvl="7" w:tentative="1">
-      <w:start w:val="1"/>
-      <w:numFmt w:val="decimal"/>
-      <w:lvlText w:val="%8."/>
-      <w:lvlJc w:val="left"/>
-      <w:pPr>
-        <w:tabs>
-          <w:tab w:val="num" w:pos="5760"/>
-        </w:tabs>
-        <w:ind w:left="5760" w:hanging="360"/>
-      </w:pPr>
-    </w:lvl>
-    <w:lvl w:ilvl="8" w:tentative="1">
-      <w:start w:val="1"/>
-      <w:numFmt w:val="decimal"/>
-      <w:lvlText w:val="%9."/>
-      <w:lvlJc w:val="left"/>
-      <w:pPr>
-        <w:tabs>
-          <w:tab w:val="num" w:pos="6480"/>
-        </w:tabs>
-        <w:ind w:left="6480" w:hanging="360"/>
-      </w:pPr>
-    </w:lvl>
-  </w:abstractNum>
-  <w:abstractNum w:abstractNumId="10" w15:restartNumberingAfterBreak="0">
-    <w:nsid w:val="234F4F3F"/>
-    <w:multiLevelType w:val="hybridMultilevel"/>
-    <w:tmpl w:val="2BD6237A"/>
-    <w:lvl w:ilvl="0" w:tplc="E4F089A0">
-      <w:start w:val="1"/>
-      <w:numFmt w:val="decimal"/>
-      <w:lvlText w:val="%1."/>
-      <w:lvlJc w:val="left"/>
-      <w:pPr>
-        <w:ind w:left="360" w:hanging="360"/>
-      </w:pPr>
-      <w:rPr>
-        <w:rFonts w:hint="default"/>
-      </w:rPr>
-    </w:lvl>
-    <w:lvl w:ilvl="1" w:tplc="04090019" w:tentative="1">
-      <w:start w:val="1"/>
-      <w:numFmt w:val="lowerLetter"/>
-      <w:lvlText w:val="%2)"/>
-      <w:lvlJc w:val="left"/>
-      <w:pPr>
-        <w:ind w:left="880" w:hanging="440"/>
-      </w:pPr>
-    </w:lvl>
-    <w:lvl w:ilvl="2" w:tplc="0409001B" w:tentative="1">
-      <w:start w:val="1"/>
-      <w:numFmt w:val="lowerRoman"/>
-      <w:lvlText w:val="%3."/>
-      <w:lvlJc w:val="right"/>
-      <w:pPr>
-        <w:ind w:left="1320" w:hanging="440"/>
-      </w:pPr>
-    </w:lvl>
-    <w:lvl w:ilvl="3" w:tplc="0409000F" w:tentative="1">
-      <w:start w:val="1"/>
-      <w:numFmt w:val="decimal"/>
-      <w:lvlText w:val="%4."/>
-      <w:lvlJc w:val="left"/>
-      <w:pPr>
-        <w:ind w:left="1760" w:hanging="440"/>
-      </w:pPr>
-    </w:lvl>
-    <w:lvl w:ilvl="4" w:tplc="04090019" w:tentative="1">
-      <w:start w:val="1"/>
-      <w:numFmt w:val="lowerLetter"/>
-      <w:lvlText w:val="%5)"/>
-      <w:lvlJc w:val="left"/>
-      <w:pPr>
-        <w:ind w:left="2200" w:hanging="440"/>
-      </w:pPr>
-    </w:lvl>
-    <w:lvl w:ilvl="5" w:tplc="0409001B" w:tentative="1">
-      <w:start w:val="1"/>
-      <w:numFmt w:val="lowerRoman"/>
-      <w:lvlText w:val="%6."/>
-      <w:lvlJc w:val="right"/>
-      <w:pPr>
-        <w:ind w:left="2640" w:hanging="440"/>
-      </w:pPr>
-    </w:lvl>
-    <w:lvl w:ilvl="6" w:tplc="0409000F" w:tentative="1">
-      <w:start w:val="1"/>
-      <w:numFmt w:val="decimal"/>
-      <w:lvlText w:val="%7."/>
-      <w:lvlJc w:val="left"/>
-      <w:pPr>
-        <w:ind w:left="3080" w:hanging="440"/>
-      </w:pPr>
-    </w:lvl>
-    <w:lvl w:ilvl="7" w:tplc="04090019" w:tentative="1">
-      <w:start w:val="1"/>
-      <w:numFmt w:val="lowerLetter"/>
-      <w:lvlText w:val="%8)"/>
-      <w:lvlJc w:val="left"/>
-      <w:pPr>
-        <w:ind w:left="3520" w:hanging="440"/>
-      </w:pPr>
-    </w:lvl>
-    <w:lvl w:ilvl="8" w:tplc="0409001B" w:tentative="1">
-      <w:start w:val="1"/>
-      <w:numFmt w:val="lowerRoman"/>
-      <w:lvlText w:val="%9."/>
-      <w:lvlJc w:val="right"/>
-      <w:pPr>
-        <w:ind w:left="3960" w:hanging="440"/>
-      </w:pPr>
-    </w:lvl>
-  </w:abstractNum>
-  <w:abstractNum w:abstractNumId="11" w15:restartNumberingAfterBreak="0">
     <w:nsid w:val="239A7740"/>
     <w:multiLevelType w:val="multilevel"/>
     <w:tmpl w:val="484E45F6"/>
@@ -7549,588 +6682,7 @@
       </w:pPr>
     </w:lvl>
   </w:abstractNum>
-  <w:abstractNum w:abstractNumId="12" w15:restartNumberingAfterBreak="0">
-    <w:nsid w:val="251F57E0"/>
-    <w:multiLevelType w:val="hybridMultilevel"/>
-    <w:tmpl w:val="CA60644E"/>
-    <w:lvl w:ilvl="0" w:tplc="04090001">
-      <w:start w:val="1"/>
-      <w:numFmt w:val="bullet"/>
-      <w:lvlText w:val=""/>
-      <w:lvlJc w:val="left"/>
-      <w:pPr>
-        <w:ind w:left="360" w:hanging="360"/>
-      </w:pPr>
-      <w:rPr>
-        <w:rFonts w:ascii="Symbol" w:hAnsi="Symbol" w:hint="default"/>
-      </w:rPr>
-    </w:lvl>
-    <w:lvl w:ilvl="1" w:tplc="04090003" w:tentative="1">
-      <w:start w:val="1"/>
-      <w:numFmt w:val="bullet"/>
-      <w:lvlText w:val="o"/>
-      <w:lvlJc w:val="left"/>
-      <w:pPr>
-        <w:ind w:left="1080" w:hanging="360"/>
-      </w:pPr>
-      <w:rPr>
-        <w:rFonts w:ascii="Courier New" w:hAnsi="Courier New" w:cs="Courier New" w:hint="default"/>
-      </w:rPr>
-    </w:lvl>
-    <w:lvl w:ilvl="2" w:tplc="04090005" w:tentative="1">
-      <w:start w:val="1"/>
-      <w:numFmt w:val="bullet"/>
-      <w:lvlText w:val=""/>
-      <w:lvlJc w:val="left"/>
-      <w:pPr>
-        <w:ind w:left="1800" w:hanging="360"/>
-      </w:pPr>
-      <w:rPr>
-        <w:rFonts w:ascii="Wingdings" w:hAnsi="Wingdings" w:hint="default"/>
-      </w:rPr>
-    </w:lvl>
-    <w:lvl w:ilvl="3" w:tplc="04090001" w:tentative="1">
-      <w:start w:val="1"/>
-      <w:numFmt w:val="bullet"/>
-      <w:lvlText w:val=""/>
-      <w:lvlJc w:val="left"/>
-      <w:pPr>
-        <w:ind w:left="2520" w:hanging="360"/>
-      </w:pPr>
-      <w:rPr>
-        <w:rFonts w:ascii="Symbol" w:hAnsi="Symbol" w:hint="default"/>
-      </w:rPr>
-    </w:lvl>
-    <w:lvl w:ilvl="4" w:tplc="04090003" w:tentative="1">
-      <w:start w:val="1"/>
-      <w:numFmt w:val="bullet"/>
-      <w:lvlText w:val="o"/>
-      <w:lvlJc w:val="left"/>
-      <w:pPr>
-        <w:ind w:left="3240" w:hanging="360"/>
-      </w:pPr>
-      <w:rPr>
-        <w:rFonts w:ascii="Courier New" w:hAnsi="Courier New" w:cs="Courier New" w:hint="default"/>
-      </w:rPr>
-    </w:lvl>
-    <w:lvl w:ilvl="5" w:tplc="04090005" w:tentative="1">
-      <w:start w:val="1"/>
-      <w:numFmt w:val="bullet"/>
-      <w:lvlText w:val=""/>
-      <w:lvlJc w:val="left"/>
-      <w:pPr>
-        <w:ind w:left="3960" w:hanging="360"/>
-      </w:pPr>
-      <w:rPr>
-        <w:rFonts w:ascii="Wingdings" w:hAnsi="Wingdings" w:hint="default"/>
-      </w:rPr>
-    </w:lvl>
-    <w:lvl w:ilvl="6" w:tplc="04090001" w:tentative="1">
-      <w:start w:val="1"/>
-      <w:numFmt w:val="bullet"/>
-      <w:lvlText w:val=""/>
-      <w:lvlJc w:val="left"/>
-      <w:pPr>
-        <w:ind w:left="4680" w:hanging="360"/>
-      </w:pPr>
-      <w:rPr>
-        <w:rFonts w:ascii="Symbol" w:hAnsi="Symbol" w:hint="default"/>
-      </w:rPr>
-    </w:lvl>
-    <w:lvl w:ilvl="7" w:tplc="04090003" w:tentative="1">
-      <w:start w:val="1"/>
-      <w:numFmt w:val="bullet"/>
-      <w:lvlText w:val="o"/>
-      <w:lvlJc w:val="left"/>
-      <w:pPr>
-        <w:ind w:left="5400" w:hanging="360"/>
-      </w:pPr>
-      <w:rPr>
-        <w:rFonts w:ascii="Courier New" w:hAnsi="Courier New" w:cs="Courier New" w:hint="default"/>
-      </w:rPr>
-    </w:lvl>
-    <w:lvl w:ilvl="8" w:tplc="04090005" w:tentative="1">
-      <w:start w:val="1"/>
-      <w:numFmt w:val="bullet"/>
-      <w:lvlText w:val=""/>
-      <w:lvlJc w:val="left"/>
-      <w:pPr>
-        <w:ind w:left="6120" w:hanging="360"/>
-      </w:pPr>
-      <w:rPr>
-        <w:rFonts w:ascii="Wingdings" w:hAnsi="Wingdings" w:hint="default"/>
-      </w:rPr>
-    </w:lvl>
-  </w:abstractNum>
-  <w:abstractNum w:abstractNumId="13" w15:restartNumberingAfterBreak="0">
-    <w:nsid w:val="257B1A68"/>
-    <w:multiLevelType w:val="hybridMultilevel"/>
-    <w:tmpl w:val="8E049C50"/>
-    <w:lvl w:ilvl="0" w:tplc="7FD47220">
-      <w:start w:val="1"/>
-      <w:numFmt w:val="decimal"/>
-      <w:lvlText w:val="%1."/>
-      <w:lvlJc w:val="left"/>
-      <w:pPr>
-        <w:ind w:left="360" w:hanging="360"/>
-      </w:pPr>
-      <w:rPr>
-        <w:rFonts w:hint="default"/>
-      </w:rPr>
-    </w:lvl>
-    <w:lvl w:ilvl="1" w:tplc="04090019" w:tentative="1">
-      <w:start w:val="1"/>
-      <w:numFmt w:val="lowerLetter"/>
-      <w:lvlText w:val="%2)"/>
-      <w:lvlJc w:val="left"/>
-      <w:pPr>
-        <w:ind w:left="880" w:hanging="440"/>
-      </w:pPr>
-    </w:lvl>
-    <w:lvl w:ilvl="2" w:tplc="0409001B" w:tentative="1">
-      <w:start w:val="1"/>
-      <w:numFmt w:val="lowerRoman"/>
-      <w:lvlText w:val="%3."/>
-      <w:lvlJc w:val="right"/>
-      <w:pPr>
-        <w:ind w:left="1320" w:hanging="440"/>
-      </w:pPr>
-    </w:lvl>
-    <w:lvl w:ilvl="3" w:tplc="0409000F" w:tentative="1">
-      <w:start w:val="1"/>
-      <w:numFmt w:val="decimal"/>
-      <w:lvlText w:val="%4."/>
-      <w:lvlJc w:val="left"/>
-      <w:pPr>
-        <w:ind w:left="1760" w:hanging="440"/>
-      </w:pPr>
-    </w:lvl>
-    <w:lvl w:ilvl="4" w:tplc="04090019" w:tentative="1">
-      <w:start w:val="1"/>
-      <w:numFmt w:val="lowerLetter"/>
-      <w:lvlText w:val="%5)"/>
-      <w:lvlJc w:val="left"/>
-      <w:pPr>
-        <w:ind w:left="2200" w:hanging="440"/>
-      </w:pPr>
-    </w:lvl>
-    <w:lvl w:ilvl="5" w:tplc="0409001B" w:tentative="1">
-      <w:start w:val="1"/>
-      <w:numFmt w:val="lowerRoman"/>
-      <w:lvlText w:val="%6."/>
-      <w:lvlJc w:val="right"/>
-      <w:pPr>
-        <w:ind w:left="2640" w:hanging="440"/>
-      </w:pPr>
-    </w:lvl>
-    <w:lvl w:ilvl="6" w:tplc="0409000F" w:tentative="1">
-      <w:start w:val="1"/>
-      <w:numFmt w:val="decimal"/>
-      <w:lvlText w:val="%7."/>
-      <w:lvlJc w:val="left"/>
-      <w:pPr>
-        <w:ind w:left="3080" w:hanging="440"/>
-      </w:pPr>
-    </w:lvl>
-    <w:lvl w:ilvl="7" w:tplc="04090019" w:tentative="1">
-      <w:start w:val="1"/>
-      <w:numFmt w:val="lowerLetter"/>
-      <w:lvlText w:val="%8)"/>
-      <w:lvlJc w:val="left"/>
-      <w:pPr>
-        <w:ind w:left="3520" w:hanging="440"/>
-      </w:pPr>
-    </w:lvl>
-    <w:lvl w:ilvl="8" w:tplc="0409001B" w:tentative="1">
-      <w:start w:val="1"/>
-      <w:numFmt w:val="lowerRoman"/>
-      <w:lvlText w:val="%9."/>
-      <w:lvlJc w:val="right"/>
-      <w:pPr>
-        <w:ind w:left="3960" w:hanging="440"/>
-      </w:pPr>
-    </w:lvl>
-  </w:abstractNum>
-  <w:abstractNum w:abstractNumId="14" w15:restartNumberingAfterBreak="0">
-    <w:nsid w:val="26A302B8"/>
-    <w:multiLevelType w:val="hybridMultilevel"/>
-    <w:tmpl w:val="2418FC9C"/>
-    <w:lvl w:ilvl="0" w:tplc="0E22AFD6">
-      <w:start w:val="1"/>
-      <w:numFmt w:val="decimal"/>
-      <w:lvlText w:val="%1."/>
-      <w:lvlJc w:val="left"/>
-      <w:pPr>
-        <w:ind w:left="360" w:hanging="360"/>
-      </w:pPr>
-      <w:rPr>
-        <w:rFonts w:hint="default"/>
-      </w:rPr>
-    </w:lvl>
-    <w:lvl w:ilvl="1" w:tplc="04090019" w:tentative="1">
-      <w:start w:val="1"/>
-      <w:numFmt w:val="lowerLetter"/>
-      <w:lvlText w:val="%2)"/>
-      <w:lvlJc w:val="left"/>
-      <w:pPr>
-        <w:ind w:left="880" w:hanging="440"/>
-      </w:pPr>
-    </w:lvl>
-    <w:lvl w:ilvl="2" w:tplc="0409001B" w:tentative="1">
-      <w:start w:val="1"/>
-      <w:numFmt w:val="lowerRoman"/>
-      <w:lvlText w:val="%3."/>
-      <w:lvlJc w:val="right"/>
-      <w:pPr>
-        <w:ind w:left="1320" w:hanging="440"/>
-      </w:pPr>
-    </w:lvl>
-    <w:lvl w:ilvl="3" w:tplc="0409000F" w:tentative="1">
-      <w:start w:val="1"/>
-      <w:numFmt w:val="decimal"/>
-      <w:lvlText w:val="%4."/>
-      <w:lvlJc w:val="left"/>
-      <w:pPr>
-        <w:ind w:left="1760" w:hanging="440"/>
-      </w:pPr>
-    </w:lvl>
-    <w:lvl w:ilvl="4" w:tplc="04090019" w:tentative="1">
-      <w:start w:val="1"/>
-      <w:numFmt w:val="lowerLetter"/>
-      <w:lvlText w:val="%5)"/>
-      <w:lvlJc w:val="left"/>
-      <w:pPr>
-        <w:ind w:left="2200" w:hanging="440"/>
-      </w:pPr>
-    </w:lvl>
-    <w:lvl w:ilvl="5" w:tplc="0409001B" w:tentative="1">
-      <w:start w:val="1"/>
-      <w:numFmt w:val="lowerRoman"/>
-      <w:lvlText w:val="%6."/>
-      <w:lvlJc w:val="right"/>
-      <w:pPr>
-        <w:ind w:left="2640" w:hanging="440"/>
-      </w:pPr>
-    </w:lvl>
-    <w:lvl w:ilvl="6" w:tplc="0409000F" w:tentative="1">
-      <w:start w:val="1"/>
-      <w:numFmt w:val="decimal"/>
-      <w:lvlText w:val="%7."/>
-      <w:lvlJc w:val="left"/>
-      <w:pPr>
-        <w:ind w:left="3080" w:hanging="440"/>
-      </w:pPr>
-    </w:lvl>
-    <w:lvl w:ilvl="7" w:tplc="04090019" w:tentative="1">
-      <w:start w:val="1"/>
-      <w:numFmt w:val="lowerLetter"/>
-      <w:lvlText w:val="%8)"/>
-      <w:lvlJc w:val="left"/>
-      <w:pPr>
-        <w:ind w:left="3520" w:hanging="440"/>
-      </w:pPr>
-    </w:lvl>
-    <w:lvl w:ilvl="8" w:tplc="0409001B" w:tentative="1">
-      <w:start w:val="1"/>
-      <w:numFmt w:val="lowerRoman"/>
-      <w:lvlText w:val="%9."/>
-      <w:lvlJc w:val="right"/>
-      <w:pPr>
-        <w:ind w:left="3960" w:hanging="440"/>
-      </w:pPr>
-    </w:lvl>
-  </w:abstractNum>
-  <w:abstractNum w:abstractNumId="15" w15:restartNumberingAfterBreak="0">
-    <w:nsid w:val="2AD57354"/>
-    <w:multiLevelType w:val="hybridMultilevel"/>
-    <w:tmpl w:val="3CF268BE"/>
-    <w:lvl w:ilvl="0" w:tplc="A044F554">
-      <w:start w:val="1"/>
-      <w:numFmt w:val="decimal"/>
-      <w:lvlText w:val="%1."/>
-      <w:lvlJc w:val="left"/>
-      <w:pPr>
-        <w:ind w:left="360" w:hanging="360"/>
-      </w:pPr>
-      <w:rPr>
-        <w:rFonts w:hint="default"/>
-      </w:rPr>
-    </w:lvl>
-    <w:lvl w:ilvl="1" w:tplc="04090019" w:tentative="1">
-      <w:start w:val="1"/>
-      <w:numFmt w:val="lowerLetter"/>
-      <w:lvlText w:val="%2)"/>
-      <w:lvlJc w:val="left"/>
-      <w:pPr>
-        <w:ind w:left="880" w:hanging="440"/>
-      </w:pPr>
-    </w:lvl>
-    <w:lvl w:ilvl="2" w:tplc="0409001B" w:tentative="1">
-      <w:start w:val="1"/>
-      <w:numFmt w:val="lowerRoman"/>
-      <w:lvlText w:val="%3."/>
-      <w:lvlJc w:val="right"/>
-      <w:pPr>
-        <w:ind w:left="1320" w:hanging="440"/>
-      </w:pPr>
-    </w:lvl>
-    <w:lvl w:ilvl="3" w:tplc="0409000F" w:tentative="1">
-      <w:start w:val="1"/>
-      <w:numFmt w:val="decimal"/>
-      <w:lvlText w:val="%4."/>
-      <w:lvlJc w:val="left"/>
-      <w:pPr>
-        <w:ind w:left="1760" w:hanging="440"/>
-      </w:pPr>
-    </w:lvl>
-    <w:lvl w:ilvl="4" w:tplc="04090019" w:tentative="1">
-      <w:start w:val="1"/>
-      <w:numFmt w:val="lowerLetter"/>
-      <w:lvlText w:val="%5)"/>
-      <w:lvlJc w:val="left"/>
-      <w:pPr>
-        <w:ind w:left="2200" w:hanging="440"/>
-      </w:pPr>
-    </w:lvl>
-    <w:lvl w:ilvl="5" w:tplc="0409001B" w:tentative="1">
-      <w:start w:val="1"/>
-      <w:numFmt w:val="lowerRoman"/>
-      <w:lvlText w:val="%6."/>
-      <w:lvlJc w:val="right"/>
-      <w:pPr>
-        <w:ind w:left="2640" w:hanging="440"/>
-      </w:pPr>
-    </w:lvl>
-    <w:lvl w:ilvl="6" w:tplc="0409000F" w:tentative="1">
-      <w:start w:val="1"/>
-      <w:numFmt w:val="decimal"/>
-      <w:lvlText w:val="%7."/>
-      <w:lvlJc w:val="left"/>
-      <w:pPr>
-        <w:ind w:left="3080" w:hanging="440"/>
-      </w:pPr>
-    </w:lvl>
-    <w:lvl w:ilvl="7" w:tplc="04090019" w:tentative="1">
-      <w:start w:val="1"/>
-      <w:numFmt w:val="lowerLetter"/>
-      <w:lvlText w:val="%8)"/>
-      <w:lvlJc w:val="left"/>
-      <w:pPr>
-        <w:ind w:left="3520" w:hanging="440"/>
-      </w:pPr>
-    </w:lvl>
-    <w:lvl w:ilvl="8" w:tplc="0409001B" w:tentative="1">
-      <w:start w:val="1"/>
-      <w:numFmt w:val="lowerRoman"/>
-      <w:lvlText w:val="%9."/>
-      <w:lvlJc w:val="right"/>
-      <w:pPr>
-        <w:ind w:left="3960" w:hanging="440"/>
-      </w:pPr>
-    </w:lvl>
-  </w:abstractNum>
-  <w:abstractNum w:abstractNumId="16" w15:restartNumberingAfterBreak="0">
-    <w:nsid w:val="2CE21D8D"/>
-    <w:multiLevelType w:val="hybridMultilevel"/>
-    <w:tmpl w:val="C6068B82"/>
-    <w:lvl w:ilvl="0" w:tplc="AE2A1A42">
-      <w:numFmt w:val="bullet"/>
-      <w:lvlText w:val=""/>
-      <w:lvlJc w:val="left"/>
-      <w:pPr>
-        <w:ind w:left="360" w:hanging="360"/>
-      </w:pPr>
-      <w:rPr>
-        <w:rFonts w:ascii="Wingdings" w:eastAsiaTheme="minorEastAsia" w:hAnsi="Wingdings" w:cstheme="minorBidi" w:hint="default"/>
-      </w:rPr>
-    </w:lvl>
-    <w:lvl w:ilvl="1" w:tplc="04090003" w:tentative="1">
-      <w:start w:val="1"/>
-      <w:numFmt w:val="bullet"/>
-      <w:lvlText w:val=""/>
-      <w:lvlJc w:val="left"/>
-      <w:pPr>
-        <w:ind w:left="880" w:hanging="440"/>
-      </w:pPr>
-      <w:rPr>
-        <w:rFonts w:ascii="Wingdings" w:hAnsi="Wingdings" w:hint="default"/>
-      </w:rPr>
-    </w:lvl>
-    <w:lvl w:ilvl="2" w:tplc="04090005" w:tentative="1">
-      <w:start w:val="1"/>
-      <w:numFmt w:val="bullet"/>
-      <w:lvlText w:val=""/>
-      <w:lvlJc w:val="left"/>
-      <w:pPr>
-        <w:ind w:left="1320" w:hanging="440"/>
-      </w:pPr>
-      <w:rPr>
-        <w:rFonts w:ascii="Wingdings" w:hAnsi="Wingdings" w:hint="default"/>
-      </w:rPr>
-    </w:lvl>
-    <w:lvl w:ilvl="3" w:tplc="04090001" w:tentative="1">
-      <w:start w:val="1"/>
-      <w:numFmt w:val="bullet"/>
-      <w:lvlText w:val=""/>
-      <w:lvlJc w:val="left"/>
-      <w:pPr>
-        <w:ind w:left="1760" w:hanging="440"/>
-      </w:pPr>
-      <w:rPr>
-        <w:rFonts w:ascii="Wingdings" w:hAnsi="Wingdings" w:hint="default"/>
-      </w:rPr>
-    </w:lvl>
-    <w:lvl w:ilvl="4" w:tplc="04090003" w:tentative="1">
-      <w:start w:val="1"/>
-      <w:numFmt w:val="bullet"/>
-      <w:lvlText w:val=""/>
-      <w:lvlJc w:val="left"/>
-      <w:pPr>
-        <w:ind w:left="2200" w:hanging="440"/>
-      </w:pPr>
-      <w:rPr>
-        <w:rFonts w:ascii="Wingdings" w:hAnsi="Wingdings" w:hint="default"/>
-      </w:rPr>
-    </w:lvl>
-    <w:lvl w:ilvl="5" w:tplc="04090005" w:tentative="1">
-      <w:start w:val="1"/>
-      <w:numFmt w:val="bullet"/>
-      <w:lvlText w:val=""/>
-      <w:lvlJc w:val="left"/>
-      <w:pPr>
-        <w:ind w:left="2640" w:hanging="440"/>
-      </w:pPr>
-      <w:rPr>
-        <w:rFonts w:ascii="Wingdings" w:hAnsi="Wingdings" w:hint="default"/>
-      </w:rPr>
-    </w:lvl>
-    <w:lvl w:ilvl="6" w:tplc="04090001" w:tentative="1">
-      <w:start w:val="1"/>
-      <w:numFmt w:val="bullet"/>
-      <w:lvlText w:val=""/>
-      <w:lvlJc w:val="left"/>
-      <w:pPr>
-        <w:ind w:left="3080" w:hanging="440"/>
-      </w:pPr>
-      <w:rPr>
-        <w:rFonts w:ascii="Wingdings" w:hAnsi="Wingdings" w:hint="default"/>
-      </w:rPr>
-    </w:lvl>
-    <w:lvl w:ilvl="7" w:tplc="04090003" w:tentative="1">
-      <w:start w:val="1"/>
-      <w:numFmt w:val="bullet"/>
-      <w:lvlText w:val=""/>
-      <w:lvlJc w:val="left"/>
-      <w:pPr>
-        <w:ind w:left="3520" w:hanging="440"/>
-      </w:pPr>
-      <w:rPr>
-        <w:rFonts w:ascii="Wingdings" w:hAnsi="Wingdings" w:hint="default"/>
-      </w:rPr>
-    </w:lvl>
-    <w:lvl w:ilvl="8" w:tplc="04090005" w:tentative="1">
-      <w:start w:val="1"/>
-      <w:numFmt w:val="bullet"/>
-      <w:lvlText w:val=""/>
-      <w:lvlJc w:val="left"/>
-      <w:pPr>
-        <w:ind w:left="3960" w:hanging="440"/>
-      </w:pPr>
-      <w:rPr>
-        <w:rFonts w:ascii="Wingdings" w:hAnsi="Wingdings" w:hint="default"/>
-      </w:rPr>
-    </w:lvl>
-  </w:abstractNum>
-  <w:abstractNum w:abstractNumId="17" w15:restartNumberingAfterBreak="0">
-    <w:nsid w:val="2F825702"/>
-    <w:multiLevelType w:val="hybridMultilevel"/>
-    <w:tmpl w:val="4D04F5E8"/>
-    <w:lvl w:ilvl="0" w:tplc="0409000F">
-      <w:start w:val="1"/>
-      <w:numFmt w:val="decimal"/>
-      <w:lvlText w:val="%1."/>
-      <w:lvlJc w:val="left"/>
-      <w:pPr>
-        <w:ind w:left="720" w:hanging="360"/>
-      </w:pPr>
-      <w:rPr>
-        <w:rFonts w:hint="default"/>
-      </w:rPr>
-    </w:lvl>
-    <w:lvl w:ilvl="1" w:tplc="04090019">
-      <w:start w:val="1"/>
-      <w:numFmt w:val="lowerLetter"/>
-      <w:lvlText w:val="%2."/>
-      <w:lvlJc w:val="left"/>
-      <w:pPr>
-        <w:ind w:left="1440" w:hanging="360"/>
-      </w:pPr>
-    </w:lvl>
-    <w:lvl w:ilvl="2" w:tplc="0409001B" w:tentative="1">
-      <w:start w:val="1"/>
-      <w:numFmt w:val="lowerRoman"/>
-      <w:lvlText w:val="%3."/>
-      <w:lvlJc w:val="right"/>
-      <w:pPr>
-        <w:ind w:left="2160" w:hanging="180"/>
-      </w:pPr>
-    </w:lvl>
-    <w:lvl w:ilvl="3" w:tplc="0409000F" w:tentative="1">
-      <w:start w:val="1"/>
-      <w:numFmt w:val="decimal"/>
-      <w:lvlText w:val="%4."/>
-      <w:lvlJc w:val="left"/>
-      <w:pPr>
-        <w:ind w:left="2880" w:hanging="360"/>
-      </w:pPr>
-    </w:lvl>
-    <w:lvl w:ilvl="4" w:tplc="04090019" w:tentative="1">
-      <w:start w:val="1"/>
-      <w:numFmt w:val="lowerLetter"/>
-      <w:lvlText w:val="%5."/>
-      <w:lvlJc w:val="left"/>
-      <w:pPr>
-        <w:ind w:left="3600" w:hanging="360"/>
-      </w:pPr>
-    </w:lvl>
-    <w:lvl w:ilvl="5" w:tplc="0409001B" w:tentative="1">
-      <w:start w:val="1"/>
-      <w:numFmt w:val="lowerRoman"/>
-      <w:lvlText w:val="%6."/>
-      <w:lvlJc w:val="right"/>
-      <w:pPr>
-        <w:ind w:left="4320" w:hanging="180"/>
-      </w:pPr>
-    </w:lvl>
-    <w:lvl w:ilvl="6" w:tplc="0409000F" w:tentative="1">
-      <w:start w:val="1"/>
-      <w:numFmt w:val="decimal"/>
-      <w:lvlText w:val="%7."/>
-      <w:lvlJc w:val="left"/>
-      <w:pPr>
-        <w:ind w:left="5040" w:hanging="360"/>
-      </w:pPr>
-    </w:lvl>
-    <w:lvl w:ilvl="7" w:tplc="04090019" w:tentative="1">
-      <w:start w:val="1"/>
-      <w:numFmt w:val="lowerLetter"/>
-      <w:lvlText w:val="%8."/>
-      <w:lvlJc w:val="left"/>
-      <w:pPr>
-        <w:ind w:left="5760" w:hanging="360"/>
-      </w:pPr>
-    </w:lvl>
-    <w:lvl w:ilvl="8" w:tplc="0409001B" w:tentative="1">
-      <w:start w:val="1"/>
-      <w:numFmt w:val="lowerRoman"/>
-      <w:lvlText w:val="%9."/>
-      <w:lvlJc w:val="right"/>
-      <w:pPr>
-        <w:ind w:left="6480" w:hanging="180"/>
-      </w:pPr>
-    </w:lvl>
-  </w:abstractNum>
-  <w:abstractNum w:abstractNumId="18" w15:restartNumberingAfterBreak="0">
+  <w:abstractNum w:abstractNumId="4" w15:restartNumberingAfterBreak="0">
     <w:nsid w:val="35C17B5D"/>
     <w:multiLevelType w:val="hybridMultilevel"/>
     <w:tmpl w:val="05305C80"/>
@@ -8220,7 +6772,7 @@
       </w:pPr>
     </w:lvl>
   </w:abstractNum>
-  <w:abstractNum w:abstractNumId="19" w15:restartNumberingAfterBreak="0">
+  <w:abstractNum w:abstractNumId="5" w15:restartNumberingAfterBreak="0">
     <w:nsid w:val="3649421A"/>
     <w:multiLevelType w:val="hybridMultilevel"/>
     <w:tmpl w:val="9432C52E"/>
@@ -8335,7 +6887,7 @@
       </w:rPr>
     </w:lvl>
   </w:abstractNum>
-  <w:abstractNum w:abstractNumId="20" w15:restartNumberingAfterBreak="0">
+  <w:abstractNum w:abstractNumId="6" w15:restartNumberingAfterBreak="0">
     <w:nsid w:val="38A26FCA"/>
     <w:multiLevelType w:val="hybridMultilevel"/>
     <w:tmpl w:val="A796AF74"/>
@@ -8424,7 +6976,7 @@
       </w:pPr>
     </w:lvl>
   </w:abstractNum>
-  <w:abstractNum w:abstractNumId="21" w15:restartNumberingAfterBreak="0">
+  <w:abstractNum w:abstractNumId="7" w15:restartNumberingAfterBreak="0">
     <w:nsid w:val="3C8C7C9E"/>
     <w:multiLevelType w:val="hybridMultilevel"/>
     <w:tmpl w:val="81A05D02"/>
@@ -8538,1538 +7090,7 @@
       </w:rPr>
     </w:lvl>
   </w:abstractNum>
-  <w:abstractNum w:abstractNumId="22" w15:restartNumberingAfterBreak="0">
-    <w:nsid w:val="3CCF1F01"/>
-    <w:multiLevelType w:val="hybridMultilevel"/>
-    <w:tmpl w:val="0B4A789C"/>
-    <w:lvl w:ilvl="0" w:tplc="0409000F">
-      <w:start w:val="1"/>
-      <w:numFmt w:val="decimal"/>
-      <w:lvlText w:val="%1."/>
-      <w:lvlJc w:val="left"/>
-      <w:pPr>
-        <w:ind w:left="720" w:hanging="360"/>
-      </w:pPr>
-      <w:rPr>
-        <w:rFonts w:hint="default"/>
-      </w:rPr>
-    </w:lvl>
-    <w:lvl w:ilvl="1" w:tplc="04090019" w:tentative="1">
-      <w:start w:val="1"/>
-      <w:numFmt w:val="lowerLetter"/>
-      <w:lvlText w:val="%2."/>
-      <w:lvlJc w:val="left"/>
-      <w:pPr>
-        <w:ind w:left="1440" w:hanging="360"/>
-      </w:pPr>
-    </w:lvl>
-    <w:lvl w:ilvl="2" w:tplc="0409001B" w:tentative="1">
-      <w:start w:val="1"/>
-      <w:numFmt w:val="lowerRoman"/>
-      <w:lvlText w:val="%3."/>
-      <w:lvlJc w:val="right"/>
-      <w:pPr>
-        <w:ind w:left="2160" w:hanging="180"/>
-      </w:pPr>
-    </w:lvl>
-    <w:lvl w:ilvl="3" w:tplc="0409000F" w:tentative="1">
-      <w:start w:val="1"/>
-      <w:numFmt w:val="decimal"/>
-      <w:lvlText w:val="%4."/>
-      <w:lvlJc w:val="left"/>
-      <w:pPr>
-        <w:ind w:left="2880" w:hanging="360"/>
-      </w:pPr>
-    </w:lvl>
-    <w:lvl w:ilvl="4" w:tplc="04090019" w:tentative="1">
-      <w:start w:val="1"/>
-      <w:numFmt w:val="lowerLetter"/>
-      <w:lvlText w:val="%5."/>
-      <w:lvlJc w:val="left"/>
-      <w:pPr>
-        <w:ind w:left="3600" w:hanging="360"/>
-      </w:pPr>
-    </w:lvl>
-    <w:lvl w:ilvl="5" w:tplc="0409001B" w:tentative="1">
-      <w:start w:val="1"/>
-      <w:numFmt w:val="lowerRoman"/>
-      <w:lvlText w:val="%6."/>
-      <w:lvlJc w:val="right"/>
-      <w:pPr>
-        <w:ind w:left="4320" w:hanging="180"/>
-      </w:pPr>
-    </w:lvl>
-    <w:lvl w:ilvl="6" w:tplc="0409000F" w:tentative="1">
-      <w:start w:val="1"/>
-      <w:numFmt w:val="decimal"/>
-      <w:lvlText w:val="%7."/>
-      <w:lvlJc w:val="left"/>
-      <w:pPr>
-        <w:ind w:left="5040" w:hanging="360"/>
-      </w:pPr>
-    </w:lvl>
-    <w:lvl w:ilvl="7" w:tplc="04090019" w:tentative="1">
-      <w:start w:val="1"/>
-      <w:numFmt w:val="lowerLetter"/>
-      <w:lvlText w:val="%8."/>
-      <w:lvlJc w:val="left"/>
-      <w:pPr>
-        <w:ind w:left="5760" w:hanging="360"/>
-      </w:pPr>
-    </w:lvl>
-    <w:lvl w:ilvl="8" w:tplc="0409001B" w:tentative="1">
-      <w:start w:val="1"/>
-      <w:numFmt w:val="lowerRoman"/>
-      <w:lvlText w:val="%9."/>
-      <w:lvlJc w:val="right"/>
-      <w:pPr>
-        <w:ind w:left="6480" w:hanging="180"/>
-      </w:pPr>
-    </w:lvl>
-  </w:abstractNum>
-  <w:abstractNum w:abstractNumId="23" w15:restartNumberingAfterBreak="0">
-    <w:nsid w:val="3E8707DE"/>
-    <w:multiLevelType w:val="hybridMultilevel"/>
-    <w:tmpl w:val="D332B93C"/>
-    <w:lvl w:ilvl="0" w:tplc="D6A05B7A">
-      <w:start w:val="1"/>
-      <w:numFmt w:val="decimal"/>
-      <w:lvlText w:val="%1."/>
-      <w:lvlJc w:val="left"/>
-      <w:pPr>
-        <w:ind w:left="360" w:hanging="360"/>
-      </w:pPr>
-      <w:rPr>
-        <w:rFonts w:hint="default"/>
-      </w:rPr>
-    </w:lvl>
-    <w:lvl w:ilvl="1" w:tplc="04090019">
-      <w:start w:val="1"/>
-      <w:numFmt w:val="lowerLetter"/>
-      <w:lvlText w:val="%2)"/>
-      <w:lvlJc w:val="left"/>
-      <w:pPr>
-        <w:ind w:left="880" w:hanging="440"/>
-      </w:pPr>
-    </w:lvl>
-    <w:lvl w:ilvl="2" w:tplc="0409001B" w:tentative="1">
-      <w:start w:val="1"/>
-      <w:numFmt w:val="lowerRoman"/>
-      <w:lvlText w:val="%3."/>
-      <w:lvlJc w:val="right"/>
-      <w:pPr>
-        <w:ind w:left="1320" w:hanging="440"/>
-      </w:pPr>
-    </w:lvl>
-    <w:lvl w:ilvl="3" w:tplc="0409000F" w:tentative="1">
-      <w:start w:val="1"/>
-      <w:numFmt w:val="decimal"/>
-      <w:lvlText w:val="%4."/>
-      <w:lvlJc w:val="left"/>
-      <w:pPr>
-        <w:ind w:left="1760" w:hanging="440"/>
-      </w:pPr>
-    </w:lvl>
-    <w:lvl w:ilvl="4" w:tplc="04090019" w:tentative="1">
-      <w:start w:val="1"/>
-      <w:numFmt w:val="lowerLetter"/>
-      <w:lvlText w:val="%5)"/>
-      <w:lvlJc w:val="left"/>
-      <w:pPr>
-        <w:ind w:left="2200" w:hanging="440"/>
-      </w:pPr>
-    </w:lvl>
-    <w:lvl w:ilvl="5" w:tplc="0409001B" w:tentative="1">
-      <w:start w:val="1"/>
-      <w:numFmt w:val="lowerRoman"/>
-      <w:lvlText w:val="%6."/>
-      <w:lvlJc w:val="right"/>
-      <w:pPr>
-        <w:ind w:left="2640" w:hanging="440"/>
-      </w:pPr>
-    </w:lvl>
-    <w:lvl w:ilvl="6" w:tplc="0409000F" w:tentative="1">
-      <w:start w:val="1"/>
-      <w:numFmt w:val="decimal"/>
-      <w:lvlText w:val="%7."/>
-      <w:lvlJc w:val="left"/>
-      <w:pPr>
-        <w:ind w:left="3080" w:hanging="440"/>
-      </w:pPr>
-    </w:lvl>
-    <w:lvl w:ilvl="7" w:tplc="04090019" w:tentative="1">
-      <w:start w:val="1"/>
-      <w:numFmt w:val="lowerLetter"/>
-      <w:lvlText w:val="%8)"/>
-      <w:lvlJc w:val="left"/>
-      <w:pPr>
-        <w:ind w:left="3520" w:hanging="440"/>
-      </w:pPr>
-    </w:lvl>
-    <w:lvl w:ilvl="8" w:tplc="0409001B" w:tentative="1">
-      <w:start w:val="1"/>
-      <w:numFmt w:val="lowerRoman"/>
-      <w:lvlText w:val="%9."/>
-      <w:lvlJc w:val="right"/>
-      <w:pPr>
-        <w:ind w:left="3960" w:hanging="440"/>
-      </w:pPr>
-    </w:lvl>
-  </w:abstractNum>
-  <w:abstractNum w:abstractNumId="24" w15:restartNumberingAfterBreak="0">
-    <w:nsid w:val="40164217"/>
-    <w:multiLevelType w:val="hybridMultilevel"/>
-    <w:tmpl w:val="AFB2BB8A"/>
-    <w:lvl w:ilvl="0" w:tplc="E876B454">
-      <w:start w:val="1"/>
-      <w:numFmt w:val="decimal"/>
-      <w:lvlText w:val="%1."/>
-      <w:lvlJc w:val="left"/>
-      <w:pPr>
-        <w:ind w:left="360" w:hanging="360"/>
-      </w:pPr>
-      <w:rPr>
-        <w:rFonts w:hint="default"/>
-      </w:rPr>
-    </w:lvl>
-    <w:lvl w:ilvl="1" w:tplc="04090019" w:tentative="1">
-      <w:start w:val="1"/>
-      <w:numFmt w:val="lowerLetter"/>
-      <w:lvlText w:val="%2)"/>
-      <w:lvlJc w:val="left"/>
-      <w:pPr>
-        <w:ind w:left="880" w:hanging="440"/>
-      </w:pPr>
-    </w:lvl>
-    <w:lvl w:ilvl="2" w:tplc="0409001B" w:tentative="1">
-      <w:start w:val="1"/>
-      <w:numFmt w:val="lowerRoman"/>
-      <w:lvlText w:val="%3."/>
-      <w:lvlJc w:val="right"/>
-      <w:pPr>
-        <w:ind w:left="1320" w:hanging="440"/>
-      </w:pPr>
-    </w:lvl>
-    <w:lvl w:ilvl="3" w:tplc="0409000F" w:tentative="1">
-      <w:start w:val="1"/>
-      <w:numFmt w:val="decimal"/>
-      <w:lvlText w:val="%4."/>
-      <w:lvlJc w:val="left"/>
-      <w:pPr>
-        <w:ind w:left="1760" w:hanging="440"/>
-      </w:pPr>
-    </w:lvl>
-    <w:lvl w:ilvl="4" w:tplc="04090019" w:tentative="1">
-      <w:start w:val="1"/>
-      <w:numFmt w:val="lowerLetter"/>
-      <w:lvlText w:val="%5)"/>
-      <w:lvlJc w:val="left"/>
-      <w:pPr>
-        <w:ind w:left="2200" w:hanging="440"/>
-      </w:pPr>
-    </w:lvl>
-    <w:lvl w:ilvl="5" w:tplc="0409001B" w:tentative="1">
-      <w:start w:val="1"/>
-      <w:numFmt w:val="lowerRoman"/>
-      <w:lvlText w:val="%6."/>
-      <w:lvlJc w:val="right"/>
-      <w:pPr>
-        <w:ind w:left="2640" w:hanging="440"/>
-      </w:pPr>
-    </w:lvl>
-    <w:lvl w:ilvl="6" w:tplc="0409000F" w:tentative="1">
-      <w:start w:val="1"/>
-      <w:numFmt w:val="decimal"/>
-      <w:lvlText w:val="%7."/>
-      <w:lvlJc w:val="left"/>
-      <w:pPr>
-        <w:ind w:left="3080" w:hanging="440"/>
-      </w:pPr>
-    </w:lvl>
-    <w:lvl w:ilvl="7" w:tplc="04090019" w:tentative="1">
-      <w:start w:val="1"/>
-      <w:numFmt w:val="lowerLetter"/>
-      <w:lvlText w:val="%8)"/>
-      <w:lvlJc w:val="left"/>
-      <w:pPr>
-        <w:ind w:left="3520" w:hanging="440"/>
-      </w:pPr>
-    </w:lvl>
-    <w:lvl w:ilvl="8" w:tplc="0409001B" w:tentative="1">
-      <w:start w:val="1"/>
-      <w:numFmt w:val="lowerRoman"/>
-      <w:lvlText w:val="%9."/>
-      <w:lvlJc w:val="right"/>
-      <w:pPr>
-        <w:ind w:left="3960" w:hanging="440"/>
-      </w:pPr>
-    </w:lvl>
-  </w:abstractNum>
-  <w:abstractNum w:abstractNumId="25" w15:restartNumberingAfterBreak="0">
-    <w:nsid w:val="40780567"/>
-    <w:multiLevelType w:val="hybridMultilevel"/>
-    <w:tmpl w:val="A3C89C0C"/>
-    <w:lvl w:ilvl="0" w:tplc="91AA90BA">
-      <w:start w:val="1"/>
-      <w:numFmt w:val="decimal"/>
-      <w:lvlText w:val="%1."/>
-      <w:lvlJc w:val="left"/>
-      <w:pPr>
-        <w:ind w:left="360" w:hanging="360"/>
-      </w:pPr>
-      <w:rPr>
-        <w:rFonts w:hint="default"/>
-      </w:rPr>
-    </w:lvl>
-    <w:lvl w:ilvl="1" w:tplc="04090019" w:tentative="1">
-      <w:start w:val="1"/>
-      <w:numFmt w:val="lowerLetter"/>
-      <w:lvlText w:val="%2)"/>
-      <w:lvlJc w:val="left"/>
-      <w:pPr>
-        <w:ind w:left="880" w:hanging="440"/>
-      </w:pPr>
-    </w:lvl>
-    <w:lvl w:ilvl="2" w:tplc="0409001B" w:tentative="1">
-      <w:start w:val="1"/>
-      <w:numFmt w:val="lowerRoman"/>
-      <w:lvlText w:val="%3."/>
-      <w:lvlJc w:val="right"/>
-      <w:pPr>
-        <w:ind w:left="1320" w:hanging="440"/>
-      </w:pPr>
-    </w:lvl>
-    <w:lvl w:ilvl="3" w:tplc="0409000F" w:tentative="1">
-      <w:start w:val="1"/>
-      <w:numFmt w:val="decimal"/>
-      <w:lvlText w:val="%4."/>
-      <w:lvlJc w:val="left"/>
-      <w:pPr>
-        <w:ind w:left="1760" w:hanging="440"/>
-      </w:pPr>
-    </w:lvl>
-    <w:lvl w:ilvl="4" w:tplc="04090019" w:tentative="1">
-      <w:start w:val="1"/>
-      <w:numFmt w:val="lowerLetter"/>
-      <w:lvlText w:val="%5)"/>
-      <w:lvlJc w:val="left"/>
-      <w:pPr>
-        <w:ind w:left="2200" w:hanging="440"/>
-      </w:pPr>
-    </w:lvl>
-    <w:lvl w:ilvl="5" w:tplc="0409001B" w:tentative="1">
-      <w:start w:val="1"/>
-      <w:numFmt w:val="lowerRoman"/>
-      <w:lvlText w:val="%6."/>
-      <w:lvlJc w:val="right"/>
-      <w:pPr>
-        <w:ind w:left="2640" w:hanging="440"/>
-      </w:pPr>
-    </w:lvl>
-    <w:lvl w:ilvl="6" w:tplc="0409000F" w:tentative="1">
-      <w:start w:val="1"/>
-      <w:numFmt w:val="decimal"/>
-      <w:lvlText w:val="%7."/>
-      <w:lvlJc w:val="left"/>
-      <w:pPr>
-        <w:ind w:left="3080" w:hanging="440"/>
-      </w:pPr>
-    </w:lvl>
-    <w:lvl w:ilvl="7" w:tplc="04090019" w:tentative="1">
-      <w:start w:val="1"/>
-      <w:numFmt w:val="lowerLetter"/>
-      <w:lvlText w:val="%8)"/>
-      <w:lvlJc w:val="left"/>
-      <w:pPr>
-        <w:ind w:left="3520" w:hanging="440"/>
-      </w:pPr>
-    </w:lvl>
-    <w:lvl w:ilvl="8" w:tplc="0409001B" w:tentative="1">
-      <w:start w:val="1"/>
-      <w:numFmt w:val="lowerRoman"/>
-      <w:lvlText w:val="%9."/>
-      <w:lvlJc w:val="right"/>
-      <w:pPr>
-        <w:ind w:left="3960" w:hanging="440"/>
-      </w:pPr>
-    </w:lvl>
-  </w:abstractNum>
-  <w:abstractNum w:abstractNumId="26" w15:restartNumberingAfterBreak="0">
-    <w:nsid w:val="41F76F02"/>
-    <w:multiLevelType w:val="hybridMultilevel"/>
-    <w:tmpl w:val="2B92EA7E"/>
-    <w:lvl w:ilvl="0" w:tplc="FFFFFFFF">
-      <w:start w:val="1"/>
-      <w:numFmt w:val="bullet"/>
-      <w:lvlText w:val=""/>
-      <w:lvlJc w:val="left"/>
-      <w:pPr>
-        <w:ind w:left="440" w:hanging="440"/>
-      </w:pPr>
-      <w:rPr>
-        <w:rFonts w:ascii="Wingdings" w:hAnsi="Wingdings" w:hint="default"/>
-      </w:rPr>
-    </w:lvl>
-    <w:lvl w:ilvl="1" w:tplc="04090003">
-      <w:start w:val="1"/>
-      <w:numFmt w:val="bullet"/>
-      <w:lvlText w:val=""/>
-      <w:lvlJc w:val="left"/>
-      <w:pPr>
-        <w:ind w:left="880" w:hanging="440"/>
-      </w:pPr>
-      <w:rPr>
-        <w:rFonts w:ascii="Wingdings" w:hAnsi="Wingdings" w:hint="default"/>
-      </w:rPr>
-    </w:lvl>
-    <w:lvl w:ilvl="2" w:tplc="FFFFFFFF">
-      <w:start w:val="1"/>
-      <w:numFmt w:val="lowerRoman"/>
-      <w:lvlText w:val="%3."/>
-      <w:lvlJc w:val="right"/>
-      <w:pPr>
-        <w:ind w:left="1320" w:hanging="440"/>
-      </w:pPr>
-    </w:lvl>
-    <w:lvl w:ilvl="3" w:tplc="FFFFFFFF" w:tentative="1">
-      <w:start w:val="1"/>
-      <w:numFmt w:val="decimal"/>
-      <w:lvlText w:val="%4."/>
-      <w:lvlJc w:val="left"/>
-      <w:pPr>
-        <w:ind w:left="1760" w:hanging="440"/>
-      </w:pPr>
-    </w:lvl>
-    <w:lvl w:ilvl="4" w:tplc="FFFFFFFF" w:tentative="1">
-      <w:start w:val="1"/>
-      <w:numFmt w:val="lowerLetter"/>
-      <w:lvlText w:val="%5)"/>
-      <w:lvlJc w:val="left"/>
-      <w:pPr>
-        <w:ind w:left="2200" w:hanging="440"/>
-      </w:pPr>
-    </w:lvl>
-    <w:lvl w:ilvl="5" w:tplc="FFFFFFFF" w:tentative="1">
-      <w:start w:val="1"/>
-      <w:numFmt w:val="lowerRoman"/>
-      <w:lvlText w:val="%6."/>
-      <w:lvlJc w:val="right"/>
-      <w:pPr>
-        <w:ind w:left="2640" w:hanging="440"/>
-      </w:pPr>
-    </w:lvl>
-    <w:lvl w:ilvl="6" w:tplc="FFFFFFFF" w:tentative="1">
-      <w:start w:val="1"/>
-      <w:numFmt w:val="decimal"/>
-      <w:lvlText w:val="%7."/>
-      <w:lvlJc w:val="left"/>
-      <w:pPr>
-        <w:ind w:left="3080" w:hanging="440"/>
-      </w:pPr>
-    </w:lvl>
-    <w:lvl w:ilvl="7" w:tplc="FFFFFFFF" w:tentative="1">
-      <w:start w:val="1"/>
-      <w:numFmt w:val="lowerLetter"/>
-      <w:lvlText w:val="%8)"/>
-      <w:lvlJc w:val="left"/>
-      <w:pPr>
-        <w:ind w:left="3520" w:hanging="440"/>
-      </w:pPr>
-    </w:lvl>
-    <w:lvl w:ilvl="8" w:tplc="FFFFFFFF" w:tentative="1">
-      <w:start w:val="1"/>
-      <w:numFmt w:val="lowerRoman"/>
-      <w:lvlText w:val="%9."/>
-      <w:lvlJc w:val="right"/>
-      <w:pPr>
-        <w:ind w:left="3960" w:hanging="440"/>
-      </w:pPr>
-    </w:lvl>
-  </w:abstractNum>
-  <w:abstractNum w:abstractNumId="27" w15:restartNumberingAfterBreak="0">
-    <w:nsid w:val="428519FB"/>
-    <w:multiLevelType w:val="multilevel"/>
-    <w:tmpl w:val="C6703694"/>
-    <w:lvl w:ilvl="0">
-      <w:start w:val="1"/>
-      <w:numFmt w:val="bullet"/>
-      <w:lvlText w:val=""/>
-      <w:lvlJc w:val="left"/>
-      <w:pPr>
-        <w:tabs>
-          <w:tab w:val="num" w:pos="720"/>
-        </w:tabs>
-        <w:ind w:left="720" w:hanging="360"/>
-      </w:pPr>
-      <w:rPr>
-        <w:rFonts w:ascii="Symbol" w:hAnsi="Symbol" w:hint="default"/>
-        <w:sz w:val="20"/>
-      </w:rPr>
-    </w:lvl>
-    <w:lvl w:ilvl="1" w:tentative="1">
-      <w:start w:val="1"/>
-      <w:numFmt w:val="bullet"/>
-      <w:lvlText w:val="o"/>
-      <w:lvlJc w:val="left"/>
-      <w:pPr>
-        <w:tabs>
-          <w:tab w:val="num" w:pos="1440"/>
-        </w:tabs>
-        <w:ind w:left="1440" w:hanging="360"/>
-      </w:pPr>
-      <w:rPr>
-        <w:rFonts w:ascii="Courier New" w:hAnsi="Courier New" w:hint="default"/>
-        <w:sz w:val="20"/>
-      </w:rPr>
-    </w:lvl>
-    <w:lvl w:ilvl="2" w:tentative="1">
-      <w:start w:val="1"/>
-      <w:numFmt w:val="bullet"/>
-      <w:lvlText w:val=""/>
-      <w:lvlJc w:val="left"/>
-      <w:pPr>
-        <w:tabs>
-          <w:tab w:val="num" w:pos="2160"/>
-        </w:tabs>
-        <w:ind w:left="2160" w:hanging="360"/>
-      </w:pPr>
-      <w:rPr>
-        <w:rFonts w:ascii="Wingdings" w:hAnsi="Wingdings" w:hint="default"/>
-        <w:sz w:val="20"/>
-      </w:rPr>
-    </w:lvl>
-    <w:lvl w:ilvl="3" w:tentative="1">
-      <w:start w:val="1"/>
-      <w:numFmt w:val="bullet"/>
-      <w:lvlText w:val=""/>
-      <w:lvlJc w:val="left"/>
-      <w:pPr>
-        <w:tabs>
-          <w:tab w:val="num" w:pos="2880"/>
-        </w:tabs>
-        <w:ind w:left="2880" w:hanging="360"/>
-      </w:pPr>
-      <w:rPr>
-        <w:rFonts w:ascii="Wingdings" w:hAnsi="Wingdings" w:hint="default"/>
-        <w:sz w:val="20"/>
-      </w:rPr>
-    </w:lvl>
-    <w:lvl w:ilvl="4" w:tentative="1">
-      <w:start w:val="1"/>
-      <w:numFmt w:val="bullet"/>
-      <w:lvlText w:val=""/>
-      <w:lvlJc w:val="left"/>
-      <w:pPr>
-        <w:tabs>
-          <w:tab w:val="num" w:pos="3600"/>
-        </w:tabs>
-        <w:ind w:left="3600" w:hanging="360"/>
-      </w:pPr>
-      <w:rPr>
-        <w:rFonts w:ascii="Wingdings" w:hAnsi="Wingdings" w:hint="default"/>
-        <w:sz w:val="20"/>
-      </w:rPr>
-    </w:lvl>
-    <w:lvl w:ilvl="5" w:tentative="1">
-      <w:start w:val="1"/>
-      <w:numFmt w:val="bullet"/>
-      <w:lvlText w:val=""/>
-      <w:lvlJc w:val="left"/>
-      <w:pPr>
-        <w:tabs>
-          <w:tab w:val="num" w:pos="4320"/>
-        </w:tabs>
-        <w:ind w:left="4320" w:hanging="360"/>
-      </w:pPr>
-      <w:rPr>
-        <w:rFonts w:ascii="Wingdings" w:hAnsi="Wingdings" w:hint="default"/>
-        <w:sz w:val="20"/>
-      </w:rPr>
-    </w:lvl>
-    <w:lvl w:ilvl="6" w:tentative="1">
-      <w:start w:val="1"/>
-      <w:numFmt w:val="bullet"/>
-      <w:lvlText w:val=""/>
-      <w:lvlJc w:val="left"/>
-      <w:pPr>
-        <w:tabs>
-          <w:tab w:val="num" w:pos="5040"/>
-        </w:tabs>
-        <w:ind w:left="5040" w:hanging="360"/>
-      </w:pPr>
-      <w:rPr>
-        <w:rFonts w:ascii="Wingdings" w:hAnsi="Wingdings" w:hint="default"/>
-        <w:sz w:val="20"/>
-      </w:rPr>
-    </w:lvl>
-    <w:lvl w:ilvl="7" w:tentative="1">
-      <w:start w:val="1"/>
-      <w:numFmt w:val="bullet"/>
-      <w:lvlText w:val=""/>
-      <w:lvlJc w:val="left"/>
-      <w:pPr>
-        <w:tabs>
-          <w:tab w:val="num" w:pos="5760"/>
-        </w:tabs>
-        <w:ind w:left="5760" w:hanging="360"/>
-      </w:pPr>
-      <w:rPr>
-        <w:rFonts w:ascii="Wingdings" w:hAnsi="Wingdings" w:hint="default"/>
-        <w:sz w:val="20"/>
-      </w:rPr>
-    </w:lvl>
-    <w:lvl w:ilvl="8" w:tentative="1">
-      <w:start w:val="1"/>
-      <w:numFmt w:val="bullet"/>
-      <w:lvlText w:val=""/>
-      <w:lvlJc w:val="left"/>
-      <w:pPr>
-        <w:tabs>
-          <w:tab w:val="num" w:pos="6480"/>
-        </w:tabs>
-        <w:ind w:left="6480" w:hanging="360"/>
-      </w:pPr>
-      <w:rPr>
-        <w:rFonts w:ascii="Wingdings" w:hAnsi="Wingdings" w:hint="default"/>
-        <w:sz w:val="20"/>
-      </w:rPr>
-    </w:lvl>
-  </w:abstractNum>
-  <w:abstractNum w:abstractNumId="28" w15:restartNumberingAfterBreak="0">
-    <w:nsid w:val="45D006C8"/>
-    <w:multiLevelType w:val="hybridMultilevel"/>
-    <w:tmpl w:val="D3A85046"/>
-    <w:lvl w:ilvl="0" w:tplc="0409000F">
-      <w:start w:val="1"/>
-      <w:numFmt w:val="decimal"/>
-      <w:lvlText w:val="%1."/>
-      <w:lvlJc w:val="left"/>
-      <w:pPr>
-        <w:ind w:left="360" w:hanging="360"/>
-      </w:pPr>
-    </w:lvl>
-    <w:lvl w:ilvl="1" w:tplc="04090019" w:tentative="1">
-      <w:start w:val="1"/>
-      <w:numFmt w:val="lowerLetter"/>
-      <w:lvlText w:val="%2."/>
-      <w:lvlJc w:val="left"/>
-      <w:pPr>
-        <w:ind w:left="1080" w:hanging="360"/>
-      </w:pPr>
-    </w:lvl>
-    <w:lvl w:ilvl="2" w:tplc="0409001B" w:tentative="1">
-      <w:start w:val="1"/>
-      <w:numFmt w:val="lowerRoman"/>
-      <w:lvlText w:val="%3."/>
-      <w:lvlJc w:val="right"/>
-      <w:pPr>
-        <w:ind w:left="1800" w:hanging="180"/>
-      </w:pPr>
-    </w:lvl>
-    <w:lvl w:ilvl="3" w:tplc="0409000F" w:tentative="1">
-      <w:start w:val="1"/>
-      <w:numFmt w:val="decimal"/>
-      <w:lvlText w:val="%4."/>
-      <w:lvlJc w:val="left"/>
-      <w:pPr>
-        <w:ind w:left="2520" w:hanging="360"/>
-      </w:pPr>
-    </w:lvl>
-    <w:lvl w:ilvl="4" w:tplc="04090019" w:tentative="1">
-      <w:start w:val="1"/>
-      <w:numFmt w:val="lowerLetter"/>
-      <w:lvlText w:val="%5."/>
-      <w:lvlJc w:val="left"/>
-      <w:pPr>
-        <w:ind w:left="3240" w:hanging="360"/>
-      </w:pPr>
-    </w:lvl>
-    <w:lvl w:ilvl="5" w:tplc="0409001B" w:tentative="1">
-      <w:start w:val="1"/>
-      <w:numFmt w:val="lowerRoman"/>
-      <w:lvlText w:val="%6."/>
-      <w:lvlJc w:val="right"/>
-      <w:pPr>
-        <w:ind w:left="3960" w:hanging="180"/>
-      </w:pPr>
-    </w:lvl>
-    <w:lvl w:ilvl="6" w:tplc="0409000F" w:tentative="1">
-      <w:start w:val="1"/>
-      <w:numFmt w:val="decimal"/>
-      <w:lvlText w:val="%7."/>
-      <w:lvlJc w:val="left"/>
-      <w:pPr>
-        <w:ind w:left="4680" w:hanging="360"/>
-      </w:pPr>
-    </w:lvl>
-    <w:lvl w:ilvl="7" w:tplc="04090019" w:tentative="1">
-      <w:start w:val="1"/>
-      <w:numFmt w:val="lowerLetter"/>
-      <w:lvlText w:val="%8."/>
-      <w:lvlJc w:val="left"/>
-      <w:pPr>
-        <w:ind w:left="5400" w:hanging="360"/>
-      </w:pPr>
-    </w:lvl>
-    <w:lvl w:ilvl="8" w:tplc="0409001B" w:tentative="1">
-      <w:start w:val="1"/>
-      <w:numFmt w:val="lowerRoman"/>
-      <w:lvlText w:val="%9."/>
-      <w:lvlJc w:val="right"/>
-      <w:pPr>
-        <w:ind w:left="6120" w:hanging="180"/>
-      </w:pPr>
-    </w:lvl>
-  </w:abstractNum>
-  <w:abstractNum w:abstractNumId="29" w15:restartNumberingAfterBreak="0">
-    <w:nsid w:val="46097779"/>
-    <w:multiLevelType w:val="hybridMultilevel"/>
-    <w:tmpl w:val="08A86FAA"/>
-    <w:lvl w:ilvl="0" w:tplc="116A6B26">
-      <w:start w:val="1"/>
-      <w:numFmt w:val="decimal"/>
-      <w:lvlText w:val="%1."/>
-      <w:lvlJc w:val="left"/>
-      <w:pPr>
-        <w:ind w:left="360" w:hanging="360"/>
-      </w:pPr>
-      <w:rPr>
-        <w:rFonts w:hint="default"/>
-      </w:rPr>
-    </w:lvl>
-    <w:lvl w:ilvl="1" w:tplc="04090019" w:tentative="1">
-      <w:start w:val="1"/>
-      <w:numFmt w:val="lowerLetter"/>
-      <w:lvlText w:val="%2)"/>
-      <w:lvlJc w:val="left"/>
-      <w:pPr>
-        <w:ind w:left="880" w:hanging="440"/>
-      </w:pPr>
-    </w:lvl>
-    <w:lvl w:ilvl="2" w:tplc="0409001B" w:tentative="1">
-      <w:start w:val="1"/>
-      <w:numFmt w:val="lowerRoman"/>
-      <w:lvlText w:val="%3."/>
-      <w:lvlJc w:val="right"/>
-      <w:pPr>
-        <w:ind w:left="1320" w:hanging="440"/>
-      </w:pPr>
-    </w:lvl>
-    <w:lvl w:ilvl="3" w:tplc="0409000F" w:tentative="1">
-      <w:start w:val="1"/>
-      <w:numFmt w:val="decimal"/>
-      <w:lvlText w:val="%4."/>
-      <w:lvlJc w:val="left"/>
-      <w:pPr>
-        <w:ind w:left="1760" w:hanging="440"/>
-      </w:pPr>
-    </w:lvl>
-    <w:lvl w:ilvl="4" w:tplc="04090019" w:tentative="1">
-      <w:start w:val="1"/>
-      <w:numFmt w:val="lowerLetter"/>
-      <w:lvlText w:val="%5)"/>
-      <w:lvlJc w:val="left"/>
-      <w:pPr>
-        <w:ind w:left="2200" w:hanging="440"/>
-      </w:pPr>
-    </w:lvl>
-    <w:lvl w:ilvl="5" w:tplc="0409001B" w:tentative="1">
-      <w:start w:val="1"/>
-      <w:numFmt w:val="lowerRoman"/>
-      <w:lvlText w:val="%6."/>
-      <w:lvlJc w:val="right"/>
-      <w:pPr>
-        <w:ind w:left="2640" w:hanging="440"/>
-      </w:pPr>
-    </w:lvl>
-    <w:lvl w:ilvl="6" w:tplc="0409000F" w:tentative="1">
-      <w:start w:val="1"/>
-      <w:numFmt w:val="decimal"/>
-      <w:lvlText w:val="%7."/>
-      <w:lvlJc w:val="left"/>
-      <w:pPr>
-        <w:ind w:left="3080" w:hanging="440"/>
-      </w:pPr>
-    </w:lvl>
-    <w:lvl w:ilvl="7" w:tplc="04090019" w:tentative="1">
-      <w:start w:val="1"/>
-      <w:numFmt w:val="lowerLetter"/>
-      <w:lvlText w:val="%8)"/>
-      <w:lvlJc w:val="left"/>
-      <w:pPr>
-        <w:ind w:left="3520" w:hanging="440"/>
-      </w:pPr>
-    </w:lvl>
-    <w:lvl w:ilvl="8" w:tplc="0409001B" w:tentative="1">
-      <w:start w:val="1"/>
-      <w:numFmt w:val="lowerRoman"/>
-      <w:lvlText w:val="%9."/>
-      <w:lvlJc w:val="right"/>
-      <w:pPr>
-        <w:ind w:left="3960" w:hanging="440"/>
-      </w:pPr>
-    </w:lvl>
-  </w:abstractNum>
-  <w:abstractNum w:abstractNumId="30" w15:restartNumberingAfterBreak="0">
-    <w:nsid w:val="47E306E6"/>
-    <w:multiLevelType w:val="hybridMultilevel"/>
-    <w:tmpl w:val="51C0B932"/>
-    <w:lvl w:ilvl="0" w:tplc="81DAEDBE">
-      <w:start w:val="1"/>
-      <w:numFmt w:val="decimal"/>
-      <w:lvlText w:val="%1."/>
-      <w:lvlJc w:val="left"/>
-      <w:pPr>
-        <w:ind w:left="360" w:hanging="360"/>
-      </w:pPr>
-      <w:rPr>
-        <w:rFonts w:hint="default"/>
-      </w:rPr>
-    </w:lvl>
-    <w:lvl w:ilvl="1" w:tplc="04090019" w:tentative="1">
-      <w:start w:val="1"/>
-      <w:numFmt w:val="lowerLetter"/>
-      <w:lvlText w:val="%2)"/>
-      <w:lvlJc w:val="left"/>
-      <w:pPr>
-        <w:ind w:left="880" w:hanging="440"/>
-      </w:pPr>
-    </w:lvl>
-    <w:lvl w:ilvl="2" w:tplc="0409001B" w:tentative="1">
-      <w:start w:val="1"/>
-      <w:numFmt w:val="lowerRoman"/>
-      <w:lvlText w:val="%3."/>
-      <w:lvlJc w:val="right"/>
-      <w:pPr>
-        <w:ind w:left="1320" w:hanging="440"/>
-      </w:pPr>
-    </w:lvl>
-    <w:lvl w:ilvl="3" w:tplc="0409000F" w:tentative="1">
-      <w:start w:val="1"/>
-      <w:numFmt w:val="decimal"/>
-      <w:lvlText w:val="%4."/>
-      <w:lvlJc w:val="left"/>
-      <w:pPr>
-        <w:ind w:left="1760" w:hanging="440"/>
-      </w:pPr>
-    </w:lvl>
-    <w:lvl w:ilvl="4" w:tplc="04090019" w:tentative="1">
-      <w:start w:val="1"/>
-      <w:numFmt w:val="lowerLetter"/>
-      <w:lvlText w:val="%5)"/>
-      <w:lvlJc w:val="left"/>
-      <w:pPr>
-        <w:ind w:left="2200" w:hanging="440"/>
-      </w:pPr>
-    </w:lvl>
-    <w:lvl w:ilvl="5" w:tplc="0409001B" w:tentative="1">
-      <w:start w:val="1"/>
-      <w:numFmt w:val="lowerRoman"/>
-      <w:lvlText w:val="%6."/>
-      <w:lvlJc w:val="right"/>
-      <w:pPr>
-        <w:ind w:left="2640" w:hanging="440"/>
-      </w:pPr>
-    </w:lvl>
-    <w:lvl w:ilvl="6" w:tplc="0409000F" w:tentative="1">
-      <w:start w:val="1"/>
-      <w:numFmt w:val="decimal"/>
-      <w:lvlText w:val="%7."/>
-      <w:lvlJc w:val="left"/>
-      <w:pPr>
-        <w:ind w:left="3080" w:hanging="440"/>
-      </w:pPr>
-    </w:lvl>
-    <w:lvl w:ilvl="7" w:tplc="04090019" w:tentative="1">
-      <w:start w:val="1"/>
-      <w:numFmt w:val="lowerLetter"/>
-      <w:lvlText w:val="%8)"/>
-      <w:lvlJc w:val="left"/>
-      <w:pPr>
-        <w:ind w:left="3520" w:hanging="440"/>
-      </w:pPr>
-    </w:lvl>
-    <w:lvl w:ilvl="8" w:tplc="0409001B" w:tentative="1">
-      <w:start w:val="1"/>
-      <w:numFmt w:val="lowerRoman"/>
-      <w:lvlText w:val="%9."/>
-      <w:lvlJc w:val="right"/>
-      <w:pPr>
-        <w:ind w:left="3960" w:hanging="440"/>
-      </w:pPr>
-    </w:lvl>
-  </w:abstractNum>
-  <w:abstractNum w:abstractNumId="31" w15:restartNumberingAfterBreak="0">
-    <w:nsid w:val="492C6DAD"/>
-    <w:multiLevelType w:val="hybridMultilevel"/>
-    <w:tmpl w:val="6EEA7882"/>
-    <w:lvl w:ilvl="0" w:tplc="0409000F">
-      <w:start w:val="1"/>
-      <w:numFmt w:val="decimal"/>
-      <w:lvlText w:val="%1."/>
-      <w:lvlJc w:val="left"/>
-      <w:pPr>
-        <w:ind w:left="360" w:hanging="360"/>
-      </w:pPr>
-      <w:rPr>
-        <w:rFonts w:hint="default"/>
-      </w:rPr>
-    </w:lvl>
-    <w:lvl w:ilvl="1" w:tplc="04090019" w:tentative="1">
-      <w:start w:val="1"/>
-      <w:numFmt w:val="lowerLetter"/>
-      <w:lvlText w:val="%2."/>
-      <w:lvlJc w:val="left"/>
-      <w:pPr>
-        <w:ind w:left="1080" w:hanging="360"/>
-      </w:pPr>
-    </w:lvl>
-    <w:lvl w:ilvl="2" w:tplc="0409001B" w:tentative="1">
-      <w:start w:val="1"/>
-      <w:numFmt w:val="lowerRoman"/>
-      <w:lvlText w:val="%3."/>
-      <w:lvlJc w:val="right"/>
-      <w:pPr>
-        <w:ind w:left="1800" w:hanging="180"/>
-      </w:pPr>
-    </w:lvl>
-    <w:lvl w:ilvl="3" w:tplc="0409000F" w:tentative="1">
-      <w:start w:val="1"/>
-      <w:numFmt w:val="decimal"/>
-      <w:lvlText w:val="%4."/>
-      <w:lvlJc w:val="left"/>
-      <w:pPr>
-        <w:ind w:left="2520" w:hanging="360"/>
-      </w:pPr>
-    </w:lvl>
-    <w:lvl w:ilvl="4" w:tplc="04090019" w:tentative="1">
-      <w:start w:val="1"/>
-      <w:numFmt w:val="lowerLetter"/>
-      <w:lvlText w:val="%5."/>
-      <w:lvlJc w:val="left"/>
-      <w:pPr>
-        <w:ind w:left="3240" w:hanging="360"/>
-      </w:pPr>
-    </w:lvl>
-    <w:lvl w:ilvl="5" w:tplc="0409001B" w:tentative="1">
-      <w:start w:val="1"/>
-      <w:numFmt w:val="lowerRoman"/>
-      <w:lvlText w:val="%6."/>
-      <w:lvlJc w:val="right"/>
-      <w:pPr>
-        <w:ind w:left="3960" w:hanging="180"/>
-      </w:pPr>
-    </w:lvl>
-    <w:lvl w:ilvl="6" w:tplc="0409000F" w:tentative="1">
-      <w:start w:val="1"/>
-      <w:numFmt w:val="decimal"/>
-      <w:lvlText w:val="%7."/>
-      <w:lvlJc w:val="left"/>
-      <w:pPr>
-        <w:ind w:left="4680" w:hanging="360"/>
-      </w:pPr>
-    </w:lvl>
-    <w:lvl w:ilvl="7" w:tplc="04090019" w:tentative="1">
-      <w:start w:val="1"/>
-      <w:numFmt w:val="lowerLetter"/>
-      <w:lvlText w:val="%8."/>
-      <w:lvlJc w:val="left"/>
-      <w:pPr>
-        <w:ind w:left="5400" w:hanging="360"/>
-      </w:pPr>
-    </w:lvl>
-    <w:lvl w:ilvl="8" w:tplc="0409001B" w:tentative="1">
-      <w:start w:val="1"/>
-      <w:numFmt w:val="lowerRoman"/>
-      <w:lvlText w:val="%9."/>
-      <w:lvlJc w:val="right"/>
-      <w:pPr>
-        <w:ind w:left="6120" w:hanging="180"/>
-      </w:pPr>
-    </w:lvl>
-  </w:abstractNum>
-  <w:abstractNum w:abstractNumId="32" w15:restartNumberingAfterBreak="0">
-    <w:nsid w:val="4C226EF5"/>
-    <w:multiLevelType w:val="hybridMultilevel"/>
-    <w:tmpl w:val="DE40B6E8"/>
-    <w:lvl w:ilvl="0" w:tplc="83A86A48">
-      <w:start w:val="1"/>
-      <w:numFmt w:val="decimal"/>
-      <w:lvlText w:val="%1."/>
-      <w:lvlJc w:val="left"/>
-      <w:pPr>
-        <w:ind w:left="360" w:hanging="360"/>
-      </w:pPr>
-      <w:rPr>
-        <w:rFonts w:hint="default"/>
-      </w:rPr>
-    </w:lvl>
-    <w:lvl w:ilvl="1" w:tplc="04090019" w:tentative="1">
-      <w:start w:val="1"/>
-      <w:numFmt w:val="lowerLetter"/>
-      <w:lvlText w:val="%2)"/>
-      <w:lvlJc w:val="left"/>
-      <w:pPr>
-        <w:ind w:left="880" w:hanging="440"/>
-      </w:pPr>
-    </w:lvl>
-    <w:lvl w:ilvl="2" w:tplc="0409001B" w:tentative="1">
-      <w:start w:val="1"/>
-      <w:numFmt w:val="lowerRoman"/>
-      <w:lvlText w:val="%3."/>
-      <w:lvlJc w:val="right"/>
-      <w:pPr>
-        <w:ind w:left="1320" w:hanging="440"/>
-      </w:pPr>
-    </w:lvl>
-    <w:lvl w:ilvl="3" w:tplc="0409000F" w:tentative="1">
-      <w:start w:val="1"/>
-      <w:numFmt w:val="decimal"/>
-      <w:lvlText w:val="%4."/>
-      <w:lvlJc w:val="left"/>
-      <w:pPr>
-        <w:ind w:left="1760" w:hanging="440"/>
-      </w:pPr>
-    </w:lvl>
-    <w:lvl w:ilvl="4" w:tplc="04090019" w:tentative="1">
-      <w:start w:val="1"/>
-      <w:numFmt w:val="lowerLetter"/>
-      <w:lvlText w:val="%5)"/>
-      <w:lvlJc w:val="left"/>
-      <w:pPr>
-        <w:ind w:left="2200" w:hanging="440"/>
-      </w:pPr>
-    </w:lvl>
-    <w:lvl w:ilvl="5" w:tplc="0409001B" w:tentative="1">
-      <w:start w:val="1"/>
-      <w:numFmt w:val="lowerRoman"/>
-      <w:lvlText w:val="%6."/>
-      <w:lvlJc w:val="right"/>
-      <w:pPr>
-        <w:ind w:left="2640" w:hanging="440"/>
-      </w:pPr>
-    </w:lvl>
-    <w:lvl w:ilvl="6" w:tplc="0409000F" w:tentative="1">
-      <w:start w:val="1"/>
-      <w:numFmt w:val="decimal"/>
-      <w:lvlText w:val="%7."/>
-      <w:lvlJc w:val="left"/>
-      <w:pPr>
-        <w:ind w:left="3080" w:hanging="440"/>
-      </w:pPr>
-    </w:lvl>
-    <w:lvl w:ilvl="7" w:tplc="04090019" w:tentative="1">
-      <w:start w:val="1"/>
-      <w:numFmt w:val="lowerLetter"/>
-      <w:lvlText w:val="%8)"/>
-      <w:lvlJc w:val="left"/>
-      <w:pPr>
-        <w:ind w:left="3520" w:hanging="440"/>
-      </w:pPr>
-    </w:lvl>
-    <w:lvl w:ilvl="8" w:tplc="0409001B" w:tentative="1">
-      <w:start w:val="1"/>
-      <w:numFmt w:val="lowerRoman"/>
-      <w:lvlText w:val="%9."/>
-      <w:lvlJc w:val="right"/>
-      <w:pPr>
-        <w:ind w:left="3960" w:hanging="440"/>
-      </w:pPr>
-    </w:lvl>
-  </w:abstractNum>
-  <w:abstractNum w:abstractNumId="33" w15:restartNumberingAfterBreak="0">
-    <w:nsid w:val="4D1A1371"/>
-    <w:multiLevelType w:val="hybridMultilevel"/>
-    <w:tmpl w:val="C3E60010"/>
-    <w:lvl w:ilvl="0" w:tplc="2D9E58C4">
-      <w:start w:val="1"/>
-      <w:numFmt w:val="decimal"/>
-      <w:lvlText w:val="%1."/>
-      <w:lvlJc w:val="left"/>
-      <w:pPr>
-        <w:ind w:left="360" w:hanging="360"/>
-      </w:pPr>
-      <w:rPr>
-        <w:rFonts w:hint="default"/>
-      </w:rPr>
-    </w:lvl>
-    <w:lvl w:ilvl="1" w:tplc="04090019" w:tentative="1">
-      <w:start w:val="1"/>
-      <w:numFmt w:val="lowerLetter"/>
-      <w:lvlText w:val="%2)"/>
-      <w:lvlJc w:val="left"/>
-      <w:pPr>
-        <w:ind w:left="880" w:hanging="440"/>
-      </w:pPr>
-    </w:lvl>
-    <w:lvl w:ilvl="2" w:tplc="0409001B" w:tentative="1">
-      <w:start w:val="1"/>
-      <w:numFmt w:val="lowerRoman"/>
-      <w:lvlText w:val="%3."/>
-      <w:lvlJc w:val="right"/>
-      <w:pPr>
-        <w:ind w:left="1320" w:hanging="440"/>
-      </w:pPr>
-    </w:lvl>
-    <w:lvl w:ilvl="3" w:tplc="0409000F" w:tentative="1">
-      <w:start w:val="1"/>
-      <w:numFmt w:val="decimal"/>
-      <w:lvlText w:val="%4."/>
-      <w:lvlJc w:val="left"/>
-      <w:pPr>
-        <w:ind w:left="1760" w:hanging="440"/>
-      </w:pPr>
-    </w:lvl>
-    <w:lvl w:ilvl="4" w:tplc="04090019" w:tentative="1">
-      <w:start w:val="1"/>
-      <w:numFmt w:val="lowerLetter"/>
-      <w:lvlText w:val="%5)"/>
-      <w:lvlJc w:val="left"/>
-      <w:pPr>
-        <w:ind w:left="2200" w:hanging="440"/>
-      </w:pPr>
-    </w:lvl>
-    <w:lvl w:ilvl="5" w:tplc="0409001B" w:tentative="1">
-      <w:start w:val="1"/>
-      <w:numFmt w:val="lowerRoman"/>
-      <w:lvlText w:val="%6."/>
-      <w:lvlJc w:val="right"/>
-      <w:pPr>
-        <w:ind w:left="2640" w:hanging="440"/>
-      </w:pPr>
-    </w:lvl>
-    <w:lvl w:ilvl="6" w:tplc="0409000F" w:tentative="1">
-      <w:start w:val="1"/>
-      <w:numFmt w:val="decimal"/>
-      <w:lvlText w:val="%7."/>
-      <w:lvlJc w:val="left"/>
-      <w:pPr>
-        <w:ind w:left="3080" w:hanging="440"/>
-      </w:pPr>
-    </w:lvl>
-    <w:lvl w:ilvl="7" w:tplc="04090019" w:tentative="1">
-      <w:start w:val="1"/>
-      <w:numFmt w:val="lowerLetter"/>
-      <w:lvlText w:val="%8)"/>
-      <w:lvlJc w:val="left"/>
-      <w:pPr>
-        <w:ind w:left="3520" w:hanging="440"/>
-      </w:pPr>
-    </w:lvl>
-    <w:lvl w:ilvl="8" w:tplc="0409001B" w:tentative="1">
-      <w:start w:val="1"/>
-      <w:numFmt w:val="lowerRoman"/>
-      <w:lvlText w:val="%9."/>
-      <w:lvlJc w:val="right"/>
-      <w:pPr>
-        <w:ind w:left="3960" w:hanging="440"/>
-      </w:pPr>
-    </w:lvl>
-  </w:abstractNum>
-  <w:abstractNum w:abstractNumId="34" w15:restartNumberingAfterBreak="0">
-    <w:nsid w:val="531B7F9E"/>
-    <w:multiLevelType w:val="hybridMultilevel"/>
-    <w:tmpl w:val="15408A18"/>
-    <w:lvl w:ilvl="0" w:tplc="0409000F">
-      <w:start w:val="1"/>
-      <w:numFmt w:val="decimal"/>
-      <w:lvlText w:val="%1."/>
-      <w:lvlJc w:val="left"/>
-      <w:pPr>
-        <w:ind w:left="360" w:hanging="360"/>
-      </w:pPr>
-      <w:rPr>
-        <w:rFonts w:hint="default"/>
-      </w:rPr>
-    </w:lvl>
-    <w:lvl w:ilvl="1" w:tplc="04090019" w:tentative="1">
-      <w:start w:val="1"/>
-      <w:numFmt w:val="lowerLetter"/>
-      <w:lvlText w:val="%2."/>
-      <w:lvlJc w:val="left"/>
-      <w:pPr>
-        <w:ind w:left="1080" w:hanging="360"/>
-      </w:pPr>
-    </w:lvl>
-    <w:lvl w:ilvl="2" w:tplc="0409001B" w:tentative="1">
-      <w:start w:val="1"/>
-      <w:numFmt w:val="lowerRoman"/>
-      <w:lvlText w:val="%3."/>
-      <w:lvlJc w:val="right"/>
-      <w:pPr>
-        <w:ind w:left="1800" w:hanging="180"/>
-      </w:pPr>
-    </w:lvl>
-    <w:lvl w:ilvl="3" w:tplc="0409000F" w:tentative="1">
-      <w:start w:val="1"/>
-      <w:numFmt w:val="decimal"/>
-      <w:lvlText w:val="%4."/>
-      <w:lvlJc w:val="left"/>
-      <w:pPr>
-        <w:ind w:left="2520" w:hanging="360"/>
-      </w:pPr>
-    </w:lvl>
-    <w:lvl w:ilvl="4" w:tplc="04090019" w:tentative="1">
-      <w:start w:val="1"/>
-      <w:numFmt w:val="lowerLetter"/>
-      <w:lvlText w:val="%5."/>
-      <w:lvlJc w:val="left"/>
-      <w:pPr>
-        <w:ind w:left="3240" w:hanging="360"/>
-      </w:pPr>
-    </w:lvl>
-    <w:lvl w:ilvl="5" w:tplc="0409001B" w:tentative="1">
-      <w:start w:val="1"/>
-      <w:numFmt w:val="lowerRoman"/>
-      <w:lvlText w:val="%6."/>
-      <w:lvlJc w:val="right"/>
-      <w:pPr>
-        <w:ind w:left="3960" w:hanging="180"/>
-      </w:pPr>
-    </w:lvl>
-    <w:lvl w:ilvl="6" w:tplc="0409000F" w:tentative="1">
-      <w:start w:val="1"/>
-      <w:numFmt w:val="decimal"/>
-      <w:lvlText w:val="%7."/>
-      <w:lvlJc w:val="left"/>
-      <w:pPr>
-        <w:ind w:left="4680" w:hanging="360"/>
-      </w:pPr>
-    </w:lvl>
-    <w:lvl w:ilvl="7" w:tplc="04090019" w:tentative="1">
-      <w:start w:val="1"/>
-      <w:numFmt w:val="lowerLetter"/>
-      <w:lvlText w:val="%8."/>
-      <w:lvlJc w:val="left"/>
-      <w:pPr>
-        <w:ind w:left="5400" w:hanging="360"/>
-      </w:pPr>
-    </w:lvl>
-    <w:lvl w:ilvl="8" w:tplc="0409001B" w:tentative="1">
-      <w:start w:val="1"/>
-      <w:numFmt w:val="lowerRoman"/>
-      <w:lvlText w:val="%9."/>
-      <w:lvlJc w:val="right"/>
-      <w:pPr>
-        <w:ind w:left="6120" w:hanging="180"/>
-      </w:pPr>
-    </w:lvl>
-  </w:abstractNum>
-  <w:abstractNum w:abstractNumId="35" w15:restartNumberingAfterBreak="0">
-    <w:nsid w:val="554860FA"/>
-    <w:multiLevelType w:val="hybridMultilevel"/>
-    <w:tmpl w:val="F962BA76"/>
-    <w:lvl w:ilvl="0" w:tplc="04090001">
-      <w:start w:val="1"/>
-      <w:numFmt w:val="bullet"/>
-      <w:lvlText w:val=""/>
-      <w:lvlJc w:val="left"/>
-      <w:pPr>
-        <w:ind w:left="440" w:hanging="440"/>
-      </w:pPr>
-      <w:rPr>
-        <w:rFonts w:ascii="Wingdings" w:hAnsi="Wingdings" w:hint="default"/>
-      </w:rPr>
-    </w:lvl>
-    <w:lvl w:ilvl="1" w:tplc="04090003">
-      <w:start w:val="1"/>
-      <w:numFmt w:val="bullet"/>
-      <w:lvlText w:val=""/>
-      <w:lvlJc w:val="left"/>
-      <w:pPr>
-        <w:ind w:left="880" w:hanging="440"/>
-      </w:pPr>
-      <w:rPr>
-        <w:rFonts w:ascii="Wingdings" w:hAnsi="Wingdings" w:hint="default"/>
-      </w:rPr>
-    </w:lvl>
-    <w:lvl w:ilvl="2" w:tplc="04090005" w:tentative="1">
-      <w:start w:val="1"/>
-      <w:numFmt w:val="bullet"/>
-      <w:lvlText w:val=""/>
-      <w:lvlJc w:val="left"/>
-      <w:pPr>
-        <w:ind w:left="1320" w:hanging="440"/>
-      </w:pPr>
-      <w:rPr>
-        <w:rFonts w:ascii="Wingdings" w:hAnsi="Wingdings" w:hint="default"/>
-      </w:rPr>
-    </w:lvl>
-    <w:lvl w:ilvl="3" w:tplc="04090001" w:tentative="1">
-      <w:start w:val="1"/>
-      <w:numFmt w:val="bullet"/>
-      <w:lvlText w:val=""/>
-      <w:lvlJc w:val="left"/>
-      <w:pPr>
-        <w:ind w:left="1760" w:hanging="440"/>
-      </w:pPr>
-      <w:rPr>
-        <w:rFonts w:ascii="Wingdings" w:hAnsi="Wingdings" w:hint="default"/>
-      </w:rPr>
-    </w:lvl>
-    <w:lvl w:ilvl="4" w:tplc="04090003" w:tentative="1">
-      <w:start w:val="1"/>
-      <w:numFmt w:val="bullet"/>
-      <w:lvlText w:val=""/>
-      <w:lvlJc w:val="left"/>
-      <w:pPr>
-        <w:ind w:left="2200" w:hanging="440"/>
-      </w:pPr>
-      <w:rPr>
-        <w:rFonts w:ascii="Wingdings" w:hAnsi="Wingdings" w:hint="default"/>
-      </w:rPr>
-    </w:lvl>
-    <w:lvl w:ilvl="5" w:tplc="04090005" w:tentative="1">
-      <w:start w:val="1"/>
-      <w:numFmt w:val="bullet"/>
-      <w:lvlText w:val=""/>
-      <w:lvlJc w:val="left"/>
-      <w:pPr>
-        <w:ind w:left="2640" w:hanging="440"/>
-      </w:pPr>
-      <w:rPr>
-        <w:rFonts w:ascii="Wingdings" w:hAnsi="Wingdings" w:hint="default"/>
-      </w:rPr>
-    </w:lvl>
-    <w:lvl w:ilvl="6" w:tplc="04090001" w:tentative="1">
-      <w:start w:val="1"/>
-      <w:numFmt w:val="bullet"/>
-      <w:lvlText w:val=""/>
-      <w:lvlJc w:val="left"/>
-      <w:pPr>
-        <w:ind w:left="3080" w:hanging="440"/>
-      </w:pPr>
-      <w:rPr>
-        <w:rFonts w:ascii="Wingdings" w:hAnsi="Wingdings" w:hint="default"/>
-      </w:rPr>
-    </w:lvl>
-    <w:lvl w:ilvl="7" w:tplc="04090003" w:tentative="1">
-      <w:start w:val="1"/>
-      <w:numFmt w:val="bullet"/>
-      <w:lvlText w:val=""/>
-      <w:lvlJc w:val="left"/>
-      <w:pPr>
-        <w:ind w:left="3520" w:hanging="440"/>
-      </w:pPr>
-      <w:rPr>
-        <w:rFonts w:ascii="Wingdings" w:hAnsi="Wingdings" w:hint="default"/>
-      </w:rPr>
-    </w:lvl>
-    <w:lvl w:ilvl="8" w:tplc="04090005" w:tentative="1">
-      <w:start w:val="1"/>
-      <w:numFmt w:val="bullet"/>
-      <w:lvlText w:val=""/>
-      <w:lvlJc w:val="left"/>
-      <w:pPr>
-        <w:ind w:left="3960" w:hanging="440"/>
-      </w:pPr>
-      <w:rPr>
-        <w:rFonts w:ascii="Wingdings" w:hAnsi="Wingdings" w:hint="default"/>
-      </w:rPr>
-    </w:lvl>
-  </w:abstractNum>
-  <w:abstractNum w:abstractNumId="36" w15:restartNumberingAfterBreak="0">
-    <w:nsid w:val="5D3F102B"/>
-    <w:multiLevelType w:val="hybridMultilevel"/>
-    <w:tmpl w:val="B5003E60"/>
-    <w:lvl w:ilvl="0" w:tplc="0409000F">
-      <w:start w:val="1"/>
-      <w:numFmt w:val="decimal"/>
-      <w:lvlText w:val="%1."/>
-      <w:lvlJc w:val="left"/>
-      <w:pPr>
-        <w:ind w:left="720" w:hanging="360"/>
-      </w:pPr>
-      <w:rPr>
-        <w:rFonts w:hint="default"/>
-      </w:rPr>
-    </w:lvl>
-    <w:lvl w:ilvl="1" w:tplc="04090019" w:tentative="1">
-      <w:start w:val="1"/>
-      <w:numFmt w:val="lowerLetter"/>
-      <w:lvlText w:val="%2."/>
-      <w:lvlJc w:val="left"/>
-      <w:pPr>
-        <w:ind w:left="1440" w:hanging="360"/>
-      </w:pPr>
-    </w:lvl>
-    <w:lvl w:ilvl="2" w:tplc="0409001B" w:tentative="1">
-      <w:start w:val="1"/>
-      <w:numFmt w:val="lowerRoman"/>
-      <w:lvlText w:val="%3."/>
-      <w:lvlJc w:val="right"/>
-      <w:pPr>
-        <w:ind w:left="2160" w:hanging="180"/>
-      </w:pPr>
-    </w:lvl>
-    <w:lvl w:ilvl="3" w:tplc="0409000F" w:tentative="1">
-      <w:start w:val="1"/>
-      <w:numFmt w:val="decimal"/>
-      <w:lvlText w:val="%4."/>
-      <w:lvlJc w:val="left"/>
-      <w:pPr>
-        <w:ind w:left="2880" w:hanging="360"/>
-      </w:pPr>
-    </w:lvl>
-    <w:lvl w:ilvl="4" w:tplc="04090019" w:tentative="1">
-      <w:start w:val="1"/>
-      <w:numFmt w:val="lowerLetter"/>
-      <w:lvlText w:val="%5."/>
-      <w:lvlJc w:val="left"/>
-      <w:pPr>
-        <w:ind w:left="3600" w:hanging="360"/>
-      </w:pPr>
-    </w:lvl>
-    <w:lvl w:ilvl="5" w:tplc="0409001B" w:tentative="1">
-      <w:start w:val="1"/>
-      <w:numFmt w:val="lowerRoman"/>
-      <w:lvlText w:val="%6."/>
-      <w:lvlJc w:val="right"/>
-      <w:pPr>
-        <w:ind w:left="4320" w:hanging="180"/>
-      </w:pPr>
-    </w:lvl>
-    <w:lvl w:ilvl="6" w:tplc="0409000F" w:tentative="1">
-      <w:start w:val="1"/>
-      <w:numFmt w:val="decimal"/>
-      <w:lvlText w:val="%7."/>
-      <w:lvlJc w:val="left"/>
-      <w:pPr>
-        <w:ind w:left="5040" w:hanging="360"/>
-      </w:pPr>
-    </w:lvl>
-    <w:lvl w:ilvl="7" w:tplc="04090019" w:tentative="1">
-      <w:start w:val="1"/>
-      <w:numFmt w:val="lowerLetter"/>
-      <w:lvlText w:val="%8."/>
-      <w:lvlJc w:val="left"/>
-      <w:pPr>
-        <w:ind w:left="5760" w:hanging="360"/>
-      </w:pPr>
-    </w:lvl>
-    <w:lvl w:ilvl="8" w:tplc="0409001B" w:tentative="1">
-      <w:start w:val="1"/>
-      <w:numFmt w:val="lowerRoman"/>
-      <w:lvlText w:val="%9."/>
-      <w:lvlJc w:val="right"/>
-      <w:pPr>
-        <w:ind w:left="6480" w:hanging="180"/>
-      </w:pPr>
-    </w:lvl>
-  </w:abstractNum>
-  <w:abstractNum w:abstractNumId="37" w15:restartNumberingAfterBreak="0">
-    <w:nsid w:val="5E203035"/>
-    <w:multiLevelType w:val="hybridMultilevel"/>
-    <w:tmpl w:val="1A50CB28"/>
-    <w:lvl w:ilvl="0" w:tplc="4852FAB8">
-      <w:numFmt w:val="bullet"/>
-      <w:lvlText w:val=""/>
-      <w:lvlJc w:val="left"/>
-      <w:pPr>
-        <w:ind w:left="360" w:hanging="360"/>
-      </w:pPr>
-      <w:rPr>
-        <w:rFonts w:ascii="Wingdings" w:eastAsiaTheme="minorEastAsia" w:hAnsi="Wingdings" w:cstheme="minorBidi" w:hint="default"/>
-      </w:rPr>
-    </w:lvl>
-    <w:lvl w:ilvl="1" w:tplc="04090003" w:tentative="1">
-      <w:start w:val="1"/>
-      <w:numFmt w:val="bullet"/>
-      <w:lvlText w:val=""/>
-      <w:lvlJc w:val="left"/>
-      <w:pPr>
-        <w:ind w:left="880" w:hanging="440"/>
-      </w:pPr>
-      <w:rPr>
-        <w:rFonts w:ascii="Wingdings" w:hAnsi="Wingdings" w:hint="default"/>
-      </w:rPr>
-    </w:lvl>
-    <w:lvl w:ilvl="2" w:tplc="04090005" w:tentative="1">
-      <w:start w:val="1"/>
-      <w:numFmt w:val="bullet"/>
-      <w:lvlText w:val=""/>
-      <w:lvlJc w:val="left"/>
-      <w:pPr>
-        <w:ind w:left="1320" w:hanging="440"/>
-      </w:pPr>
-      <w:rPr>
-        <w:rFonts w:ascii="Wingdings" w:hAnsi="Wingdings" w:hint="default"/>
-      </w:rPr>
-    </w:lvl>
-    <w:lvl w:ilvl="3" w:tplc="04090001" w:tentative="1">
-      <w:start w:val="1"/>
-      <w:numFmt w:val="bullet"/>
-      <w:lvlText w:val=""/>
-      <w:lvlJc w:val="left"/>
-      <w:pPr>
-        <w:ind w:left="1760" w:hanging="440"/>
-      </w:pPr>
-      <w:rPr>
-        <w:rFonts w:ascii="Wingdings" w:hAnsi="Wingdings" w:hint="default"/>
-      </w:rPr>
-    </w:lvl>
-    <w:lvl w:ilvl="4" w:tplc="04090003" w:tentative="1">
-      <w:start w:val="1"/>
-      <w:numFmt w:val="bullet"/>
-      <w:lvlText w:val=""/>
-      <w:lvlJc w:val="left"/>
-      <w:pPr>
-        <w:ind w:left="2200" w:hanging="440"/>
-      </w:pPr>
-      <w:rPr>
-        <w:rFonts w:ascii="Wingdings" w:hAnsi="Wingdings" w:hint="default"/>
-      </w:rPr>
-    </w:lvl>
-    <w:lvl w:ilvl="5" w:tplc="04090005" w:tentative="1">
-      <w:start w:val="1"/>
-      <w:numFmt w:val="bullet"/>
-      <w:lvlText w:val=""/>
-      <w:lvlJc w:val="left"/>
-      <w:pPr>
-        <w:ind w:left="2640" w:hanging="440"/>
-      </w:pPr>
-      <w:rPr>
-        <w:rFonts w:ascii="Wingdings" w:hAnsi="Wingdings" w:hint="default"/>
-      </w:rPr>
-    </w:lvl>
-    <w:lvl w:ilvl="6" w:tplc="04090001" w:tentative="1">
-      <w:start w:val="1"/>
-      <w:numFmt w:val="bullet"/>
-      <w:lvlText w:val=""/>
-      <w:lvlJc w:val="left"/>
-      <w:pPr>
-        <w:ind w:left="3080" w:hanging="440"/>
-      </w:pPr>
-      <w:rPr>
-        <w:rFonts w:ascii="Wingdings" w:hAnsi="Wingdings" w:hint="default"/>
-      </w:rPr>
-    </w:lvl>
-    <w:lvl w:ilvl="7" w:tplc="04090003" w:tentative="1">
-      <w:start w:val="1"/>
-      <w:numFmt w:val="bullet"/>
-      <w:lvlText w:val=""/>
-      <w:lvlJc w:val="left"/>
-      <w:pPr>
-        <w:ind w:left="3520" w:hanging="440"/>
-      </w:pPr>
-      <w:rPr>
-        <w:rFonts w:ascii="Wingdings" w:hAnsi="Wingdings" w:hint="default"/>
-      </w:rPr>
-    </w:lvl>
-    <w:lvl w:ilvl="8" w:tplc="04090005" w:tentative="1">
-      <w:start w:val="1"/>
-      <w:numFmt w:val="bullet"/>
-      <w:lvlText w:val=""/>
-      <w:lvlJc w:val="left"/>
-      <w:pPr>
-        <w:ind w:left="3960" w:hanging="440"/>
-      </w:pPr>
-      <w:rPr>
-        <w:rFonts w:ascii="Wingdings" w:hAnsi="Wingdings" w:hint="default"/>
-      </w:rPr>
-    </w:lvl>
-  </w:abstractNum>
-  <w:abstractNum w:abstractNumId="38" w15:restartNumberingAfterBreak="0">
+  <w:abstractNum w:abstractNumId="8" w15:restartNumberingAfterBreak="0">
     <w:nsid w:val="5F2E40FD"/>
     <w:multiLevelType w:val="hybridMultilevel"/>
     <w:tmpl w:val="906CF564"/>
@@ -10187,96 +7208,7 @@
       </w:rPr>
     </w:lvl>
   </w:abstractNum>
-  <w:abstractNum w:abstractNumId="39" w15:restartNumberingAfterBreak="0">
-    <w:nsid w:val="635320EE"/>
-    <w:multiLevelType w:val="hybridMultilevel"/>
-    <w:tmpl w:val="3C10B552"/>
-    <w:lvl w:ilvl="0" w:tplc="8E90D790">
-      <w:start w:val="1"/>
-      <w:numFmt w:val="decimal"/>
-      <w:lvlText w:val="%1."/>
-      <w:lvlJc w:val="left"/>
-      <w:pPr>
-        <w:ind w:left="360" w:hanging="360"/>
-      </w:pPr>
-      <w:rPr>
-        <w:rFonts w:hint="default"/>
-      </w:rPr>
-    </w:lvl>
-    <w:lvl w:ilvl="1" w:tplc="04090019" w:tentative="1">
-      <w:start w:val="1"/>
-      <w:numFmt w:val="lowerLetter"/>
-      <w:lvlText w:val="%2)"/>
-      <w:lvlJc w:val="left"/>
-      <w:pPr>
-        <w:ind w:left="880" w:hanging="440"/>
-      </w:pPr>
-    </w:lvl>
-    <w:lvl w:ilvl="2" w:tplc="0409001B" w:tentative="1">
-      <w:start w:val="1"/>
-      <w:numFmt w:val="lowerRoman"/>
-      <w:lvlText w:val="%3."/>
-      <w:lvlJc w:val="right"/>
-      <w:pPr>
-        <w:ind w:left="1320" w:hanging="440"/>
-      </w:pPr>
-    </w:lvl>
-    <w:lvl w:ilvl="3" w:tplc="0409000F" w:tentative="1">
-      <w:start w:val="1"/>
-      <w:numFmt w:val="decimal"/>
-      <w:lvlText w:val="%4."/>
-      <w:lvlJc w:val="left"/>
-      <w:pPr>
-        <w:ind w:left="1760" w:hanging="440"/>
-      </w:pPr>
-    </w:lvl>
-    <w:lvl w:ilvl="4" w:tplc="04090019" w:tentative="1">
-      <w:start w:val="1"/>
-      <w:numFmt w:val="lowerLetter"/>
-      <w:lvlText w:val="%5)"/>
-      <w:lvlJc w:val="left"/>
-      <w:pPr>
-        <w:ind w:left="2200" w:hanging="440"/>
-      </w:pPr>
-    </w:lvl>
-    <w:lvl w:ilvl="5" w:tplc="0409001B" w:tentative="1">
-      <w:start w:val="1"/>
-      <w:numFmt w:val="lowerRoman"/>
-      <w:lvlText w:val="%6."/>
-      <w:lvlJc w:val="right"/>
-      <w:pPr>
-        <w:ind w:left="2640" w:hanging="440"/>
-      </w:pPr>
-    </w:lvl>
-    <w:lvl w:ilvl="6" w:tplc="0409000F" w:tentative="1">
-      <w:start w:val="1"/>
-      <w:numFmt w:val="decimal"/>
-      <w:lvlText w:val="%7."/>
-      <w:lvlJc w:val="left"/>
-      <w:pPr>
-        <w:ind w:left="3080" w:hanging="440"/>
-      </w:pPr>
-    </w:lvl>
-    <w:lvl w:ilvl="7" w:tplc="04090019" w:tentative="1">
-      <w:start w:val="1"/>
-      <w:numFmt w:val="lowerLetter"/>
-      <w:lvlText w:val="%8)"/>
-      <w:lvlJc w:val="left"/>
-      <w:pPr>
-        <w:ind w:left="3520" w:hanging="440"/>
-      </w:pPr>
-    </w:lvl>
-    <w:lvl w:ilvl="8" w:tplc="0409001B" w:tentative="1">
-      <w:start w:val="1"/>
-      <w:numFmt w:val="lowerRoman"/>
-      <w:lvlText w:val="%9."/>
-      <w:lvlJc w:val="right"/>
-      <w:pPr>
-        <w:ind w:left="3960" w:hanging="440"/>
-      </w:pPr>
-    </w:lvl>
-  </w:abstractNum>
-  <w:abstractNum w:abstractNumId="40" w15:restartNumberingAfterBreak="0">
+  <w:abstractNum w:abstractNumId="9" w15:restartNumberingAfterBreak="0">
     <w:nsid w:val="64816DAA"/>
     <w:multiLevelType w:val="hybridMultilevel"/>
     <w:tmpl w:val="A33223C4"/>
@@ -10365,297 +7297,7 @@
       </w:pPr>
     </w:lvl>
   </w:abstractNum>
-  <w:abstractNum w:abstractNumId="41" w15:restartNumberingAfterBreak="0">
-    <w:nsid w:val="65506ECC"/>
-    <w:multiLevelType w:val="hybridMultilevel"/>
-    <w:tmpl w:val="7B700692"/>
-    <w:lvl w:ilvl="0" w:tplc="475E3DCE">
-      <w:numFmt w:val="bullet"/>
-      <w:lvlText w:val=""/>
-      <w:lvlJc w:val="left"/>
-      <w:pPr>
-        <w:ind w:left="360" w:hanging="360"/>
-      </w:pPr>
-      <w:rPr>
-        <w:rFonts w:ascii="Wingdings" w:eastAsiaTheme="minorEastAsia" w:hAnsi="Wingdings" w:cstheme="minorBidi" w:hint="default"/>
-      </w:rPr>
-    </w:lvl>
-    <w:lvl w:ilvl="1" w:tplc="04090003" w:tentative="1">
-      <w:start w:val="1"/>
-      <w:numFmt w:val="bullet"/>
-      <w:lvlText w:val=""/>
-      <w:lvlJc w:val="left"/>
-      <w:pPr>
-        <w:ind w:left="880" w:hanging="440"/>
-      </w:pPr>
-      <w:rPr>
-        <w:rFonts w:ascii="Wingdings" w:hAnsi="Wingdings" w:hint="default"/>
-      </w:rPr>
-    </w:lvl>
-    <w:lvl w:ilvl="2" w:tplc="04090005" w:tentative="1">
-      <w:start w:val="1"/>
-      <w:numFmt w:val="bullet"/>
-      <w:lvlText w:val=""/>
-      <w:lvlJc w:val="left"/>
-      <w:pPr>
-        <w:ind w:left="1320" w:hanging="440"/>
-      </w:pPr>
-      <w:rPr>
-        <w:rFonts w:ascii="Wingdings" w:hAnsi="Wingdings" w:hint="default"/>
-      </w:rPr>
-    </w:lvl>
-    <w:lvl w:ilvl="3" w:tplc="04090001" w:tentative="1">
-      <w:start w:val="1"/>
-      <w:numFmt w:val="bullet"/>
-      <w:lvlText w:val=""/>
-      <w:lvlJc w:val="left"/>
-      <w:pPr>
-        <w:ind w:left="1760" w:hanging="440"/>
-      </w:pPr>
-      <w:rPr>
-        <w:rFonts w:ascii="Wingdings" w:hAnsi="Wingdings" w:hint="default"/>
-      </w:rPr>
-    </w:lvl>
-    <w:lvl w:ilvl="4" w:tplc="04090003" w:tentative="1">
-      <w:start w:val="1"/>
-      <w:numFmt w:val="bullet"/>
-      <w:lvlText w:val=""/>
-      <w:lvlJc w:val="left"/>
-      <w:pPr>
-        <w:ind w:left="2200" w:hanging="440"/>
-      </w:pPr>
-      <w:rPr>
-        <w:rFonts w:ascii="Wingdings" w:hAnsi="Wingdings" w:hint="default"/>
-      </w:rPr>
-    </w:lvl>
-    <w:lvl w:ilvl="5" w:tplc="04090005" w:tentative="1">
-      <w:start w:val="1"/>
-      <w:numFmt w:val="bullet"/>
-      <w:lvlText w:val=""/>
-      <w:lvlJc w:val="left"/>
-      <w:pPr>
-        <w:ind w:left="2640" w:hanging="440"/>
-      </w:pPr>
-      <w:rPr>
-        <w:rFonts w:ascii="Wingdings" w:hAnsi="Wingdings" w:hint="default"/>
-      </w:rPr>
-    </w:lvl>
-    <w:lvl w:ilvl="6" w:tplc="04090001" w:tentative="1">
-      <w:start w:val="1"/>
-      <w:numFmt w:val="bullet"/>
-      <w:lvlText w:val=""/>
-      <w:lvlJc w:val="left"/>
-      <w:pPr>
-        <w:ind w:left="3080" w:hanging="440"/>
-      </w:pPr>
-      <w:rPr>
-        <w:rFonts w:ascii="Wingdings" w:hAnsi="Wingdings" w:hint="default"/>
-      </w:rPr>
-    </w:lvl>
-    <w:lvl w:ilvl="7" w:tplc="04090003" w:tentative="1">
-      <w:start w:val="1"/>
-      <w:numFmt w:val="bullet"/>
-      <w:lvlText w:val=""/>
-      <w:lvlJc w:val="left"/>
-      <w:pPr>
-        <w:ind w:left="3520" w:hanging="440"/>
-      </w:pPr>
-      <w:rPr>
-        <w:rFonts w:ascii="Wingdings" w:hAnsi="Wingdings" w:hint="default"/>
-      </w:rPr>
-    </w:lvl>
-    <w:lvl w:ilvl="8" w:tplc="04090005" w:tentative="1">
-      <w:start w:val="1"/>
-      <w:numFmt w:val="bullet"/>
-      <w:lvlText w:val=""/>
-      <w:lvlJc w:val="left"/>
-      <w:pPr>
-        <w:ind w:left="3960" w:hanging="440"/>
-      </w:pPr>
-      <w:rPr>
-        <w:rFonts w:ascii="Wingdings" w:hAnsi="Wingdings" w:hint="default"/>
-      </w:rPr>
-    </w:lvl>
-  </w:abstractNum>
-  <w:abstractNum w:abstractNumId="42" w15:restartNumberingAfterBreak="0">
-    <w:nsid w:val="666634EB"/>
-    <w:multiLevelType w:val="hybridMultilevel"/>
-    <w:tmpl w:val="FA0ADCCC"/>
-    <w:lvl w:ilvl="0" w:tplc="7ECCF00E">
-      <w:start w:val="1"/>
-      <w:numFmt w:val="decimal"/>
-      <w:lvlText w:val="%1."/>
-      <w:lvlJc w:val="left"/>
-      <w:pPr>
-        <w:ind w:left="360" w:hanging="360"/>
-      </w:pPr>
-      <w:rPr>
-        <w:rFonts w:hint="default"/>
-      </w:rPr>
-    </w:lvl>
-    <w:lvl w:ilvl="1" w:tplc="04090019" w:tentative="1">
-      <w:start w:val="1"/>
-      <w:numFmt w:val="lowerLetter"/>
-      <w:lvlText w:val="%2)"/>
-      <w:lvlJc w:val="left"/>
-      <w:pPr>
-        <w:ind w:left="880" w:hanging="440"/>
-      </w:pPr>
-    </w:lvl>
-    <w:lvl w:ilvl="2" w:tplc="0409001B" w:tentative="1">
-      <w:start w:val="1"/>
-      <w:numFmt w:val="lowerRoman"/>
-      <w:lvlText w:val="%3."/>
-      <w:lvlJc w:val="right"/>
-      <w:pPr>
-        <w:ind w:left="1320" w:hanging="440"/>
-      </w:pPr>
-    </w:lvl>
-    <w:lvl w:ilvl="3" w:tplc="0409000F" w:tentative="1">
-      <w:start w:val="1"/>
-      <w:numFmt w:val="decimal"/>
-      <w:lvlText w:val="%4."/>
-      <w:lvlJc w:val="left"/>
-      <w:pPr>
-        <w:ind w:left="1760" w:hanging="440"/>
-      </w:pPr>
-    </w:lvl>
-    <w:lvl w:ilvl="4" w:tplc="04090019" w:tentative="1">
-      <w:start w:val="1"/>
-      <w:numFmt w:val="lowerLetter"/>
-      <w:lvlText w:val="%5)"/>
-      <w:lvlJc w:val="left"/>
-      <w:pPr>
-        <w:ind w:left="2200" w:hanging="440"/>
-      </w:pPr>
-    </w:lvl>
-    <w:lvl w:ilvl="5" w:tplc="0409001B" w:tentative="1">
-      <w:start w:val="1"/>
-      <w:numFmt w:val="lowerRoman"/>
-      <w:lvlText w:val="%6."/>
-      <w:lvlJc w:val="right"/>
-      <w:pPr>
-        <w:ind w:left="2640" w:hanging="440"/>
-      </w:pPr>
-    </w:lvl>
-    <w:lvl w:ilvl="6" w:tplc="0409000F" w:tentative="1">
-      <w:start w:val="1"/>
-      <w:numFmt w:val="decimal"/>
-      <w:lvlText w:val="%7."/>
-      <w:lvlJc w:val="left"/>
-      <w:pPr>
-        <w:ind w:left="3080" w:hanging="440"/>
-      </w:pPr>
-    </w:lvl>
-    <w:lvl w:ilvl="7" w:tplc="04090019" w:tentative="1">
-      <w:start w:val="1"/>
-      <w:numFmt w:val="lowerLetter"/>
-      <w:lvlText w:val="%8)"/>
-      <w:lvlJc w:val="left"/>
-      <w:pPr>
-        <w:ind w:left="3520" w:hanging="440"/>
-      </w:pPr>
-    </w:lvl>
-    <w:lvl w:ilvl="8" w:tplc="0409001B" w:tentative="1">
-      <w:start w:val="1"/>
-      <w:numFmt w:val="lowerRoman"/>
-      <w:lvlText w:val="%9."/>
-      <w:lvlJc w:val="right"/>
-      <w:pPr>
-        <w:ind w:left="3960" w:hanging="440"/>
-      </w:pPr>
-    </w:lvl>
-  </w:abstractNum>
-  <w:abstractNum w:abstractNumId="43" w15:restartNumberingAfterBreak="0">
-    <w:nsid w:val="6A255096"/>
-    <w:multiLevelType w:val="hybridMultilevel"/>
-    <w:tmpl w:val="99A03CEE"/>
-    <w:lvl w:ilvl="0" w:tplc="0409000F">
-      <w:start w:val="1"/>
-      <w:numFmt w:val="decimal"/>
-      <w:lvlText w:val="%1."/>
-      <w:lvlJc w:val="left"/>
-      <w:pPr>
-        <w:ind w:left="720" w:hanging="360"/>
-      </w:pPr>
-      <w:rPr>
-        <w:rFonts w:hint="default"/>
-      </w:rPr>
-    </w:lvl>
-    <w:lvl w:ilvl="1" w:tplc="04090019" w:tentative="1">
-      <w:start w:val="1"/>
-      <w:numFmt w:val="lowerLetter"/>
-      <w:lvlText w:val="%2."/>
-      <w:lvlJc w:val="left"/>
-      <w:pPr>
-        <w:ind w:left="1440" w:hanging="360"/>
-      </w:pPr>
-    </w:lvl>
-    <w:lvl w:ilvl="2" w:tplc="0409001B" w:tentative="1">
-      <w:start w:val="1"/>
-      <w:numFmt w:val="lowerRoman"/>
-      <w:lvlText w:val="%3."/>
-      <w:lvlJc w:val="right"/>
-      <w:pPr>
-        <w:ind w:left="2160" w:hanging="180"/>
-      </w:pPr>
-    </w:lvl>
-    <w:lvl w:ilvl="3" w:tplc="0409000F" w:tentative="1">
-      <w:start w:val="1"/>
-      <w:numFmt w:val="decimal"/>
-      <w:lvlText w:val="%4."/>
-      <w:lvlJc w:val="left"/>
-      <w:pPr>
-        <w:ind w:left="2880" w:hanging="360"/>
-      </w:pPr>
-    </w:lvl>
-    <w:lvl w:ilvl="4" w:tplc="04090019" w:tentative="1">
-      <w:start w:val="1"/>
-      <w:numFmt w:val="lowerLetter"/>
-      <w:lvlText w:val="%5."/>
-      <w:lvlJc w:val="left"/>
-      <w:pPr>
-        <w:ind w:left="3600" w:hanging="360"/>
-      </w:pPr>
-    </w:lvl>
-    <w:lvl w:ilvl="5" w:tplc="0409001B" w:tentative="1">
-      <w:start w:val="1"/>
-      <w:numFmt w:val="lowerRoman"/>
-      <w:lvlText w:val="%6."/>
-      <w:lvlJc w:val="right"/>
-      <w:pPr>
-        <w:ind w:left="4320" w:hanging="180"/>
-      </w:pPr>
-    </w:lvl>
-    <w:lvl w:ilvl="6" w:tplc="0409000F" w:tentative="1">
-      <w:start w:val="1"/>
-      <w:numFmt w:val="decimal"/>
-      <w:lvlText w:val="%7."/>
-      <w:lvlJc w:val="left"/>
-      <w:pPr>
-        <w:ind w:left="5040" w:hanging="360"/>
-      </w:pPr>
-    </w:lvl>
-    <w:lvl w:ilvl="7" w:tplc="04090019" w:tentative="1">
-      <w:start w:val="1"/>
-      <w:numFmt w:val="lowerLetter"/>
-      <w:lvlText w:val="%8."/>
-      <w:lvlJc w:val="left"/>
-      <w:pPr>
-        <w:ind w:left="5760" w:hanging="360"/>
-      </w:pPr>
-    </w:lvl>
-    <w:lvl w:ilvl="8" w:tplc="0409001B" w:tentative="1">
-      <w:start w:val="1"/>
-      <w:numFmt w:val="lowerRoman"/>
-      <w:lvlText w:val="%9."/>
-      <w:lvlJc w:val="right"/>
-      <w:pPr>
-        <w:ind w:left="6480" w:hanging="180"/>
-      </w:pPr>
-    </w:lvl>
-  </w:abstractNum>
-  <w:abstractNum w:abstractNumId="44" w15:restartNumberingAfterBreak="0">
+  <w:abstractNum w:abstractNumId="10" w15:restartNumberingAfterBreak="0">
     <w:nsid w:val="6A7F4B5D"/>
     <w:multiLevelType w:val="multilevel"/>
     <w:tmpl w:val="EE4EE644"/>
@@ -10768,1087 +7410,8 @@
       </w:pPr>
     </w:lvl>
   </w:abstractNum>
-  <w:abstractNum w:abstractNumId="45" w15:restartNumberingAfterBreak="0">
-    <w:nsid w:val="6B6F4067"/>
-    <w:multiLevelType w:val="multilevel"/>
-    <w:tmpl w:val="FEAC8FB0"/>
-    <w:lvl w:ilvl="0">
-      <w:start w:val="1"/>
-      <w:numFmt w:val="decimal"/>
-      <w:lvlText w:val="%1."/>
-      <w:lvlJc w:val="left"/>
-      <w:pPr>
-        <w:tabs>
-          <w:tab w:val="num" w:pos="360"/>
-        </w:tabs>
-        <w:ind w:left="360" w:hanging="360"/>
-      </w:pPr>
-    </w:lvl>
-    <w:lvl w:ilvl="1" w:tentative="1">
-      <w:start w:val="1"/>
-      <w:numFmt w:val="decimal"/>
-      <w:lvlText w:val="%2."/>
-      <w:lvlJc w:val="left"/>
-      <w:pPr>
-        <w:tabs>
-          <w:tab w:val="num" w:pos="1080"/>
-        </w:tabs>
-        <w:ind w:left="1080" w:hanging="360"/>
-      </w:pPr>
-    </w:lvl>
-    <w:lvl w:ilvl="2" w:tentative="1">
-      <w:start w:val="1"/>
-      <w:numFmt w:val="decimal"/>
-      <w:lvlText w:val="%3."/>
-      <w:lvlJc w:val="left"/>
-      <w:pPr>
-        <w:tabs>
-          <w:tab w:val="num" w:pos="1800"/>
-        </w:tabs>
-        <w:ind w:left="1800" w:hanging="360"/>
-      </w:pPr>
-    </w:lvl>
-    <w:lvl w:ilvl="3" w:tentative="1">
-      <w:start w:val="1"/>
-      <w:numFmt w:val="decimal"/>
-      <w:lvlText w:val="%4."/>
-      <w:lvlJc w:val="left"/>
-      <w:pPr>
-        <w:tabs>
-          <w:tab w:val="num" w:pos="2520"/>
-        </w:tabs>
-        <w:ind w:left="2520" w:hanging="360"/>
-      </w:pPr>
-    </w:lvl>
-    <w:lvl w:ilvl="4" w:tentative="1">
-      <w:start w:val="1"/>
-      <w:numFmt w:val="decimal"/>
-      <w:lvlText w:val="%5."/>
-      <w:lvlJc w:val="left"/>
-      <w:pPr>
-        <w:tabs>
-          <w:tab w:val="num" w:pos="3240"/>
-        </w:tabs>
-        <w:ind w:left="3240" w:hanging="360"/>
-      </w:pPr>
-    </w:lvl>
-    <w:lvl w:ilvl="5" w:tentative="1">
-      <w:start w:val="1"/>
-      <w:numFmt w:val="decimal"/>
-      <w:lvlText w:val="%6."/>
-      <w:lvlJc w:val="left"/>
-      <w:pPr>
-        <w:tabs>
-          <w:tab w:val="num" w:pos="3960"/>
-        </w:tabs>
-        <w:ind w:left="3960" w:hanging="360"/>
-      </w:pPr>
-    </w:lvl>
-    <w:lvl w:ilvl="6" w:tentative="1">
-      <w:start w:val="1"/>
-      <w:numFmt w:val="decimal"/>
-      <w:lvlText w:val="%7."/>
-      <w:lvlJc w:val="left"/>
-      <w:pPr>
-        <w:tabs>
-          <w:tab w:val="num" w:pos="4680"/>
-        </w:tabs>
-        <w:ind w:left="4680" w:hanging="360"/>
-      </w:pPr>
-    </w:lvl>
-    <w:lvl w:ilvl="7" w:tentative="1">
-      <w:start w:val="1"/>
-      <w:numFmt w:val="decimal"/>
-      <w:lvlText w:val="%8."/>
-      <w:lvlJc w:val="left"/>
-      <w:pPr>
-        <w:tabs>
-          <w:tab w:val="num" w:pos="5400"/>
-        </w:tabs>
-        <w:ind w:left="5400" w:hanging="360"/>
-      </w:pPr>
-    </w:lvl>
-    <w:lvl w:ilvl="8" w:tentative="1">
-      <w:start w:val="1"/>
-      <w:numFmt w:val="decimal"/>
-      <w:lvlText w:val="%9."/>
-      <w:lvlJc w:val="left"/>
-      <w:pPr>
-        <w:tabs>
-          <w:tab w:val="num" w:pos="6120"/>
-        </w:tabs>
-        <w:ind w:left="6120" w:hanging="360"/>
-      </w:pPr>
-    </w:lvl>
-  </w:abstractNum>
-  <w:abstractNum w:abstractNumId="46" w15:restartNumberingAfterBreak="0">
-    <w:nsid w:val="6F3D4329"/>
-    <w:multiLevelType w:val="multilevel"/>
-    <w:tmpl w:val="76645634"/>
-    <w:lvl w:ilvl="0">
-      <w:start w:val="1"/>
-      <w:numFmt w:val="bullet"/>
-      <w:lvlText w:val=""/>
-      <w:lvlJc w:val="left"/>
-      <w:pPr>
-        <w:tabs>
-          <w:tab w:val="num" w:pos="360"/>
-        </w:tabs>
-        <w:ind w:left="360" w:hanging="360"/>
-      </w:pPr>
-      <w:rPr>
-        <w:rFonts w:ascii="Symbol" w:hAnsi="Symbol" w:hint="default"/>
-        <w:sz w:val="20"/>
-      </w:rPr>
-    </w:lvl>
-    <w:lvl w:ilvl="1" w:tentative="1">
-      <w:start w:val="1"/>
-      <w:numFmt w:val="bullet"/>
-      <w:lvlText w:val=""/>
-      <w:lvlJc w:val="left"/>
-      <w:pPr>
-        <w:tabs>
-          <w:tab w:val="num" w:pos="1080"/>
-        </w:tabs>
-        <w:ind w:left="1080" w:hanging="360"/>
-      </w:pPr>
-      <w:rPr>
-        <w:rFonts w:ascii="Symbol" w:hAnsi="Symbol" w:hint="default"/>
-        <w:sz w:val="20"/>
-      </w:rPr>
-    </w:lvl>
-    <w:lvl w:ilvl="2" w:tentative="1">
-      <w:start w:val="1"/>
-      <w:numFmt w:val="bullet"/>
-      <w:lvlText w:val=""/>
-      <w:lvlJc w:val="left"/>
-      <w:pPr>
-        <w:tabs>
-          <w:tab w:val="num" w:pos="1800"/>
-        </w:tabs>
-        <w:ind w:left="1800" w:hanging="360"/>
-      </w:pPr>
-      <w:rPr>
-        <w:rFonts w:ascii="Symbol" w:hAnsi="Symbol" w:hint="default"/>
-        <w:sz w:val="20"/>
-      </w:rPr>
-    </w:lvl>
-    <w:lvl w:ilvl="3" w:tentative="1">
-      <w:start w:val="1"/>
-      <w:numFmt w:val="bullet"/>
-      <w:lvlText w:val=""/>
-      <w:lvlJc w:val="left"/>
-      <w:pPr>
-        <w:tabs>
-          <w:tab w:val="num" w:pos="2520"/>
-        </w:tabs>
-        <w:ind w:left="2520" w:hanging="360"/>
-      </w:pPr>
-      <w:rPr>
-        <w:rFonts w:ascii="Symbol" w:hAnsi="Symbol" w:hint="default"/>
-        <w:sz w:val="20"/>
-      </w:rPr>
-    </w:lvl>
-    <w:lvl w:ilvl="4" w:tentative="1">
-      <w:start w:val="1"/>
-      <w:numFmt w:val="bullet"/>
-      <w:lvlText w:val=""/>
-      <w:lvlJc w:val="left"/>
-      <w:pPr>
-        <w:tabs>
-          <w:tab w:val="num" w:pos="3240"/>
-        </w:tabs>
-        <w:ind w:left="3240" w:hanging="360"/>
-      </w:pPr>
-      <w:rPr>
-        <w:rFonts w:ascii="Symbol" w:hAnsi="Symbol" w:hint="default"/>
-        <w:sz w:val="20"/>
-      </w:rPr>
-    </w:lvl>
-    <w:lvl w:ilvl="5" w:tentative="1">
-      <w:start w:val="1"/>
-      <w:numFmt w:val="bullet"/>
-      <w:lvlText w:val=""/>
-      <w:lvlJc w:val="left"/>
-      <w:pPr>
-        <w:tabs>
-          <w:tab w:val="num" w:pos="3960"/>
-        </w:tabs>
-        <w:ind w:left="3960" w:hanging="360"/>
-      </w:pPr>
-      <w:rPr>
-        <w:rFonts w:ascii="Symbol" w:hAnsi="Symbol" w:hint="default"/>
-        <w:sz w:val="20"/>
-      </w:rPr>
-    </w:lvl>
-    <w:lvl w:ilvl="6" w:tentative="1">
-      <w:start w:val="1"/>
-      <w:numFmt w:val="bullet"/>
-      <w:lvlText w:val=""/>
-      <w:lvlJc w:val="left"/>
-      <w:pPr>
-        <w:tabs>
-          <w:tab w:val="num" w:pos="4680"/>
-        </w:tabs>
-        <w:ind w:left="4680" w:hanging="360"/>
-      </w:pPr>
-      <w:rPr>
-        <w:rFonts w:ascii="Symbol" w:hAnsi="Symbol" w:hint="default"/>
-        <w:sz w:val="20"/>
-      </w:rPr>
-    </w:lvl>
-    <w:lvl w:ilvl="7" w:tentative="1">
-      <w:start w:val="1"/>
-      <w:numFmt w:val="bullet"/>
-      <w:lvlText w:val=""/>
-      <w:lvlJc w:val="left"/>
-      <w:pPr>
-        <w:tabs>
-          <w:tab w:val="num" w:pos="5400"/>
-        </w:tabs>
-        <w:ind w:left="5400" w:hanging="360"/>
-      </w:pPr>
-      <w:rPr>
-        <w:rFonts w:ascii="Symbol" w:hAnsi="Symbol" w:hint="default"/>
-        <w:sz w:val="20"/>
-      </w:rPr>
-    </w:lvl>
-    <w:lvl w:ilvl="8" w:tentative="1">
-      <w:start w:val="1"/>
-      <w:numFmt w:val="bullet"/>
-      <w:lvlText w:val=""/>
-      <w:lvlJc w:val="left"/>
-      <w:pPr>
-        <w:tabs>
-          <w:tab w:val="num" w:pos="6120"/>
-        </w:tabs>
-        <w:ind w:left="6120" w:hanging="360"/>
-      </w:pPr>
-      <w:rPr>
-        <w:rFonts w:ascii="Symbol" w:hAnsi="Symbol" w:hint="default"/>
-        <w:sz w:val="20"/>
-      </w:rPr>
-    </w:lvl>
-  </w:abstractNum>
-  <w:abstractNum w:abstractNumId="47" w15:restartNumberingAfterBreak="0">
-    <w:nsid w:val="6F6A0108"/>
-    <w:multiLevelType w:val="hybridMultilevel"/>
-    <w:tmpl w:val="6004CD10"/>
-    <w:lvl w:ilvl="0" w:tplc="04090001">
-      <w:start w:val="1"/>
-      <w:numFmt w:val="bullet"/>
-      <w:lvlText w:val=""/>
-      <w:lvlJc w:val="left"/>
-      <w:pPr>
-        <w:ind w:left="360" w:hanging="360"/>
-      </w:pPr>
-      <w:rPr>
-        <w:rFonts w:ascii="Symbol" w:hAnsi="Symbol" w:hint="default"/>
-      </w:rPr>
-    </w:lvl>
-    <w:lvl w:ilvl="1" w:tplc="04090003" w:tentative="1">
-      <w:start w:val="1"/>
-      <w:numFmt w:val="bullet"/>
-      <w:lvlText w:val="o"/>
-      <w:lvlJc w:val="left"/>
-      <w:pPr>
-        <w:ind w:left="1080" w:hanging="360"/>
-      </w:pPr>
-      <w:rPr>
-        <w:rFonts w:ascii="Courier New" w:hAnsi="Courier New" w:cs="Courier New" w:hint="default"/>
-      </w:rPr>
-    </w:lvl>
-    <w:lvl w:ilvl="2" w:tplc="04090005" w:tentative="1">
-      <w:start w:val="1"/>
-      <w:numFmt w:val="bullet"/>
-      <w:lvlText w:val=""/>
-      <w:lvlJc w:val="left"/>
-      <w:pPr>
-        <w:ind w:left="1800" w:hanging="360"/>
-      </w:pPr>
-      <w:rPr>
-        <w:rFonts w:ascii="Wingdings" w:hAnsi="Wingdings" w:hint="default"/>
-      </w:rPr>
-    </w:lvl>
-    <w:lvl w:ilvl="3" w:tplc="04090001" w:tentative="1">
-      <w:start w:val="1"/>
-      <w:numFmt w:val="bullet"/>
-      <w:lvlText w:val=""/>
-      <w:lvlJc w:val="left"/>
-      <w:pPr>
-        <w:ind w:left="2520" w:hanging="360"/>
-      </w:pPr>
-      <w:rPr>
-        <w:rFonts w:ascii="Symbol" w:hAnsi="Symbol" w:hint="default"/>
-      </w:rPr>
-    </w:lvl>
-    <w:lvl w:ilvl="4" w:tplc="04090003" w:tentative="1">
-      <w:start w:val="1"/>
-      <w:numFmt w:val="bullet"/>
-      <w:lvlText w:val="o"/>
-      <w:lvlJc w:val="left"/>
-      <w:pPr>
-        <w:ind w:left="3240" w:hanging="360"/>
-      </w:pPr>
-      <w:rPr>
-        <w:rFonts w:ascii="Courier New" w:hAnsi="Courier New" w:cs="Courier New" w:hint="default"/>
-      </w:rPr>
-    </w:lvl>
-    <w:lvl w:ilvl="5" w:tplc="04090005" w:tentative="1">
-      <w:start w:val="1"/>
-      <w:numFmt w:val="bullet"/>
-      <w:lvlText w:val=""/>
-      <w:lvlJc w:val="left"/>
-      <w:pPr>
-        <w:ind w:left="3960" w:hanging="360"/>
-      </w:pPr>
-      <w:rPr>
-        <w:rFonts w:ascii="Wingdings" w:hAnsi="Wingdings" w:hint="default"/>
-      </w:rPr>
-    </w:lvl>
-    <w:lvl w:ilvl="6" w:tplc="04090001" w:tentative="1">
-      <w:start w:val="1"/>
-      <w:numFmt w:val="bullet"/>
-      <w:lvlText w:val=""/>
-      <w:lvlJc w:val="left"/>
-      <w:pPr>
-        <w:ind w:left="4680" w:hanging="360"/>
-      </w:pPr>
-      <w:rPr>
-        <w:rFonts w:ascii="Symbol" w:hAnsi="Symbol" w:hint="default"/>
-      </w:rPr>
-    </w:lvl>
-    <w:lvl w:ilvl="7" w:tplc="04090003" w:tentative="1">
-      <w:start w:val="1"/>
-      <w:numFmt w:val="bullet"/>
-      <w:lvlText w:val="o"/>
-      <w:lvlJc w:val="left"/>
-      <w:pPr>
-        <w:ind w:left="5400" w:hanging="360"/>
-      </w:pPr>
-      <w:rPr>
-        <w:rFonts w:ascii="Courier New" w:hAnsi="Courier New" w:cs="Courier New" w:hint="default"/>
-      </w:rPr>
-    </w:lvl>
-    <w:lvl w:ilvl="8" w:tplc="04090005" w:tentative="1">
-      <w:start w:val="1"/>
-      <w:numFmt w:val="bullet"/>
-      <w:lvlText w:val=""/>
-      <w:lvlJc w:val="left"/>
-      <w:pPr>
-        <w:ind w:left="6120" w:hanging="360"/>
-      </w:pPr>
-      <w:rPr>
-        <w:rFonts w:ascii="Wingdings" w:hAnsi="Wingdings" w:hint="default"/>
-      </w:rPr>
-    </w:lvl>
-  </w:abstractNum>
-  <w:abstractNum w:abstractNumId="48" w15:restartNumberingAfterBreak="0">
-    <w:nsid w:val="75D968F5"/>
-    <w:multiLevelType w:val="hybridMultilevel"/>
-    <w:tmpl w:val="30581EC8"/>
-    <w:lvl w:ilvl="0" w:tplc="0409000F">
-      <w:start w:val="1"/>
-      <w:numFmt w:val="decimal"/>
-      <w:lvlText w:val="%1."/>
-      <w:lvlJc w:val="left"/>
-      <w:pPr>
-        <w:ind w:left="360" w:hanging="360"/>
-      </w:pPr>
-      <w:rPr>
-        <w:rFonts w:hint="default"/>
-      </w:rPr>
-    </w:lvl>
-    <w:lvl w:ilvl="1" w:tplc="04090019" w:tentative="1">
-      <w:start w:val="1"/>
-      <w:numFmt w:val="lowerLetter"/>
-      <w:lvlText w:val="%2."/>
-      <w:lvlJc w:val="left"/>
-      <w:pPr>
-        <w:ind w:left="1080" w:hanging="360"/>
-      </w:pPr>
-    </w:lvl>
-    <w:lvl w:ilvl="2" w:tplc="0409001B" w:tentative="1">
-      <w:start w:val="1"/>
-      <w:numFmt w:val="lowerRoman"/>
-      <w:lvlText w:val="%3."/>
-      <w:lvlJc w:val="right"/>
-      <w:pPr>
-        <w:ind w:left="1800" w:hanging="180"/>
-      </w:pPr>
-    </w:lvl>
-    <w:lvl w:ilvl="3" w:tplc="0409000F" w:tentative="1">
-      <w:start w:val="1"/>
-      <w:numFmt w:val="decimal"/>
-      <w:lvlText w:val="%4."/>
-      <w:lvlJc w:val="left"/>
-      <w:pPr>
-        <w:ind w:left="2520" w:hanging="360"/>
-      </w:pPr>
-    </w:lvl>
-    <w:lvl w:ilvl="4" w:tplc="04090019" w:tentative="1">
-      <w:start w:val="1"/>
-      <w:numFmt w:val="lowerLetter"/>
-      <w:lvlText w:val="%5."/>
-      <w:lvlJc w:val="left"/>
-      <w:pPr>
-        <w:ind w:left="3240" w:hanging="360"/>
-      </w:pPr>
-    </w:lvl>
-    <w:lvl w:ilvl="5" w:tplc="0409001B" w:tentative="1">
-      <w:start w:val="1"/>
-      <w:numFmt w:val="lowerRoman"/>
-      <w:lvlText w:val="%6."/>
-      <w:lvlJc w:val="right"/>
-      <w:pPr>
-        <w:ind w:left="3960" w:hanging="180"/>
-      </w:pPr>
-    </w:lvl>
-    <w:lvl w:ilvl="6" w:tplc="0409000F" w:tentative="1">
-      <w:start w:val="1"/>
-      <w:numFmt w:val="decimal"/>
-      <w:lvlText w:val="%7."/>
-      <w:lvlJc w:val="left"/>
-      <w:pPr>
-        <w:ind w:left="4680" w:hanging="360"/>
-      </w:pPr>
-    </w:lvl>
-    <w:lvl w:ilvl="7" w:tplc="04090019" w:tentative="1">
-      <w:start w:val="1"/>
-      <w:numFmt w:val="lowerLetter"/>
-      <w:lvlText w:val="%8."/>
-      <w:lvlJc w:val="left"/>
-      <w:pPr>
-        <w:ind w:left="5400" w:hanging="360"/>
-      </w:pPr>
-    </w:lvl>
-    <w:lvl w:ilvl="8" w:tplc="0409001B" w:tentative="1">
-      <w:start w:val="1"/>
-      <w:numFmt w:val="lowerRoman"/>
-      <w:lvlText w:val="%9."/>
-      <w:lvlJc w:val="right"/>
-      <w:pPr>
-        <w:ind w:left="6120" w:hanging="180"/>
-      </w:pPr>
-    </w:lvl>
-  </w:abstractNum>
-  <w:abstractNum w:abstractNumId="49" w15:restartNumberingAfterBreak="0">
-    <w:nsid w:val="76C2363B"/>
-    <w:multiLevelType w:val="hybridMultilevel"/>
-    <w:tmpl w:val="AEF6AAA6"/>
-    <w:lvl w:ilvl="0" w:tplc="0409000F">
-      <w:start w:val="1"/>
-      <w:numFmt w:val="decimal"/>
-      <w:lvlText w:val="%1."/>
-      <w:lvlJc w:val="left"/>
-      <w:pPr>
-        <w:ind w:left="720" w:hanging="360"/>
-      </w:pPr>
-      <w:rPr>
-        <w:rFonts w:hint="default"/>
-      </w:rPr>
-    </w:lvl>
-    <w:lvl w:ilvl="1" w:tplc="04090019" w:tentative="1">
-      <w:start w:val="1"/>
-      <w:numFmt w:val="lowerLetter"/>
-      <w:lvlText w:val="%2."/>
-      <w:lvlJc w:val="left"/>
-      <w:pPr>
-        <w:ind w:left="1440" w:hanging="360"/>
-      </w:pPr>
-    </w:lvl>
-    <w:lvl w:ilvl="2" w:tplc="0409001B" w:tentative="1">
-      <w:start w:val="1"/>
-      <w:numFmt w:val="lowerRoman"/>
-      <w:lvlText w:val="%3."/>
-      <w:lvlJc w:val="right"/>
-      <w:pPr>
-        <w:ind w:left="2160" w:hanging="180"/>
-      </w:pPr>
-    </w:lvl>
-    <w:lvl w:ilvl="3" w:tplc="0409000F" w:tentative="1">
-      <w:start w:val="1"/>
-      <w:numFmt w:val="decimal"/>
-      <w:lvlText w:val="%4."/>
-      <w:lvlJc w:val="left"/>
-      <w:pPr>
-        <w:ind w:left="2880" w:hanging="360"/>
-      </w:pPr>
-    </w:lvl>
-    <w:lvl w:ilvl="4" w:tplc="04090019" w:tentative="1">
-      <w:start w:val="1"/>
-      <w:numFmt w:val="lowerLetter"/>
-      <w:lvlText w:val="%5."/>
-      <w:lvlJc w:val="left"/>
-      <w:pPr>
-        <w:ind w:left="3600" w:hanging="360"/>
-      </w:pPr>
-    </w:lvl>
-    <w:lvl w:ilvl="5" w:tplc="0409001B" w:tentative="1">
-      <w:start w:val="1"/>
-      <w:numFmt w:val="lowerRoman"/>
-      <w:lvlText w:val="%6."/>
-      <w:lvlJc w:val="right"/>
-      <w:pPr>
-        <w:ind w:left="4320" w:hanging="180"/>
-      </w:pPr>
-    </w:lvl>
-    <w:lvl w:ilvl="6" w:tplc="0409000F" w:tentative="1">
-      <w:start w:val="1"/>
-      <w:numFmt w:val="decimal"/>
-      <w:lvlText w:val="%7."/>
-      <w:lvlJc w:val="left"/>
-      <w:pPr>
-        <w:ind w:left="5040" w:hanging="360"/>
-      </w:pPr>
-    </w:lvl>
-    <w:lvl w:ilvl="7" w:tplc="04090019" w:tentative="1">
-      <w:start w:val="1"/>
-      <w:numFmt w:val="lowerLetter"/>
-      <w:lvlText w:val="%8."/>
-      <w:lvlJc w:val="left"/>
-      <w:pPr>
-        <w:ind w:left="5760" w:hanging="360"/>
-      </w:pPr>
-    </w:lvl>
-    <w:lvl w:ilvl="8" w:tplc="0409001B" w:tentative="1">
-      <w:start w:val="1"/>
-      <w:numFmt w:val="lowerRoman"/>
-      <w:lvlText w:val="%9."/>
-      <w:lvlJc w:val="right"/>
-      <w:pPr>
-        <w:ind w:left="6480" w:hanging="180"/>
-      </w:pPr>
-    </w:lvl>
-  </w:abstractNum>
-  <w:abstractNum w:abstractNumId="50" w15:restartNumberingAfterBreak="0">
-    <w:nsid w:val="7AC413BC"/>
-    <w:multiLevelType w:val="hybridMultilevel"/>
-    <w:tmpl w:val="B2948FBA"/>
-    <w:lvl w:ilvl="0" w:tplc="0409000F">
-      <w:start w:val="1"/>
-      <w:numFmt w:val="decimal"/>
-      <w:lvlText w:val="%1."/>
-      <w:lvlJc w:val="left"/>
-      <w:pPr>
-        <w:ind w:left="360" w:hanging="360"/>
-      </w:pPr>
-    </w:lvl>
-    <w:lvl w:ilvl="1" w:tplc="04090019" w:tentative="1">
-      <w:start w:val="1"/>
-      <w:numFmt w:val="lowerLetter"/>
-      <w:lvlText w:val="%2."/>
-      <w:lvlJc w:val="left"/>
-      <w:pPr>
-        <w:ind w:left="1080" w:hanging="360"/>
-      </w:pPr>
-    </w:lvl>
-    <w:lvl w:ilvl="2" w:tplc="0409001B" w:tentative="1">
-      <w:start w:val="1"/>
-      <w:numFmt w:val="lowerRoman"/>
-      <w:lvlText w:val="%3."/>
-      <w:lvlJc w:val="right"/>
-      <w:pPr>
-        <w:ind w:left="1800" w:hanging="180"/>
-      </w:pPr>
-    </w:lvl>
-    <w:lvl w:ilvl="3" w:tplc="0409000F" w:tentative="1">
-      <w:start w:val="1"/>
-      <w:numFmt w:val="decimal"/>
-      <w:lvlText w:val="%4."/>
-      <w:lvlJc w:val="left"/>
-      <w:pPr>
-        <w:ind w:left="2520" w:hanging="360"/>
-      </w:pPr>
-    </w:lvl>
-    <w:lvl w:ilvl="4" w:tplc="04090019" w:tentative="1">
-      <w:start w:val="1"/>
-      <w:numFmt w:val="lowerLetter"/>
-      <w:lvlText w:val="%5."/>
-      <w:lvlJc w:val="left"/>
-      <w:pPr>
-        <w:ind w:left="3240" w:hanging="360"/>
-      </w:pPr>
-    </w:lvl>
-    <w:lvl w:ilvl="5" w:tplc="0409001B" w:tentative="1">
-      <w:start w:val="1"/>
-      <w:numFmt w:val="lowerRoman"/>
-      <w:lvlText w:val="%6."/>
-      <w:lvlJc w:val="right"/>
-      <w:pPr>
-        <w:ind w:left="3960" w:hanging="180"/>
-      </w:pPr>
-    </w:lvl>
-    <w:lvl w:ilvl="6" w:tplc="0409000F" w:tentative="1">
-      <w:start w:val="1"/>
-      <w:numFmt w:val="decimal"/>
-      <w:lvlText w:val="%7."/>
-      <w:lvlJc w:val="left"/>
-      <w:pPr>
-        <w:ind w:left="4680" w:hanging="360"/>
-      </w:pPr>
-    </w:lvl>
-    <w:lvl w:ilvl="7" w:tplc="04090019" w:tentative="1">
-      <w:start w:val="1"/>
-      <w:numFmt w:val="lowerLetter"/>
-      <w:lvlText w:val="%8."/>
-      <w:lvlJc w:val="left"/>
-      <w:pPr>
-        <w:ind w:left="5400" w:hanging="360"/>
-      </w:pPr>
-    </w:lvl>
-    <w:lvl w:ilvl="8" w:tplc="0409001B" w:tentative="1">
-      <w:start w:val="1"/>
-      <w:numFmt w:val="lowerRoman"/>
-      <w:lvlText w:val="%9."/>
-      <w:lvlJc w:val="right"/>
-      <w:pPr>
-        <w:ind w:left="6120" w:hanging="180"/>
-      </w:pPr>
-    </w:lvl>
-  </w:abstractNum>
-  <w:abstractNum w:abstractNumId="51" w15:restartNumberingAfterBreak="0">
-    <w:nsid w:val="7B000701"/>
-    <w:multiLevelType w:val="multilevel"/>
-    <w:tmpl w:val="E752F44A"/>
-    <w:lvl w:ilvl="0">
-      <w:start w:val="1"/>
-      <w:numFmt w:val="bullet"/>
-      <w:lvlText w:val=""/>
-      <w:lvlJc w:val="left"/>
-      <w:pPr>
-        <w:tabs>
-          <w:tab w:val="num" w:pos="360"/>
-        </w:tabs>
-        <w:ind w:left="360" w:hanging="360"/>
-      </w:pPr>
-      <w:rPr>
-        <w:rFonts w:ascii="Symbol" w:hAnsi="Symbol" w:hint="default"/>
-        <w:sz w:val="20"/>
-      </w:rPr>
-    </w:lvl>
-    <w:lvl w:ilvl="1" w:tentative="1">
-      <w:start w:val="1"/>
-      <w:numFmt w:val="bullet"/>
-      <w:lvlText w:val=""/>
-      <w:lvlJc w:val="left"/>
-      <w:pPr>
-        <w:tabs>
-          <w:tab w:val="num" w:pos="1080"/>
-        </w:tabs>
-        <w:ind w:left="1080" w:hanging="360"/>
-      </w:pPr>
-      <w:rPr>
-        <w:rFonts w:ascii="Symbol" w:hAnsi="Symbol" w:hint="default"/>
-        <w:sz w:val="20"/>
-      </w:rPr>
-    </w:lvl>
-    <w:lvl w:ilvl="2" w:tentative="1">
-      <w:start w:val="1"/>
-      <w:numFmt w:val="bullet"/>
-      <w:lvlText w:val=""/>
-      <w:lvlJc w:val="left"/>
-      <w:pPr>
-        <w:tabs>
-          <w:tab w:val="num" w:pos="1800"/>
-        </w:tabs>
-        <w:ind w:left="1800" w:hanging="360"/>
-      </w:pPr>
-      <w:rPr>
-        <w:rFonts w:ascii="Symbol" w:hAnsi="Symbol" w:hint="default"/>
-        <w:sz w:val="20"/>
-      </w:rPr>
-    </w:lvl>
-    <w:lvl w:ilvl="3" w:tentative="1">
-      <w:start w:val="1"/>
-      <w:numFmt w:val="bullet"/>
-      <w:lvlText w:val=""/>
-      <w:lvlJc w:val="left"/>
-      <w:pPr>
-        <w:tabs>
-          <w:tab w:val="num" w:pos="2520"/>
-        </w:tabs>
-        <w:ind w:left="2520" w:hanging="360"/>
-      </w:pPr>
-      <w:rPr>
-        <w:rFonts w:ascii="Symbol" w:hAnsi="Symbol" w:hint="default"/>
-        <w:sz w:val="20"/>
-      </w:rPr>
-    </w:lvl>
-    <w:lvl w:ilvl="4" w:tentative="1">
-      <w:start w:val="1"/>
-      <w:numFmt w:val="bullet"/>
-      <w:lvlText w:val=""/>
-      <w:lvlJc w:val="left"/>
-      <w:pPr>
-        <w:tabs>
-          <w:tab w:val="num" w:pos="3240"/>
-        </w:tabs>
-        <w:ind w:left="3240" w:hanging="360"/>
-      </w:pPr>
-      <w:rPr>
-        <w:rFonts w:ascii="Symbol" w:hAnsi="Symbol" w:hint="default"/>
-        <w:sz w:val="20"/>
-      </w:rPr>
-    </w:lvl>
-    <w:lvl w:ilvl="5" w:tentative="1">
-      <w:start w:val="1"/>
-      <w:numFmt w:val="bullet"/>
-      <w:lvlText w:val=""/>
-      <w:lvlJc w:val="left"/>
-      <w:pPr>
-        <w:tabs>
-          <w:tab w:val="num" w:pos="3960"/>
-        </w:tabs>
-        <w:ind w:left="3960" w:hanging="360"/>
-      </w:pPr>
-      <w:rPr>
-        <w:rFonts w:ascii="Symbol" w:hAnsi="Symbol" w:hint="default"/>
-        <w:sz w:val="20"/>
-      </w:rPr>
-    </w:lvl>
-    <w:lvl w:ilvl="6" w:tentative="1">
-      <w:start w:val="1"/>
-      <w:numFmt w:val="bullet"/>
-      <w:lvlText w:val=""/>
-      <w:lvlJc w:val="left"/>
-      <w:pPr>
-        <w:tabs>
-          <w:tab w:val="num" w:pos="4680"/>
-        </w:tabs>
-        <w:ind w:left="4680" w:hanging="360"/>
-      </w:pPr>
-      <w:rPr>
-        <w:rFonts w:ascii="Symbol" w:hAnsi="Symbol" w:hint="default"/>
-        <w:sz w:val="20"/>
-      </w:rPr>
-    </w:lvl>
-    <w:lvl w:ilvl="7" w:tentative="1">
-      <w:start w:val="1"/>
-      <w:numFmt w:val="bullet"/>
-      <w:lvlText w:val=""/>
-      <w:lvlJc w:val="left"/>
-      <w:pPr>
-        <w:tabs>
-          <w:tab w:val="num" w:pos="5400"/>
-        </w:tabs>
-        <w:ind w:left="5400" w:hanging="360"/>
-      </w:pPr>
-      <w:rPr>
-        <w:rFonts w:ascii="Symbol" w:hAnsi="Symbol" w:hint="default"/>
-        <w:sz w:val="20"/>
-      </w:rPr>
-    </w:lvl>
-    <w:lvl w:ilvl="8" w:tentative="1">
-      <w:start w:val="1"/>
-      <w:numFmt w:val="bullet"/>
-      <w:lvlText w:val=""/>
-      <w:lvlJc w:val="left"/>
-      <w:pPr>
-        <w:tabs>
-          <w:tab w:val="num" w:pos="6120"/>
-        </w:tabs>
-        <w:ind w:left="6120" w:hanging="360"/>
-      </w:pPr>
-      <w:rPr>
-        <w:rFonts w:ascii="Symbol" w:hAnsi="Symbol" w:hint="default"/>
-        <w:sz w:val="20"/>
-      </w:rPr>
-    </w:lvl>
-  </w:abstractNum>
-  <w:abstractNum w:abstractNumId="52" w15:restartNumberingAfterBreak="0">
-    <w:nsid w:val="7B4D185B"/>
-    <w:multiLevelType w:val="hybridMultilevel"/>
-    <w:tmpl w:val="68702DC8"/>
-    <w:lvl w:ilvl="0" w:tplc="04090001">
-      <w:start w:val="1"/>
-      <w:numFmt w:val="bullet"/>
-      <w:lvlText w:val=""/>
-      <w:lvlJc w:val="left"/>
-      <w:pPr>
-        <w:ind w:left="440" w:hanging="440"/>
-      </w:pPr>
-      <w:rPr>
-        <w:rFonts w:ascii="Wingdings" w:hAnsi="Wingdings" w:hint="default"/>
-      </w:rPr>
-    </w:lvl>
-    <w:lvl w:ilvl="1" w:tplc="FFFFFFFF">
-      <w:start w:val="1"/>
-      <w:numFmt w:val="lowerLetter"/>
-      <w:lvlText w:val="%2)"/>
-      <w:lvlJc w:val="left"/>
-      <w:pPr>
-        <w:ind w:left="880" w:hanging="440"/>
-      </w:pPr>
-    </w:lvl>
-    <w:lvl w:ilvl="2" w:tplc="FFFFFFFF" w:tentative="1">
-      <w:start w:val="1"/>
-      <w:numFmt w:val="lowerRoman"/>
-      <w:lvlText w:val="%3."/>
-      <w:lvlJc w:val="right"/>
-      <w:pPr>
-        <w:ind w:left="1320" w:hanging="440"/>
-      </w:pPr>
-    </w:lvl>
-    <w:lvl w:ilvl="3" w:tplc="FFFFFFFF" w:tentative="1">
-      <w:start w:val="1"/>
-      <w:numFmt w:val="decimal"/>
-      <w:lvlText w:val="%4."/>
-      <w:lvlJc w:val="left"/>
-      <w:pPr>
-        <w:ind w:left="1760" w:hanging="440"/>
-      </w:pPr>
-    </w:lvl>
-    <w:lvl w:ilvl="4" w:tplc="FFFFFFFF" w:tentative="1">
-      <w:start w:val="1"/>
-      <w:numFmt w:val="lowerLetter"/>
-      <w:lvlText w:val="%5)"/>
-      <w:lvlJc w:val="left"/>
-      <w:pPr>
-        <w:ind w:left="2200" w:hanging="440"/>
-      </w:pPr>
-    </w:lvl>
-    <w:lvl w:ilvl="5" w:tplc="FFFFFFFF" w:tentative="1">
-      <w:start w:val="1"/>
-      <w:numFmt w:val="lowerRoman"/>
-      <w:lvlText w:val="%6."/>
-      <w:lvlJc w:val="right"/>
-      <w:pPr>
-        <w:ind w:left="2640" w:hanging="440"/>
-      </w:pPr>
-    </w:lvl>
-    <w:lvl w:ilvl="6" w:tplc="FFFFFFFF" w:tentative="1">
-      <w:start w:val="1"/>
-      <w:numFmt w:val="decimal"/>
-      <w:lvlText w:val="%7."/>
-      <w:lvlJc w:val="left"/>
-      <w:pPr>
-        <w:ind w:left="3080" w:hanging="440"/>
-      </w:pPr>
-    </w:lvl>
-    <w:lvl w:ilvl="7" w:tplc="FFFFFFFF" w:tentative="1">
-      <w:start w:val="1"/>
-      <w:numFmt w:val="lowerLetter"/>
-      <w:lvlText w:val="%8)"/>
-      <w:lvlJc w:val="left"/>
-      <w:pPr>
-        <w:ind w:left="3520" w:hanging="440"/>
-      </w:pPr>
-    </w:lvl>
-    <w:lvl w:ilvl="8" w:tplc="FFFFFFFF" w:tentative="1">
-      <w:start w:val="1"/>
-      <w:numFmt w:val="lowerRoman"/>
-      <w:lvlText w:val="%9."/>
-      <w:lvlJc w:val="right"/>
-      <w:pPr>
-        <w:ind w:left="3960" w:hanging="440"/>
-      </w:pPr>
-    </w:lvl>
-  </w:abstractNum>
-  <w:abstractNum w:abstractNumId="53" w15:restartNumberingAfterBreak="0">
-    <w:nsid w:val="7CE35BD2"/>
-    <w:multiLevelType w:val="hybridMultilevel"/>
-    <w:tmpl w:val="D0748882"/>
-    <w:lvl w:ilvl="0" w:tplc="0409000F">
-      <w:start w:val="1"/>
-      <w:numFmt w:val="decimal"/>
-      <w:lvlText w:val="%1."/>
-      <w:lvlJc w:val="left"/>
-      <w:pPr>
-        <w:ind w:left="360" w:hanging="360"/>
-      </w:pPr>
-      <w:rPr>
-        <w:rFonts w:hint="default"/>
-      </w:rPr>
-    </w:lvl>
-    <w:lvl w:ilvl="1" w:tplc="04090019" w:tentative="1">
-      <w:start w:val="1"/>
-      <w:numFmt w:val="lowerLetter"/>
-      <w:lvlText w:val="%2."/>
-      <w:lvlJc w:val="left"/>
-      <w:pPr>
-        <w:ind w:left="1080" w:hanging="360"/>
-      </w:pPr>
-    </w:lvl>
-    <w:lvl w:ilvl="2" w:tplc="0409001B" w:tentative="1">
-      <w:start w:val="1"/>
-      <w:numFmt w:val="lowerRoman"/>
-      <w:lvlText w:val="%3."/>
-      <w:lvlJc w:val="right"/>
-      <w:pPr>
-        <w:ind w:left="1800" w:hanging="180"/>
-      </w:pPr>
-    </w:lvl>
-    <w:lvl w:ilvl="3" w:tplc="0409000F" w:tentative="1">
-      <w:start w:val="1"/>
-      <w:numFmt w:val="decimal"/>
-      <w:lvlText w:val="%4."/>
-      <w:lvlJc w:val="left"/>
-      <w:pPr>
-        <w:ind w:left="2520" w:hanging="360"/>
-      </w:pPr>
-    </w:lvl>
-    <w:lvl w:ilvl="4" w:tplc="04090019" w:tentative="1">
-      <w:start w:val="1"/>
-      <w:numFmt w:val="lowerLetter"/>
-      <w:lvlText w:val="%5."/>
-      <w:lvlJc w:val="left"/>
-      <w:pPr>
-        <w:ind w:left="3240" w:hanging="360"/>
-      </w:pPr>
-    </w:lvl>
-    <w:lvl w:ilvl="5" w:tplc="0409001B" w:tentative="1">
-      <w:start w:val="1"/>
-      <w:numFmt w:val="lowerRoman"/>
-      <w:lvlText w:val="%6."/>
-      <w:lvlJc w:val="right"/>
-      <w:pPr>
-        <w:ind w:left="3960" w:hanging="180"/>
-      </w:pPr>
-    </w:lvl>
-    <w:lvl w:ilvl="6" w:tplc="0409000F" w:tentative="1">
-      <w:start w:val="1"/>
-      <w:numFmt w:val="decimal"/>
-      <w:lvlText w:val="%7."/>
-      <w:lvlJc w:val="left"/>
-      <w:pPr>
-        <w:ind w:left="4680" w:hanging="360"/>
-      </w:pPr>
-    </w:lvl>
-    <w:lvl w:ilvl="7" w:tplc="04090019" w:tentative="1">
-      <w:start w:val="1"/>
-      <w:numFmt w:val="lowerLetter"/>
-      <w:lvlText w:val="%8."/>
-      <w:lvlJc w:val="left"/>
-      <w:pPr>
-        <w:ind w:left="5400" w:hanging="360"/>
-      </w:pPr>
-    </w:lvl>
-    <w:lvl w:ilvl="8" w:tplc="0409001B" w:tentative="1">
-      <w:start w:val="1"/>
-      <w:numFmt w:val="lowerRoman"/>
-      <w:lvlText w:val="%9."/>
-      <w:lvlJc w:val="right"/>
-      <w:pPr>
-        <w:ind w:left="6120" w:hanging="180"/>
-      </w:pPr>
-    </w:lvl>
-  </w:abstractNum>
-  <w:abstractNum w:abstractNumId="54" w15:restartNumberingAfterBreak="0">
-    <w:nsid w:val="7DDF25A3"/>
-    <w:multiLevelType w:val="multilevel"/>
-    <w:tmpl w:val="24D0A3CC"/>
-    <w:lvl w:ilvl="0">
-      <w:start w:val="1"/>
-      <w:numFmt w:val="decimal"/>
-      <w:lvlText w:val="%1."/>
-      <w:lvlJc w:val="left"/>
-      <w:pPr>
-        <w:tabs>
-          <w:tab w:val="num" w:pos="720"/>
-        </w:tabs>
-        <w:ind w:left="720" w:hanging="360"/>
-      </w:pPr>
-    </w:lvl>
-    <w:lvl w:ilvl="1" w:tentative="1">
-      <w:start w:val="1"/>
-      <w:numFmt w:val="decimal"/>
-      <w:lvlText w:val="%2."/>
-      <w:lvlJc w:val="left"/>
-      <w:pPr>
-        <w:tabs>
-          <w:tab w:val="num" w:pos="1440"/>
-        </w:tabs>
-        <w:ind w:left="1440" w:hanging="360"/>
-      </w:pPr>
-    </w:lvl>
-    <w:lvl w:ilvl="2" w:tentative="1">
-      <w:start w:val="1"/>
-      <w:numFmt w:val="decimal"/>
-      <w:lvlText w:val="%3."/>
-      <w:lvlJc w:val="left"/>
-      <w:pPr>
-        <w:tabs>
-          <w:tab w:val="num" w:pos="2160"/>
-        </w:tabs>
-        <w:ind w:left="2160" w:hanging="360"/>
-      </w:pPr>
-    </w:lvl>
-    <w:lvl w:ilvl="3" w:tentative="1">
-      <w:start w:val="1"/>
-      <w:numFmt w:val="decimal"/>
-      <w:lvlText w:val="%4."/>
-      <w:lvlJc w:val="left"/>
-      <w:pPr>
-        <w:tabs>
-          <w:tab w:val="num" w:pos="2880"/>
-        </w:tabs>
-        <w:ind w:left="2880" w:hanging="360"/>
-      </w:pPr>
-    </w:lvl>
-    <w:lvl w:ilvl="4" w:tentative="1">
-      <w:start w:val="1"/>
-      <w:numFmt w:val="decimal"/>
-      <w:lvlText w:val="%5."/>
-      <w:lvlJc w:val="left"/>
-      <w:pPr>
-        <w:tabs>
-          <w:tab w:val="num" w:pos="3600"/>
-        </w:tabs>
-        <w:ind w:left="3600" w:hanging="360"/>
-      </w:pPr>
-    </w:lvl>
-    <w:lvl w:ilvl="5" w:tentative="1">
-      <w:start w:val="1"/>
-      <w:numFmt w:val="decimal"/>
-      <w:lvlText w:val="%6."/>
-      <w:lvlJc w:val="left"/>
-      <w:pPr>
-        <w:tabs>
-          <w:tab w:val="num" w:pos="4320"/>
-        </w:tabs>
-        <w:ind w:left="4320" w:hanging="360"/>
-      </w:pPr>
-    </w:lvl>
-    <w:lvl w:ilvl="6" w:tentative="1">
-      <w:start w:val="1"/>
-      <w:numFmt w:val="decimal"/>
-      <w:lvlText w:val="%7."/>
-      <w:lvlJc w:val="left"/>
-      <w:pPr>
-        <w:tabs>
-          <w:tab w:val="num" w:pos="5040"/>
-        </w:tabs>
-        <w:ind w:left="5040" w:hanging="360"/>
-      </w:pPr>
-    </w:lvl>
-    <w:lvl w:ilvl="7" w:tentative="1">
-      <w:start w:val="1"/>
-      <w:numFmt w:val="decimal"/>
-      <w:lvlText w:val="%8."/>
-      <w:lvlJc w:val="left"/>
-      <w:pPr>
-        <w:tabs>
-          <w:tab w:val="num" w:pos="5760"/>
-        </w:tabs>
-        <w:ind w:left="5760" w:hanging="360"/>
-      </w:pPr>
-    </w:lvl>
-    <w:lvl w:ilvl="8" w:tentative="1">
-      <w:start w:val="1"/>
-      <w:numFmt w:val="decimal"/>
-      <w:lvlText w:val="%9."/>
-      <w:lvlJc w:val="left"/>
-      <w:pPr>
-        <w:tabs>
-          <w:tab w:val="num" w:pos="6480"/>
-        </w:tabs>
-        <w:ind w:left="6480" w:hanging="360"/>
-      </w:pPr>
-    </w:lvl>
-  </w:abstractNum>
   <w:num w:numId="1" w16cid:durableId="1754162528">
-    <w:abstractNumId w:val="11"/>
+    <w:abstractNumId w:val="3"/>
   </w:num>
   <w:num w:numId="2" w16cid:durableId="819462944">
     <w:abstractNumId w:val="2"/>
@@ -11860,159 +7423,27 @@
     <w:abstractNumId w:val="0"/>
   </w:num>
   <w:num w:numId="5" w16cid:durableId="1398286605">
-    <w:abstractNumId w:val="38"/>
+    <w:abstractNumId w:val="8"/>
   </w:num>
   <w:num w:numId="6" w16cid:durableId="306207893">
-    <w:abstractNumId w:val="21"/>
+    <w:abstractNumId w:val="7"/>
   </w:num>
   <w:num w:numId="7" w16cid:durableId="2059013561">
-    <w:abstractNumId w:val="19"/>
+    <w:abstractNumId w:val="5"/>
   </w:num>
   <w:num w:numId="8" w16cid:durableId="433019715">
-    <w:abstractNumId w:val="18"/>
+    <w:abstractNumId w:val="4"/>
   </w:num>
-  <w:num w:numId="9" w16cid:durableId="1779107521">
-    <w:abstractNumId w:val="25"/>
+  <w:num w:numId="9" w16cid:durableId="1026249085">
+    <w:abstractNumId w:val="10"/>
   </w:num>
-  <w:num w:numId="10" w16cid:durableId="2116829757">
-    <w:abstractNumId w:val="35"/>
-  </w:num>
-  <w:num w:numId="11" w16cid:durableId="861020472">
+  <w:num w:numId="10" w16cid:durableId="27800674">
     <w:abstractNumId w:val="6"/>
   </w:num>
-  <w:num w:numId="12" w16cid:durableId="443774114">
-    <w:abstractNumId w:val="52"/>
-  </w:num>
-  <w:num w:numId="13" w16cid:durableId="2078048157">
-    <w:abstractNumId w:val="26"/>
-  </w:num>
-  <w:num w:numId="14" w16cid:durableId="1200163909">
-    <w:abstractNumId w:val="24"/>
-  </w:num>
-  <w:num w:numId="15" w16cid:durableId="1205362395">
-    <w:abstractNumId w:val="30"/>
-  </w:num>
-  <w:num w:numId="16" w16cid:durableId="769348475">
-    <w:abstractNumId w:val="15"/>
-  </w:num>
-  <w:num w:numId="17" w16cid:durableId="1000962962">
+  <w:num w:numId="11" w16cid:durableId="98260853">
     <w:abstractNumId w:val="9"/>
   </w:num>
-  <w:num w:numId="18" w16cid:durableId="300576008">
-    <w:abstractNumId w:val="8"/>
-  </w:num>
-  <w:num w:numId="19" w16cid:durableId="406612112">
-    <w:abstractNumId w:val="37"/>
-  </w:num>
-  <w:num w:numId="20" w16cid:durableId="1009599850">
-    <w:abstractNumId w:val="39"/>
-  </w:num>
-  <w:num w:numId="21" w16cid:durableId="586690529">
-    <w:abstractNumId w:val="33"/>
-  </w:num>
-  <w:num w:numId="22" w16cid:durableId="955870183">
-    <w:abstractNumId w:val="32"/>
-  </w:num>
-  <w:num w:numId="23" w16cid:durableId="414784735">
-    <w:abstractNumId w:val="16"/>
-  </w:num>
-  <w:num w:numId="24" w16cid:durableId="1599560499">
-    <w:abstractNumId w:val="29"/>
-  </w:num>
-  <w:num w:numId="25" w16cid:durableId="1192495630">
-    <w:abstractNumId w:val="23"/>
-  </w:num>
-  <w:num w:numId="26" w16cid:durableId="209540761">
-    <w:abstractNumId w:val="27"/>
-  </w:num>
-  <w:num w:numId="27" w16cid:durableId="287443020">
-    <w:abstractNumId w:val="4"/>
-  </w:num>
-  <w:num w:numId="28" w16cid:durableId="1194999237">
-    <w:abstractNumId w:val="10"/>
-  </w:num>
-  <w:num w:numId="29" w16cid:durableId="1637181670">
-    <w:abstractNumId w:val="45"/>
-  </w:num>
-  <w:num w:numId="30" w16cid:durableId="1928031836">
-    <w:abstractNumId w:val="14"/>
-  </w:num>
-  <w:num w:numId="31" w16cid:durableId="2072341352">
-    <w:abstractNumId w:val="13"/>
-  </w:num>
-  <w:num w:numId="32" w16cid:durableId="1756781965">
-    <w:abstractNumId w:val="42"/>
-  </w:num>
-  <w:num w:numId="33" w16cid:durableId="1839923727">
-    <w:abstractNumId w:val="41"/>
-  </w:num>
-  <w:num w:numId="34" w16cid:durableId="670723497">
-    <w:abstractNumId w:val="43"/>
-  </w:num>
-  <w:num w:numId="35" w16cid:durableId="2079550010">
-    <w:abstractNumId w:val="22"/>
-  </w:num>
-  <w:num w:numId="36" w16cid:durableId="1650087860">
-    <w:abstractNumId w:val="36"/>
-  </w:num>
-  <w:num w:numId="37" w16cid:durableId="274102213">
-    <w:abstractNumId w:val="3"/>
-  </w:num>
-  <w:num w:numId="38" w16cid:durableId="527253249">
-    <w:abstractNumId w:val="7"/>
-  </w:num>
-  <w:num w:numId="39" w16cid:durableId="632296986">
-    <w:abstractNumId w:val="34"/>
-  </w:num>
-  <w:num w:numId="40" w16cid:durableId="2106220597">
-    <w:abstractNumId w:val="12"/>
-  </w:num>
-  <w:num w:numId="41" w16cid:durableId="1309893928">
-    <w:abstractNumId w:val="50"/>
-  </w:num>
-  <w:num w:numId="42" w16cid:durableId="2135637066">
-    <w:abstractNumId w:val="48"/>
-  </w:num>
-  <w:num w:numId="43" w16cid:durableId="1126972379">
-    <w:abstractNumId w:val="51"/>
-  </w:num>
-  <w:num w:numId="44" w16cid:durableId="1621761401">
-    <w:abstractNumId w:val="47"/>
-  </w:num>
-  <w:num w:numId="45" w16cid:durableId="1991864749">
-    <w:abstractNumId w:val="31"/>
-  </w:num>
-  <w:num w:numId="46" w16cid:durableId="1603565777">
-    <w:abstractNumId w:val="28"/>
-  </w:num>
-  <w:num w:numId="47" w16cid:durableId="1369263405">
-    <w:abstractNumId w:val="46"/>
-  </w:num>
-  <w:num w:numId="48" w16cid:durableId="1852795592">
-    <w:abstractNumId w:val="5"/>
-  </w:num>
-  <w:num w:numId="49" w16cid:durableId="1946688925">
-    <w:abstractNumId w:val="49"/>
-  </w:num>
-  <w:num w:numId="50" w16cid:durableId="1003167030">
-    <w:abstractNumId w:val="54"/>
-  </w:num>
-  <w:num w:numId="51" w16cid:durableId="138769761">
-    <w:abstractNumId w:val="53"/>
-  </w:num>
-  <w:num w:numId="52" w16cid:durableId="1748913524">
-    <w:abstractNumId w:val="17"/>
-  </w:num>
-  <w:num w:numId="53" w16cid:durableId="1026249085">
-    <w:abstractNumId w:val="44"/>
-  </w:num>
-  <w:num w:numId="54" w16cid:durableId="27800674">
-    <w:abstractNumId w:val="20"/>
-  </w:num>
-  <w:num w:numId="55" w16cid:durableId="98260853">
-    <w:abstractNumId w:val="40"/>
-  </w:num>
-  <w:numIdMacAtCleanup w:val="17"/>
+  <w:numIdMacAtCleanup w:val="11"/>
 </w:numbering>
 </file>
 
@@ -14045,20 +9476,6 @@
     <w:pitch w:val="variable"/>
     <w:sig w:usb0="E0002EFF" w:usb1="C000785B" w:usb2="00000009" w:usb3="00000000" w:csb0="000001FF" w:csb1="00000000"/>
   </w:font>
-  <w:font w:name="Wingdings">
-    <w:panose1 w:val="05000000000000000000"/>
-    <w:charset w:val="02"/>
-    <w:family w:val="auto"/>
-    <w:pitch w:val="variable"/>
-    <w:sig w:usb0="00000000" w:usb1="10000000" w:usb2="00000000" w:usb3="00000000" w:csb0="80000000" w:csb1="00000000"/>
-  </w:font>
-  <w:font w:name="MS Mincho">
-    <w:panose1 w:val="02020609040205080304"/>
-    <w:charset w:val="80"/>
-    <w:family w:val="modern"/>
-    <w:pitch w:val="fixed"/>
-    <w:sig w:usb0="E00002FF" w:usb1="6AC7FDFB" w:usb2="08000012" w:usb3="00000000" w:csb0="0002009F" w:csb1="00000000"/>
-  </w:font>
   <w:font w:name="Symbol">
     <w:panose1 w:val="05050102010706020507"/>
     <w:charset w:val="02"/>
@@ -14073,12 +9490,26 @@
     <w:pitch w:val="fixed"/>
     <w:sig w:usb0="E0002EFF" w:usb1="C0007843" w:usb2="00000009" w:usb3="00000000" w:csb0="000001FF" w:csb1="00000000"/>
   </w:font>
+  <w:font w:name="Wingdings">
+    <w:panose1 w:val="05000000000000000000"/>
+    <w:charset w:val="02"/>
+    <w:family w:val="auto"/>
+    <w:pitch w:val="variable"/>
+    <w:sig w:usb0="00000000" w:usb1="10000000" w:usb2="00000000" w:usb3="00000000" w:csb0="80000000" w:csb1="00000000"/>
+  </w:font>
   <w:font w:name="Arial">
     <w:panose1 w:val="020B0604020202020204"/>
     <w:charset w:val="00"/>
     <w:family w:val="swiss"/>
     <w:pitch w:val="variable"/>
     <w:sig w:usb0="E0002EFF" w:usb1="C000785B" w:usb2="00000009" w:usb3="00000000" w:csb0="000001FF" w:csb1="00000000"/>
+  </w:font>
+  <w:font w:name="MS Mincho">
+    <w:panose1 w:val="02020609040205080304"/>
+    <w:charset w:val="80"/>
+    <w:family w:val="modern"/>
+    <w:pitch w:val="fixed"/>
+    <w:sig w:usb0="E00002FF" w:usb1="6AC7FDFB" w:usb2="08000012" w:usb3="00000000" w:csb0="0002009F" w:csb1="00000000"/>
   </w:font>
   <w:font w:name="MS Gothic">
     <w:altName w:val="ＭＳ ゴシック"/>
@@ -14185,6 +9616,7 @@
     <w:rsid w:val="00112E9B"/>
     <w:rsid w:val="00123EE2"/>
     <w:rsid w:val="001334C6"/>
+    <w:rsid w:val="00135A39"/>
     <w:rsid w:val="0014698C"/>
     <w:rsid w:val="00155BCB"/>
     <w:rsid w:val="00163525"/>
@@ -14346,6 +9778,7 @@
     <w:rsid w:val="00DB1279"/>
     <w:rsid w:val="00DB5A5B"/>
     <w:rsid w:val="00DF0A24"/>
+    <w:rsid w:val="00E038AB"/>
     <w:rsid w:val="00E03B50"/>
     <w:rsid w:val="00E073A7"/>
     <w:rsid w:val="00E14B0B"/>
@@ -15128,6 +10561,10 @@
 </file>
 
 <file path=customXml/item1.xml><?xml version="1.0" encoding="utf-8"?>
+<b:Sources xmlns:b="http://schemas.openxmlformats.org/officeDocument/2006/bibliography" xmlns="http://schemas.openxmlformats.org/officeDocument/2006/bibliography" SelectedStyle="/IEEE2006OfficeOnline.xsl" StyleName="IEEE" Version="2006"/>
+</file>
+
+<file path=customXml/item2.xml><?xml version="1.0" encoding="utf-8"?>
 <ct:contentTypeSchema xmlns:ct="http://schemas.microsoft.com/office/2006/metadata/contentType" xmlns:ma="http://schemas.microsoft.com/office/2006/metadata/properties/metaAttributes" ct:_="" ma:_="" ma:contentTypeName="Document" ma:contentTypeID="0x01010039D2144BFC0BB14088ECE1290730495C" ma:contentTypeVersion="9" ma:contentTypeDescription="Create a new document." ma:contentTypeScope="" ma:versionID="c1ab4faf9b79d148a14339970c12a65a">
   <xsd:schema xmlns:xsd="http://www.w3.org/2001/XMLSchema" xmlns:xs="http://www.w3.org/2001/XMLSchema" xmlns:p="http://schemas.microsoft.com/office/2006/metadata/properties" xmlns:ns3="09643b4c-5168-4655-a1dd-256ac936653d" xmlns:ns4="6d050a8d-6d8a-4b8b-9ffa-9130e4cc5445" targetNamespace="http://schemas.microsoft.com/office/2006/metadata/properties" ma:root="true" ma:fieldsID="ddb43b9756d5fdf3871a95a4c45bf960" ns3:_="" ns4:_="">
     <xsd:import namespace="09643b4c-5168-4655-a1dd-256ac936653d"/>
@@ -15322,19 +10759,7 @@
 </ct:contentTypeSchema>
 </file>
 
-<file path=customXml/item2.xml><?xml version="1.0" encoding="utf-8"?>
-<b:Sources xmlns:b="http://schemas.openxmlformats.org/officeDocument/2006/bibliography" xmlns="http://schemas.openxmlformats.org/officeDocument/2006/bibliography" SelectedStyle="/IEEE2006OfficeOnline.xsl" StyleName="IEEE" Version="2006"/>
-</file>
-
 <file path=customXml/item3.xml><?xml version="1.0" encoding="utf-8"?>
-<p:properties xmlns:p="http://schemas.microsoft.com/office/2006/metadata/properties" xmlns:xsi="http://www.w3.org/2001/XMLSchema-instance" xmlns:pc="http://schemas.microsoft.com/office/infopath/2007/PartnerControls">
-  <documentManagement>
-    <_activity xmlns="09643b4c-5168-4655-a1dd-256ac936653d" xsi:nil="true"/>
-  </documentManagement>
-</p:properties>
-</file>
-
-<file path=customXml/item4.xml><?xml version="1.0" encoding="utf-8"?>
 <?mso-contentType ?>
 <FormTemplates xmlns="http://schemas.microsoft.com/sharepoint/v3/contenttype/forms">
   <Display>DocumentLibraryForm</Display>
@@ -15343,7 +10768,23 @@
 </FormTemplates>
 </file>
 
+<file path=customXml/item4.xml><?xml version="1.0" encoding="utf-8"?>
+<p:properties xmlns:p="http://schemas.microsoft.com/office/2006/metadata/properties" xmlns:xsi="http://www.w3.org/2001/XMLSchema-instance" xmlns:pc="http://schemas.microsoft.com/office/infopath/2007/PartnerControls">
+  <documentManagement>
+    <_activity xmlns="09643b4c-5168-4655-a1dd-256ac936653d" xsi:nil="true"/>
+  </documentManagement>
+</p:properties>
+</file>
+
 <file path=customXml/itemProps1.xml><?xml version="1.0" encoding="utf-8"?>
+<ds:datastoreItem xmlns:ds="http://schemas.openxmlformats.org/officeDocument/2006/customXml" ds:itemID="{7AAD9C44-44F0-4580-B32D-CE3192489E49}">
+  <ds:schemaRefs>
+    <ds:schemaRef ds:uri="http://schemas.openxmlformats.org/officeDocument/2006/bibliography"/>
+  </ds:schemaRefs>
+</ds:datastoreItem>
+</file>
+
+<file path=customXml/itemProps2.xml><?xml version="1.0" encoding="utf-8"?>
 <ds:datastoreItem xmlns:ds="http://schemas.openxmlformats.org/officeDocument/2006/customXml" ds:itemID="{82376AD5-BFF6-4A02-A495-29BBB725DD2C}">
   <ds:schemaRefs>
     <ds:schemaRef ds:uri="http://schemas.microsoft.com/office/2006/metadata/contentType"/>
@@ -15362,15 +10803,15 @@
 </ds:datastoreItem>
 </file>
 
-<file path=customXml/itemProps2.xml><?xml version="1.0" encoding="utf-8"?>
-<ds:datastoreItem xmlns:ds="http://schemas.openxmlformats.org/officeDocument/2006/customXml" ds:itemID="{7AAD9C44-44F0-4580-B32D-CE3192489E49}">
+<file path=customXml/itemProps3.xml><?xml version="1.0" encoding="utf-8"?>
+<ds:datastoreItem xmlns:ds="http://schemas.openxmlformats.org/officeDocument/2006/customXml" ds:itemID="{592D2C12-7889-4139-A5F2-65B8787AEF0C}">
   <ds:schemaRefs>
-    <ds:schemaRef ds:uri="http://schemas.openxmlformats.org/officeDocument/2006/bibliography"/>
+    <ds:schemaRef ds:uri="http://schemas.microsoft.com/sharepoint/v3/contenttype/forms"/>
   </ds:schemaRefs>
 </ds:datastoreItem>
 </file>
 
-<file path=customXml/itemProps3.xml><?xml version="1.0" encoding="utf-8"?>
+<file path=customXml/itemProps4.xml><?xml version="1.0" encoding="utf-8"?>
 <ds:datastoreItem xmlns:ds="http://schemas.openxmlformats.org/officeDocument/2006/customXml" ds:itemID="{F0BFDB30-D857-452F-9056-BD795B3BEF00}">
   <ds:schemaRefs>
     <ds:schemaRef ds:uri="http://schemas.microsoft.com/office/2006/metadata/properties"/>
@@ -15378,12 +10819,4 @@
     <ds:schemaRef ds:uri="09643b4c-5168-4655-a1dd-256ac936653d"/>
   </ds:schemaRefs>
 </ds:datastoreItem>
-</file>
-
-<file path=customXml/itemProps4.xml><?xml version="1.0" encoding="utf-8"?>
-<ds:datastoreItem xmlns:ds="http://schemas.openxmlformats.org/officeDocument/2006/customXml" ds:itemID="{592D2C12-7889-4139-A5F2-65B8787AEF0C}">
-  <ds:schemaRefs>
-    <ds:schemaRef ds:uri="http://schemas.microsoft.com/sharepoint/v3/contenttype/forms"/>
-  </ds:schemaRefs>
-</ds:datastoreItem>
 </file>
</xml_diff>